<commit_message>
Revise Mini Class Schedule Board: remove header, 6 time boxes per page
- Remove title/subtitle header from document
- Remove "Class N:" numbering labels from each card
- Rename "Family History Q&A" to "Family History Question and Answer"
- Add topic line where applicable (classes 5 & 7)
- Replace single Next Class Time box with 6 boxes (2×3 grid) per page
- 8 pages total, one class per page

https://claude.ai/code/session_01VoVEzvcU4hiUyxQHXSMquq
</commit_message>
<xml_diff>
--- a/Mini_Class_Schedule_Board.docx
+++ b/Mini_Class_Schedule_Board.docx
@@ -2,40 +2,20 @@
 <file path=word/document.xml><?xml version="1.0" encoding="utf-8"?>
 <w:document xmlns:wpc="http://schemas.microsoft.com/office/word/2010/wordprocessingCanvas" xmlns:mo="http://schemas.microsoft.com/office/mac/office/2008/main" xmlns:mc="http://schemas.openxmlformats.org/markup-compatibility/2006" xmlns:mv="urn:schemas-microsoft-com:mac:vml" xmlns:o="urn:schemas-microsoft-com:office:office" xmlns:r="http://schemas.openxmlformats.org/officeDocument/2006/relationships" xmlns:m="http://schemas.openxmlformats.org/officeDocument/2006/math" xmlns:v="urn:schemas-microsoft-com:vml" xmlns:wp14="http://schemas.microsoft.com/office/word/2010/wordprocessingDrawing" xmlns:wp="http://schemas.openxmlformats.org/drawingml/2006/wordprocessingDrawing" xmlns:w10="urn:schemas-microsoft-com:office:word" xmlns:w="http://schemas.openxmlformats.org/wordprocessingml/2006/main" xmlns:w14="http://schemas.microsoft.com/office/word/2010/wordml" xmlns:wpg="http://schemas.microsoft.com/office/word/2010/wordprocessingGroup" xmlns:wpi="http://schemas.microsoft.com/office/word/2010/wordprocessingInk" xmlns:wne="http://schemas.microsoft.com/office/word/2006/wordml" xmlns:wps="http://schemas.microsoft.com/office/word/2010/wordprocessingShape" mc:Ignorable="w14 wp14">
   <w:body>
-    <w:p>
-      <w:pPr>
-        <w:jc w:val="center"/>
-      </w:pPr>
-      <w:r>
-        <w:rPr>
-          <w:b/>
-          <w:color w:val="1A1A4E"/>
-          <w:sz w:val="36"/>
-        </w:rPr>
-        <w:t>Mini Classes — Next Class Time Schedule</w:t>
-      </w:r>
-    </w:p>
-    <w:p>
-      <w:pPr>
-        <w:jc w:val="center"/>
-      </w:pPr>
-      <w:r>
-        <w:rPr>
-          <w:i/>
-          <w:color w:val="555577"/>
-          <w:sz w:val="22"/>
-        </w:rPr>
-        <w:t>Reaching Higher Along the Covenant Path</w:t>
-      </w:r>
-    </w:p>
-    <w:p/>
     <w:tbl>
       <w:tblPr>
         <w:tblStyle w:val="TableGrid"/>
         <w:tblW w:type="auto" w:w="0"/>
         <w:jc w:val="center"/>
         <w:tblLook w:firstColumn="1" w:firstRow="1" w:lastColumn="0" w:lastRow="0" w:noHBand="0" w:noVBand="1" w:val="04A0"/>
-        <w:tblW w:w="9360" w:type="dxa"/>
+        <w:tblBorders>
+          <w:top w:val="single" w:sz="18" w:space="0" w:color="1F3864"/>
+          <w:left w:val="single" w:sz="18" w:space="0" w:color="1F3864"/>
+          <w:bottom w:val="single" w:sz="18" w:space="0" w:color="1F3864"/>
+          <w:right w:val="single" w:sz="18" w:space="0" w:color="1F3864"/>
+          <w:insideH w:val="single" w:sz="18" w:space="0" w:color="1F3864"/>
+          <w:insideV w:val="single" w:sz="18" w:space="0" w:color="1F3864"/>
+        </w:tblBorders>
       </w:tblPr>
       <w:tblGrid>
         <w:gridCol w:w="10080"/>
@@ -44,14 +24,29 @@
         <w:tc>
           <w:tcPr>
             <w:tcW w:type="dxa" w:w="10080"/>
-            <w:shd w:val="clear" w:color="auto" w:fill="e8e8f4"/>
-            <w:tcBorders>
-              <w:top w:val="single" w:sz="18" w:space="0" w:color="1a1a4e"/>
-              <w:left w:val="single" w:sz="18" w:space="0" w:color="1a1a4e"/>
-              <w:bottom w:val="single" w:sz="18" w:space="0" w:color="1a1a4e"/>
-              <w:right w:val="single" w:sz="18" w:space="0" w:color="1a1a4e"/>
-            </w:tcBorders>
+            <w:vAlign w:val="center"/>
+            <w:shd w:val="clear" w:color="auto" w:fill="D9E1F2"/>
+            <w:tcMar>
+              <w:top w:w="180" w:type="dxa"/>
+              <w:left w:w="180" w:type="dxa"/>
+              <w:bottom w:w="180" w:type="dxa"/>
+              <w:right w:w="180" w:type="dxa"/>
+            </w:tcMar>
           </w:tcPr>
+          <w:p>
+            <w:pPr>
+              <w:spacing w:before="40" w:after="40"/>
+              <w:jc w:val="left"/>
+            </w:pPr>
+            <w:r>
+              <w:rPr>
+                <w:b/>
+                <w:color w:val="1F3864"/>
+                <w:sz w:val="44"/>
+              </w:rPr>
+              <w:t>President Edwin Wells</w:t>
+            </w:r>
+          </w:p>
           <w:p>
             <w:pPr>
               <w:spacing w:before="80" w:after="40"/>
@@ -59,74 +54,37 @@
             </w:pPr>
             <w:r>
               <w:rPr>
-                <w:color w:val="555577"/>
-                <w:sz w:val="18"/>
+                <w:b w:val="0"/>
+                <w:sz w:val="28"/>
               </w:rPr>
-              <w:t xml:space="preserve">  Class 1:  </w:t>
+              <w:t xml:space="preserve">Presenter:  </w:t>
             </w:r>
             <w:r>
               <w:rPr>
                 <w:b/>
-                <w:color w:val="1A1A4E"/>
-                <w:sz w:val="26"/>
+                <w:sz w:val="28"/>
               </w:rPr>
-              <w:t>President Edwin Wells</w:t>
+              <w:t>Stake President Edwin Wells</w:t>
             </w:r>
           </w:p>
           <w:p>
             <w:pPr>
-              <w:spacing w:before="20" w:after="40"/>
-            </w:pPr>
-            <w:r>
-              <w:rPr>
-                <w:color w:val="333355"/>
-                <w:sz w:val="20"/>
-              </w:rPr>
-              <w:t xml:space="preserve">  Presenter:  Stake President Edwin Wells</w:t>
-            </w:r>
-          </w:p>
-          <w:p>
-            <w:pPr>
-              <w:spacing w:before="20" w:after="80"/>
-            </w:pPr>
-            <w:r>
-              <w:rPr>
-                <w:i/>
-                <w:color w:val="444466"/>
-                <w:sz w:val="20"/>
-              </w:rPr>
-              <w:t xml:space="preserve">  Location:  Chapel</w:t>
-            </w:r>
-          </w:p>
-        </w:tc>
-      </w:tr>
-      <w:tr>
-        <w:trPr>
-          <w:trHeight w:val="1080" w:hRule="atLeast"/>
-        </w:trPr>
-        <w:tc>
-          <w:tcPr>
-            <w:tcW w:type="dxa" w:w="10080"/>
-            <w:shd w:val="clear" w:color="auto" w:fill="ffffff"/>
-            <w:tcBorders>
-              <w:top w:val="single" w:sz="18" w:space="0" w:color="1a1a4e"/>
-              <w:left w:val="single" w:sz="18" w:space="0" w:color="1a1a4e"/>
-              <w:bottom w:val="single" w:sz="18" w:space="0" w:color="1a1a4e"/>
-              <w:right w:val="single" w:sz="18" w:space="0" w:color="1a1a4e"/>
-            </w:tcBorders>
-          </w:tcPr>
-          <w:p>
-            <w:pPr>
-              <w:spacing w:before="80" w:after="80"/>
+              <w:spacing w:before="40" w:after="80"/>
               <w:jc w:val="left"/>
             </w:pPr>
             <w:r>
               <w:rPr>
-                <w:i/>
-                <w:color w:val="8888AA"/>
-                <w:sz w:val="20"/>
+                <w:b w:val="0"/>
+                <w:sz w:val="28"/>
               </w:rPr>
-              <w:t xml:space="preserve">  Next Class Time:  </w:t>
+              <w:t xml:space="preserve">Location:  </w:t>
+            </w:r>
+            <w:r>
+              <w:rPr>
+                <w:b/>
+                <w:sz w:val="28"/>
+              </w:rPr>
+              <w:t>Chapel</w:t>
             </w:r>
           </w:p>
         </w:tc>
@@ -134,8 +92,17 @@
     </w:tbl>
     <w:p>
       <w:pPr>
-        <w:spacing w:before="40" w:after="40"/>
+        <w:spacing w:before="160" w:after="80"/>
+        <w:jc w:val="center"/>
       </w:pPr>
+      <w:r>
+        <w:rPr>
+          <w:i/>
+          <w:color w:val="606060"/>
+          <w:sz w:val="20"/>
+        </w:rPr>
+        <w:t>Write next class start time in each box using a marker</w:t>
+      </w:r>
     </w:p>
     <w:tbl>
       <w:tblPr>
@@ -143,7 +110,213 @@
         <w:tblW w:type="auto" w:w="0"/>
         <w:jc w:val="center"/>
         <w:tblLook w:firstColumn="1" w:firstRow="1" w:lastColumn="0" w:lastRow="0" w:noHBand="0" w:noVBand="1" w:val="04A0"/>
-        <w:tblW w:w="9360" w:type="dxa"/>
+        <w:tblBorders>
+          <w:top w:val="single" w:sz="12" w:space="0" w:color="1F3864"/>
+          <w:left w:val="single" w:sz="12" w:space="0" w:color="1F3864"/>
+          <w:bottom w:val="single" w:sz="12" w:space="0" w:color="1F3864"/>
+          <w:right w:val="single" w:sz="12" w:space="0" w:color="1F3864"/>
+          <w:insideH w:val="single" w:sz="12" w:space="0" w:color="1F3864"/>
+          <w:insideV w:val="single" w:sz="12" w:space="0" w:color="1F3864"/>
+        </w:tblBorders>
+      </w:tblPr>
+      <w:tblGrid>
+        <w:gridCol w:w="5040"/>
+        <w:gridCol w:w="5040"/>
+      </w:tblGrid>
+      <w:tr>
+        <w:trPr>
+          <w:trHeight w:val="1200" w:hRule="atLeast"/>
+        </w:trPr>
+        <w:tc>
+          <w:tcPr>
+            <w:tcW w:type="dxa" w:w="5040"/>
+            <w:shd w:val="clear" w:color="auto" w:fill="FFFFFF"/>
+            <w:tcMar>
+              <w:top w:w="144" w:type="dxa"/>
+              <w:left w:w="144" w:type="dxa"/>
+              <w:bottom w:w="144" w:type="dxa"/>
+              <w:right w:w="144" w:type="dxa"/>
+            </w:tcMar>
+          </w:tcPr>
+          <w:p>
+            <w:pPr>
+              <w:spacing w:before="80" w:after="0"/>
+              <w:jc w:val="left"/>
+            </w:pPr>
+            <w:r>
+              <w:rPr>
+                <w:b/>
+                <w:color w:val="1F3864"/>
+                <w:sz w:val="28"/>
+              </w:rPr>
+              <w:t>Next Class Time:</w:t>
+            </w:r>
+          </w:p>
+        </w:tc>
+        <w:tc>
+          <w:tcPr>
+            <w:tcW w:type="dxa" w:w="5040"/>
+            <w:shd w:val="clear" w:color="auto" w:fill="FFFFFF"/>
+            <w:tcMar>
+              <w:top w:w="144" w:type="dxa"/>
+              <w:left w:w="144" w:type="dxa"/>
+              <w:bottom w:w="144" w:type="dxa"/>
+              <w:right w:w="144" w:type="dxa"/>
+            </w:tcMar>
+          </w:tcPr>
+          <w:p>
+            <w:pPr>
+              <w:spacing w:before="80" w:after="0"/>
+              <w:jc w:val="left"/>
+            </w:pPr>
+            <w:r>
+              <w:rPr>
+                <w:b/>
+                <w:color w:val="1F3864"/>
+                <w:sz w:val="28"/>
+              </w:rPr>
+              <w:t>Next Class Time:</w:t>
+            </w:r>
+          </w:p>
+        </w:tc>
+      </w:tr>
+      <w:tr>
+        <w:trPr>
+          <w:trHeight w:val="1200" w:hRule="atLeast"/>
+        </w:trPr>
+        <w:tc>
+          <w:tcPr>
+            <w:tcW w:type="dxa" w:w="5040"/>
+            <w:shd w:val="clear" w:color="auto" w:fill="FFFFFF"/>
+            <w:tcMar>
+              <w:top w:w="144" w:type="dxa"/>
+              <w:left w:w="144" w:type="dxa"/>
+              <w:bottom w:w="144" w:type="dxa"/>
+              <w:right w:w="144" w:type="dxa"/>
+            </w:tcMar>
+          </w:tcPr>
+          <w:p>
+            <w:pPr>
+              <w:spacing w:before="80" w:after="0"/>
+              <w:jc w:val="left"/>
+            </w:pPr>
+            <w:r>
+              <w:rPr>
+                <w:b/>
+                <w:color w:val="1F3864"/>
+                <w:sz w:val="28"/>
+              </w:rPr>
+              <w:t>Next Class Time:</w:t>
+            </w:r>
+          </w:p>
+        </w:tc>
+        <w:tc>
+          <w:tcPr>
+            <w:tcW w:type="dxa" w:w="5040"/>
+            <w:shd w:val="clear" w:color="auto" w:fill="FFFFFF"/>
+            <w:tcMar>
+              <w:top w:w="144" w:type="dxa"/>
+              <w:left w:w="144" w:type="dxa"/>
+              <w:bottom w:w="144" w:type="dxa"/>
+              <w:right w:w="144" w:type="dxa"/>
+            </w:tcMar>
+          </w:tcPr>
+          <w:p>
+            <w:pPr>
+              <w:spacing w:before="80" w:after="0"/>
+              <w:jc w:val="left"/>
+            </w:pPr>
+            <w:r>
+              <w:rPr>
+                <w:b/>
+                <w:color w:val="1F3864"/>
+                <w:sz w:val="28"/>
+              </w:rPr>
+              <w:t>Next Class Time:</w:t>
+            </w:r>
+          </w:p>
+        </w:tc>
+      </w:tr>
+      <w:tr>
+        <w:trPr>
+          <w:trHeight w:val="1200" w:hRule="atLeast"/>
+        </w:trPr>
+        <w:tc>
+          <w:tcPr>
+            <w:tcW w:type="dxa" w:w="5040"/>
+            <w:shd w:val="clear" w:color="auto" w:fill="FFFFFF"/>
+            <w:tcMar>
+              <w:top w:w="144" w:type="dxa"/>
+              <w:left w:w="144" w:type="dxa"/>
+              <w:bottom w:w="144" w:type="dxa"/>
+              <w:right w:w="144" w:type="dxa"/>
+            </w:tcMar>
+          </w:tcPr>
+          <w:p>
+            <w:pPr>
+              <w:spacing w:before="80" w:after="0"/>
+              <w:jc w:val="left"/>
+            </w:pPr>
+            <w:r>
+              <w:rPr>
+                <w:b/>
+                <w:color w:val="1F3864"/>
+                <w:sz w:val="28"/>
+              </w:rPr>
+              <w:t>Next Class Time:</w:t>
+            </w:r>
+          </w:p>
+        </w:tc>
+        <w:tc>
+          <w:tcPr>
+            <w:tcW w:type="dxa" w:w="5040"/>
+            <w:shd w:val="clear" w:color="auto" w:fill="FFFFFF"/>
+            <w:tcMar>
+              <w:top w:w="144" w:type="dxa"/>
+              <w:left w:w="144" w:type="dxa"/>
+              <w:bottom w:w="144" w:type="dxa"/>
+              <w:right w:w="144" w:type="dxa"/>
+            </w:tcMar>
+          </w:tcPr>
+          <w:p>
+            <w:pPr>
+              <w:spacing w:before="80" w:after="0"/>
+              <w:jc w:val="left"/>
+            </w:pPr>
+            <w:r>
+              <w:rPr>
+                <w:b/>
+                <w:color w:val="1F3864"/>
+                <w:sz w:val="28"/>
+              </w:rPr>
+              <w:t>Next Class Time:</w:t>
+            </w:r>
+          </w:p>
+        </w:tc>
+      </w:tr>
+    </w:tbl>
+    <w:p>
+      <w:pPr>
+        <w:spacing w:before="0" w:after="0"/>
+      </w:pPr>
+      <w:r>
+        <w:br w:type="page"/>
+      </w:r>
+    </w:p>
+    <w:tbl>
+      <w:tblPr>
+        <w:tblStyle w:val="TableGrid"/>
+        <w:tblW w:type="auto" w:w="0"/>
+        <w:jc w:val="center"/>
+        <w:tblLook w:firstColumn="1" w:firstRow="1" w:lastColumn="0" w:lastRow="0" w:noHBand="0" w:noVBand="1" w:val="04A0"/>
+        <w:tblBorders>
+          <w:top w:val="single" w:sz="18" w:space="0" w:color="1F3864"/>
+          <w:left w:val="single" w:sz="18" w:space="0" w:color="1F3864"/>
+          <w:bottom w:val="single" w:sz="18" w:space="0" w:color="1F3864"/>
+          <w:right w:val="single" w:sz="18" w:space="0" w:color="1F3864"/>
+          <w:insideH w:val="single" w:sz="18" w:space="0" w:color="1F3864"/>
+          <w:insideV w:val="single" w:sz="18" w:space="0" w:color="1F3864"/>
+        </w:tblBorders>
       </w:tblPr>
       <w:tblGrid>
         <w:gridCol w:w="10080"/>
@@ -152,31 +325,25 @@
         <w:tc>
           <w:tcPr>
             <w:tcW w:type="dxa" w:w="10080"/>
-            <w:shd w:val="clear" w:color="auto" w:fill="e8e8f4"/>
-            <w:tcBorders>
-              <w:top w:val="single" w:sz="18" w:space="0" w:color="1a1a4e"/>
-              <w:left w:val="single" w:sz="18" w:space="0" w:color="1a1a4e"/>
-              <w:bottom w:val="single" w:sz="18" w:space="0" w:color="1a1a4e"/>
-              <w:right w:val="single" w:sz="18" w:space="0" w:color="1a1a4e"/>
-            </w:tcBorders>
+            <w:vAlign w:val="center"/>
+            <w:shd w:val="clear" w:color="auto" w:fill="D9E1F2"/>
+            <w:tcMar>
+              <w:top w:w="180" w:type="dxa"/>
+              <w:left w:w="180" w:type="dxa"/>
+              <w:bottom w:w="180" w:type="dxa"/>
+              <w:right w:w="180" w:type="dxa"/>
+            </w:tcMar>
           </w:tcPr>
           <w:p>
             <w:pPr>
-              <w:spacing w:before="80" w:after="40"/>
+              <w:spacing w:before="40" w:after="40"/>
               <w:jc w:val="left"/>
             </w:pPr>
             <w:r>
               <w:rPr>
-                <w:color w:val="555577"/>
-                <w:sz w:val="18"/>
-              </w:rPr>
-              <w:t xml:space="preserve">  Class 2:  </w:t>
-            </w:r>
-            <w:r>
-              <w:rPr>
                 <w:b/>
-                <w:color w:val="1A1A4E"/>
-                <w:sz w:val="26"/>
+                <w:color w:val="1F3864"/>
+                <w:sz w:val="44"/>
               </w:rPr>
               <w:t>Spiritual Survival and the Holy Ghost:</w:t>
               <w:br/>
@@ -185,58 +352,42 @@
           </w:p>
           <w:p>
             <w:pPr>
-              <w:spacing w:before="20" w:after="40"/>
+              <w:spacing w:before="80" w:after="40"/>
+              <w:jc w:val="left"/>
             </w:pPr>
             <w:r>
               <w:rPr>
-                <w:color w:val="333355"/>
-                <w:sz w:val="20"/>
+                <w:b w:val="0"/>
+                <w:sz w:val="28"/>
               </w:rPr>
-              <w:t xml:space="preserve">  Presenter:  Kristin &amp; Kevin Galbraith</w:t>
+              <w:t xml:space="preserve">Presenter:  </w:t>
+            </w:r>
+            <w:r>
+              <w:rPr>
+                <w:b/>
+                <w:sz w:val="28"/>
+              </w:rPr>
+              <w:t>Kristin &amp; Kevin Galbraith</w:t>
             </w:r>
           </w:p>
           <w:p>
             <w:pPr>
-              <w:spacing w:before="20" w:after="80"/>
-            </w:pPr>
-            <w:r>
-              <w:rPr>
-                <w:i/>
-                <w:color w:val="444466"/>
-                <w:sz w:val="20"/>
-              </w:rPr>
-              <w:t xml:space="preserve">  Location:  High Council Room</w:t>
-            </w:r>
-          </w:p>
-        </w:tc>
-      </w:tr>
-      <w:tr>
-        <w:trPr>
-          <w:trHeight w:val="1080" w:hRule="atLeast"/>
-        </w:trPr>
-        <w:tc>
-          <w:tcPr>
-            <w:tcW w:type="dxa" w:w="10080"/>
-            <w:shd w:val="clear" w:color="auto" w:fill="ffffff"/>
-            <w:tcBorders>
-              <w:top w:val="single" w:sz="18" w:space="0" w:color="1a1a4e"/>
-              <w:left w:val="single" w:sz="18" w:space="0" w:color="1a1a4e"/>
-              <w:bottom w:val="single" w:sz="18" w:space="0" w:color="1a1a4e"/>
-              <w:right w:val="single" w:sz="18" w:space="0" w:color="1a1a4e"/>
-            </w:tcBorders>
-          </w:tcPr>
-          <w:p>
-            <w:pPr>
-              <w:spacing w:before="80" w:after="80"/>
+              <w:spacing w:before="40" w:after="80"/>
               <w:jc w:val="left"/>
             </w:pPr>
             <w:r>
               <w:rPr>
-                <w:i/>
-                <w:color w:val="8888AA"/>
-                <w:sz w:val="20"/>
+                <w:b w:val="0"/>
+                <w:sz w:val="28"/>
               </w:rPr>
-              <w:t xml:space="preserve">  Next Class Time:  </w:t>
+              <w:t xml:space="preserve">Location:  </w:t>
+            </w:r>
+            <w:r>
+              <w:rPr>
+                <w:b/>
+                <w:sz w:val="28"/>
+              </w:rPr>
+              <w:t>High Council Room</w:t>
             </w:r>
           </w:p>
         </w:tc>
@@ -244,8 +395,17 @@
     </w:tbl>
     <w:p>
       <w:pPr>
-        <w:spacing w:before="40" w:after="40"/>
+        <w:spacing w:before="160" w:after="80"/>
+        <w:jc w:val="center"/>
       </w:pPr>
+      <w:r>
+        <w:rPr>
+          <w:i/>
+          <w:color w:val="606060"/>
+          <w:sz w:val="20"/>
+        </w:rPr>
+        <w:t>Write next class start time in each box using a marker</w:t>
+      </w:r>
     </w:p>
     <w:tbl>
       <w:tblPr>
@@ -253,7 +413,213 @@
         <w:tblW w:type="auto" w:w="0"/>
         <w:jc w:val="center"/>
         <w:tblLook w:firstColumn="1" w:firstRow="1" w:lastColumn="0" w:lastRow="0" w:noHBand="0" w:noVBand="1" w:val="04A0"/>
-        <w:tblW w:w="9360" w:type="dxa"/>
+        <w:tblBorders>
+          <w:top w:val="single" w:sz="12" w:space="0" w:color="1F3864"/>
+          <w:left w:val="single" w:sz="12" w:space="0" w:color="1F3864"/>
+          <w:bottom w:val="single" w:sz="12" w:space="0" w:color="1F3864"/>
+          <w:right w:val="single" w:sz="12" w:space="0" w:color="1F3864"/>
+          <w:insideH w:val="single" w:sz="12" w:space="0" w:color="1F3864"/>
+          <w:insideV w:val="single" w:sz="12" w:space="0" w:color="1F3864"/>
+        </w:tblBorders>
+      </w:tblPr>
+      <w:tblGrid>
+        <w:gridCol w:w="5040"/>
+        <w:gridCol w:w="5040"/>
+      </w:tblGrid>
+      <w:tr>
+        <w:trPr>
+          <w:trHeight w:val="1200" w:hRule="atLeast"/>
+        </w:trPr>
+        <w:tc>
+          <w:tcPr>
+            <w:tcW w:type="dxa" w:w="5040"/>
+            <w:shd w:val="clear" w:color="auto" w:fill="FFFFFF"/>
+            <w:tcMar>
+              <w:top w:w="144" w:type="dxa"/>
+              <w:left w:w="144" w:type="dxa"/>
+              <w:bottom w:w="144" w:type="dxa"/>
+              <w:right w:w="144" w:type="dxa"/>
+            </w:tcMar>
+          </w:tcPr>
+          <w:p>
+            <w:pPr>
+              <w:spacing w:before="80" w:after="0"/>
+              <w:jc w:val="left"/>
+            </w:pPr>
+            <w:r>
+              <w:rPr>
+                <w:b/>
+                <w:color w:val="1F3864"/>
+                <w:sz w:val="28"/>
+              </w:rPr>
+              <w:t>Next Class Time:</w:t>
+            </w:r>
+          </w:p>
+        </w:tc>
+        <w:tc>
+          <w:tcPr>
+            <w:tcW w:type="dxa" w:w="5040"/>
+            <w:shd w:val="clear" w:color="auto" w:fill="FFFFFF"/>
+            <w:tcMar>
+              <w:top w:w="144" w:type="dxa"/>
+              <w:left w:w="144" w:type="dxa"/>
+              <w:bottom w:w="144" w:type="dxa"/>
+              <w:right w:w="144" w:type="dxa"/>
+            </w:tcMar>
+          </w:tcPr>
+          <w:p>
+            <w:pPr>
+              <w:spacing w:before="80" w:after="0"/>
+              <w:jc w:val="left"/>
+            </w:pPr>
+            <w:r>
+              <w:rPr>
+                <w:b/>
+                <w:color w:val="1F3864"/>
+                <w:sz w:val="28"/>
+              </w:rPr>
+              <w:t>Next Class Time:</w:t>
+            </w:r>
+          </w:p>
+        </w:tc>
+      </w:tr>
+      <w:tr>
+        <w:trPr>
+          <w:trHeight w:val="1200" w:hRule="atLeast"/>
+        </w:trPr>
+        <w:tc>
+          <w:tcPr>
+            <w:tcW w:type="dxa" w:w="5040"/>
+            <w:shd w:val="clear" w:color="auto" w:fill="FFFFFF"/>
+            <w:tcMar>
+              <w:top w:w="144" w:type="dxa"/>
+              <w:left w:w="144" w:type="dxa"/>
+              <w:bottom w:w="144" w:type="dxa"/>
+              <w:right w:w="144" w:type="dxa"/>
+            </w:tcMar>
+          </w:tcPr>
+          <w:p>
+            <w:pPr>
+              <w:spacing w:before="80" w:after="0"/>
+              <w:jc w:val="left"/>
+            </w:pPr>
+            <w:r>
+              <w:rPr>
+                <w:b/>
+                <w:color w:val="1F3864"/>
+                <w:sz w:val="28"/>
+              </w:rPr>
+              <w:t>Next Class Time:</w:t>
+            </w:r>
+          </w:p>
+        </w:tc>
+        <w:tc>
+          <w:tcPr>
+            <w:tcW w:type="dxa" w:w="5040"/>
+            <w:shd w:val="clear" w:color="auto" w:fill="FFFFFF"/>
+            <w:tcMar>
+              <w:top w:w="144" w:type="dxa"/>
+              <w:left w:w="144" w:type="dxa"/>
+              <w:bottom w:w="144" w:type="dxa"/>
+              <w:right w:w="144" w:type="dxa"/>
+            </w:tcMar>
+          </w:tcPr>
+          <w:p>
+            <w:pPr>
+              <w:spacing w:before="80" w:after="0"/>
+              <w:jc w:val="left"/>
+            </w:pPr>
+            <w:r>
+              <w:rPr>
+                <w:b/>
+                <w:color w:val="1F3864"/>
+                <w:sz w:val="28"/>
+              </w:rPr>
+              <w:t>Next Class Time:</w:t>
+            </w:r>
+          </w:p>
+        </w:tc>
+      </w:tr>
+      <w:tr>
+        <w:trPr>
+          <w:trHeight w:val="1200" w:hRule="atLeast"/>
+        </w:trPr>
+        <w:tc>
+          <w:tcPr>
+            <w:tcW w:type="dxa" w:w="5040"/>
+            <w:shd w:val="clear" w:color="auto" w:fill="FFFFFF"/>
+            <w:tcMar>
+              <w:top w:w="144" w:type="dxa"/>
+              <w:left w:w="144" w:type="dxa"/>
+              <w:bottom w:w="144" w:type="dxa"/>
+              <w:right w:w="144" w:type="dxa"/>
+            </w:tcMar>
+          </w:tcPr>
+          <w:p>
+            <w:pPr>
+              <w:spacing w:before="80" w:after="0"/>
+              <w:jc w:val="left"/>
+            </w:pPr>
+            <w:r>
+              <w:rPr>
+                <w:b/>
+                <w:color w:val="1F3864"/>
+                <w:sz w:val="28"/>
+              </w:rPr>
+              <w:t>Next Class Time:</w:t>
+            </w:r>
+          </w:p>
+        </w:tc>
+        <w:tc>
+          <w:tcPr>
+            <w:tcW w:type="dxa" w:w="5040"/>
+            <w:shd w:val="clear" w:color="auto" w:fill="FFFFFF"/>
+            <w:tcMar>
+              <w:top w:w="144" w:type="dxa"/>
+              <w:left w:w="144" w:type="dxa"/>
+              <w:bottom w:w="144" w:type="dxa"/>
+              <w:right w:w="144" w:type="dxa"/>
+            </w:tcMar>
+          </w:tcPr>
+          <w:p>
+            <w:pPr>
+              <w:spacing w:before="80" w:after="0"/>
+              <w:jc w:val="left"/>
+            </w:pPr>
+            <w:r>
+              <w:rPr>
+                <w:b/>
+                <w:color w:val="1F3864"/>
+                <w:sz w:val="28"/>
+              </w:rPr>
+              <w:t>Next Class Time:</w:t>
+            </w:r>
+          </w:p>
+        </w:tc>
+      </w:tr>
+    </w:tbl>
+    <w:p>
+      <w:pPr>
+        <w:spacing w:before="0" w:after="0"/>
+      </w:pPr>
+      <w:r>
+        <w:br w:type="page"/>
+      </w:r>
+    </w:p>
+    <w:tbl>
+      <w:tblPr>
+        <w:tblStyle w:val="TableGrid"/>
+        <w:tblW w:type="auto" w:w="0"/>
+        <w:jc w:val="center"/>
+        <w:tblLook w:firstColumn="1" w:firstRow="1" w:lastColumn="0" w:lastRow="0" w:noHBand="0" w:noVBand="1" w:val="04A0"/>
+        <w:tblBorders>
+          <w:top w:val="single" w:sz="18" w:space="0" w:color="1F3864"/>
+          <w:left w:val="single" w:sz="18" w:space="0" w:color="1F3864"/>
+          <w:bottom w:val="single" w:sz="18" w:space="0" w:color="1F3864"/>
+          <w:right w:val="single" w:sz="18" w:space="0" w:color="1F3864"/>
+          <w:insideH w:val="single" w:sz="18" w:space="0" w:color="1F3864"/>
+          <w:insideV w:val="single" w:sz="18" w:space="0" w:color="1F3864"/>
+        </w:tblBorders>
       </w:tblPr>
       <w:tblGrid>
         <w:gridCol w:w="10080"/>
@@ -262,14 +628,29 @@
         <w:tc>
           <w:tcPr>
             <w:tcW w:type="dxa" w:w="10080"/>
-            <w:shd w:val="clear" w:color="auto" w:fill="e8e8f4"/>
-            <w:tcBorders>
-              <w:top w:val="single" w:sz="18" w:space="0" w:color="1a1a4e"/>
-              <w:left w:val="single" w:sz="18" w:space="0" w:color="1a1a4e"/>
-              <w:bottom w:val="single" w:sz="18" w:space="0" w:color="1a1a4e"/>
-              <w:right w:val="single" w:sz="18" w:space="0" w:color="1a1a4e"/>
-            </w:tcBorders>
+            <w:vAlign w:val="center"/>
+            <w:shd w:val="clear" w:color="auto" w:fill="D9E1F2"/>
+            <w:tcMar>
+              <w:top w:w="180" w:type="dxa"/>
+              <w:left w:w="180" w:type="dxa"/>
+              <w:bottom w:w="180" w:type="dxa"/>
+              <w:right w:w="180" w:type="dxa"/>
+            </w:tcMar>
           </w:tcPr>
+          <w:p>
+            <w:pPr>
+              <w:spacing w:before="40" w:after="40"/>
+              <w:jc w:val="left"/>
+            </w:pPr>
+            <w:r>
+              <w:rPr>
+                <w:b/>
+                <w:color w:val="1F3864"/>
+                <w:sz w:val="44"/>
+              </w:rPr>
+              <w:t>A Safety and Technology Plan Discussion</w:t>
+            </w:r>
+          </w:p>
           <w:p>
             <w:pPr>
               <w:spacing w:before="80" w:after="40"/>
@@ -277,76 +658,39 @@
             </w:pPr>
             <w:r>
               <w:rPr>
-                <w:color w:val="555577"/>
-                <w:sz w:val="18"/>
+                <w:b w:val="0"/>
+                <w:sz w:val="28"/>
               </w:rPr>
-              <w:t xml:space="preserve">  Class 3:  </w:t>
+              <w:t xml:space="preserve">Presenter:  </w:t>
             </w:r>
             <w:r>
               <w:rPr>
                 <w:b/>
-                <w:color w:val="1A1A4E"/>
-                <w:sz w:val="26"/>
+                <w:sz w:val="28"/>
               </w:rPr>
-              <w:t>A Safety and Technology Plan Discussion</w:t>
-            </w:r>
-          </w:p>
-          <w:p>
-            <w:pPr>
-              <w:spacing w:before="20" w:after="40"/>
-            </w:pPr>
-            <w:r>
-              <w:rPr>
-                <w:color w:val="333355"/>
-                <w:sz w:val="20"/>
-              </w:rPr>
-              <w:t xml:space="preserve">  Presenter:  Jason Flaig &amp; Detective Teague</w:t>
+              <w:t>Jason Flaig &amp; Detective Teague</w:t>
               <w:br/>
               <w:t>(Madison Sheriff's Office)</w:t>
             </w:r>
           </w:p>
           <w:p>
             <w:pPr>
-              <w:spacing w:before="20" w:after="80"/>
-            </w:pPr>
-            <w:r>
-              <w:rPr>
-                <w:i/>
-                <w:color w:val="444466"/>
-                <w:sz w:val="20"/>
-              </w:rPr>
-              <w:t xml:space="preserve">  Location:  Relief Society Room</w:t>
-            </w:r>
-          </w:p>
-        </w:tc>
-      </w:tr>
-      <w:tr>
-        <w:trPr>
-          <w:trHeight w:val="1080" w:hRule="atLeast"/>
-        </w:trPr>
-        <w:tc>
-          <w:tcPr>
-            <w:tcW w:type="dxa" w:w="10080"/>
-            <w:shd w:val="clear" w:color="auto" w:fill="ffffff"/>
-            <w:tcBorders>
-              <w:top w:val="single" w:sz="18" w:space="0" w:color="1a1a4e"/>
-              <w:left w:val="single" w:sz="18" w:space="0" w:color="1a1a4e"/>
-              <w:bottom w:val="single" w:sz="18" w:space="0" w:color="1a1a4e"/>
-              <w:right w:val="single" w:sz="18" w:space="0" w:color="1a1a4e"/>
-            </w:tcBorders>
-          </w:tcPr>
-          <w:p>
-            <w:pPr>
-              <w:spacing w:before="80" w:after="80"/>
+              <w:spacing w:before="40" w:after="80"/>
               <w:jc w:val="left"/>
             </w:pPr>
             <w:r>
               <w:rPr>
-                <w:i/>
-                <w:color w:val="8888AA"/>
-                <w:sz w:val="20"/>
+                <w:b w:val="0"/>
+                <w:sz w:val="28"/>
               </w:rPr>
-              <w:t xml:space="preserve">  Next Class Time:  </w:t>
+              <w:t xml:space="preserve">Location:  </w:t>
+            </w:r>
+            <w:r>
+              <w:rPr>
+                <w:b/>
+                <w:sz w:val="28"/>
+              </w:rPr>
+              <w:t>Relief Society Room</w:t>
             </w:r>
           </w:p>
         </w:tc>
@@ -354,8 +698,17 @@
     </w:tbl>
     <w:p>
       <w:pPr>
-        <w:spacing w:before="40" w:after="40"/>
+        <w:spacing w:before="160" w:after="80"/>
+        <w:jc w:val="center"/>
       </w:pPr>
+      <w:r>
+        <w:rPr>
+          <w:i/>
+          <w:color w:val="606060"/>
+          <w:sz w:val="20"/>
+        </w:rPr>
+        <w:t>Write next class start time in each box using a marker</w:t>
+      </w:r>
     </w:p>
     <w:tbl>
       <w:tblPr>
@@ -363,7 +716,213 @@
         <w:tblW w:type="auto" w:w="0"/>
         <w:jc w:val="center"/>
         <w:tblLook w:firstColumn="1" w:firstRow="1" w:lastColumn="0" w:lastRow="0" w:noHBand="0" w:noVBand="1" w:val="04A0"/>
-        <w:tblW w:w="9360" w:type="dxa"/>
+        <w:tblBorders>
+          <w:top w:val="single" w:sz="12" w:space="0" w:color="1F3864"/>
+          <w:left w:val="single" w:sz="12" w:space="0" w:color="1F3864"/>
+          <w:bottom w:val="single" w:sz="12" w:space="0" w:color="1F3864"/>
+          <w:right w:val="single" w:sz="12" w:space="0" w:color="1F3864"/>
+          <w:insideH w:val="single" w:sz="12" w:space="0" w:color="1F3864"/>
+          <w:insideV w:val="single" w:sz="12" w:space="0" w:color="1F3864"/>
+        </w:tblBorders>
+      </w:tblPr>
+      <w:tblGrid>
+        <w:gridCol w:w="5040"/>
+        <w:gridCol w:w="5040"/>
+      </w:tblGrid>
+      <w:tr>
+        <w:trPr>
+          <w:trHeight w:val="1200" w:hRule="atLeast"/>
+        </w:trPr>
+        <w:tc>
+          <w:tcPr>
+            <w:tcW w:type="dxa" w:w="5040"/>
+            <w:shd w:val="clear" w:color="auto" w:fill="FFFFFF"/>
+            <w:tcMar>
+              <w:top w:w="144" w:type="dxa"/>
+              <w:left w:w="144" w:type="dxa"/>
+              <w:bottom w:w="144" w:type="dxa"/>
+              <w:right w:w="144" w:type="dxa"/>
+            </w:tcMar>
+          </w:tcPr>
+          <w:p>
+            <w:pPr>
+              <w:spacing w:before="80" w:after="0"/>
+              <w:jc w:val="left"/>
+            </w:pPr>
+            <w:r>
+              <w:rPr>
+                <w:b/>
+                <w:color w:val="1F3864"/>
+                <w:sz w:val="28"/>
+              </w:rPr>
+              <w:t>Next Class Time:</w:t>
+            </w:r>
+          </w:p>
+        </w:tc>
+        <w:tc>
+          <w:tcPr>
+            <w:tcW w:type="dxa" w:w="5040"/>
+            <w:shd w:val="clear" w:color="auto" w:fill="FFFFFF"/>
+            <w:tcMar>
+              <w:top w:w="144" w:type="dxa"/>
+              <w:left w:w="144" w:type="dxa"/>
+              <w:bottom w:w="144" w:type="dxa"/>
+              <w:right w:w="144" w:type="dxa"/>
+            </w:tcMar>
+          </w:tcPr>
+          <w:p>
+            <w:pPr>
+              <w:spacing w:before="80" w:after="0"/>
+              <w:jc w:val="left"/>
+            </w:pPr>
+            <w:r>
+              <w:rPr>
+                <w:b/>
+                <w:color w:val="1F3864"/>
+                <w:sz w:val="28"/>
+              </w:rPr>
+              <w:t>Next Class Time:</w:t>
+            </w:r>
+          </w:p>
+        </w:tc>
+      </w:tr>
+      <w:tr>
+        <w:trPr>
+          <w:trHeight w:val="1200" w:hRule="atLeast"/>
+        </w:trPr>
+        <w:tc>
+          <w:tcPr>
+            <w:tcW w:type="dxa" w:w="5040"/>
+            <w:shd w:val="clear" w:color="auto" w:fill="FFFFFF"/>
+            <w:tcMar>
+              <w:top w:w="144" w:type="dxa"/>
+              <w:left w:w="144" w:type="dxa"/>
+              <w:bottom w:w="144" w:type="dxa"/>
+              <w:right w:w="144" w:type="dxa"/>
+            </w:tcMar>
+          </w:tcPr>
+          <w:p>
+            <w:pPr>
+              <w:spacing w:before="80" w:after="0"/>
+              <w:jc w:val="left"/>
+            </w:pPr>
+            <w:r>
+              <w:rPr>
+                <w:b/>
+                <w:color w:val="1F3864"/>
+                <w:sz w:val="28"/>
+              </w:rPr>
+              <w:t>Next Class Time:</w:t>
+            </w:r>
+          </w:p>
+        </w:tc>
+        <w:tc>
+          <w:tcPr>
+            <w:tcW w:type="dxa" w:w="5040"/>
+            <w:shd w:val="clear" w:color="auto" w:fill="FFFFFF"/>
+            <w:tcMar>
+              <w:top w:w="144" w:type="dxa"/>
+              <w:left w:w="144" w:type="dxa"/>
+              <w:bottom w:w="144" w:type="dxa"/>
+              <w:right w:w="144" w:type="dxa"/>
+            </w:tcMar>
+          </w:tcPr>
+          <w:p>
+            <w:pPr>
+              <w:spacing w:before="80" w:after="0"/>
+              <w:jc w:val="left"/>
+            </w:pPr>
+            <w:r>
+              <w:rPr>
+                <w:b/>
+                <w:color w:val="1F3864"/>
+                <w:sz w:val="28"/>
+              </w:rPr>
+              <w:t>Next Class Time:</w:t>
+            </w:r>
+          </w:p>
+        </w:tc>
+      </w:tr>
+      <w:tr>
+        <w:trPr>
+          <w:trHeight w:val="1200" w:hRule="atLeast"/>
+        </w:trPr>
+        <w:tc>
+          <w:tcPr>
+            <w:tcW w:type="dxa" w:w="5040"/>
+            <w:shd w:val="clear" w:color="auto" w:fill="FFFFFF"/>
+            <w:tcMar>
+              <w:top w:w="144" w:type="dxa"/>
+              <w:left w:w="144" w:type="dxa"/>
+              <w:bottom w:w="144" w:type="dxa"/>
+              <w:right w:w="144" w:type="dxa"/>
+            </w:tcMar>
+          </w:tcPr>
+          <w:p>
+            <w:pPr>
+              <w:spacing w:before="80" w:after="0"/>
+              <w:jc w:val="left"/>
+            </w:pPr>
+            <w:r>
+              <w:rPr>
+                <w:b/>
+                <w:color w:val="1F3864"/>
+                <w:sz w:val="28"/>
+              </w:rPr>
+              <w:t>Next Class Time:</w:t>
+            </w:r>
+          </w:p>
+        </w:tc>
+        <w:tc>
+          <w:tcPr>
+            <w:tcW w:type="dxa" w:w="5040"/>
+            <w:shd w:val="clear" w:color="auto" w:fill="FFFFFF"/>
+            <w:tcMar>
+              <w:top w:w="144" w:type="dxa"/>
+              <w:left w:w="144" w:type="dxa"/>
+              <w:bottom w:w="144" w:type="dxa"/>
+              <w:right w:w="144" w:type="dxa"/>
+            </w:tcMar>
+          </w:tcPr>
+          <w:p>
+            <w:pPr>
+              <w:spacing w:before="80" w:after="0"/>
+              <w:jc w:val="left"/>
+            </w:pPr>
+            <w:r>
+              <w:rPr>
+                <w:b/>
+                <w:color w:val="1F3864"/>
+                <w:sz w:val="28"/>
+              </w:rPr>
+              <w:t>Next Class Time:</w:t>
+            </w:r>
+          </w:p>
+        </w:tc>
+      </w:tr>
+    </w:tbl>
+    <w:p>
+      <w:pPr>
+        <w:spacing w:before="0" w:after="0"/>
+      </w:pPr>
+      <w:r>
+        <w:br w:type="page"/>
+      </w:r>
+    </w:p>
+    <w:tbl>
+      <w:tblPr>
+        <w:tblStyle w:val="TableGrid"/>
+        <w:tblW w:type="auto" w:w="0"/>
+        <w:jc w:val="center"/>
+        <w:tblLook w:firstColumn="1" w:firstRow="1" w:lastColumn="0" w:lastRow="0" w:noHBand="0" w:noVBand="1" w:val="04A0"/>
+        <w:tblBorders>
+          <w:top w:val="single" w:sz="18" w:space="0" w:color="1F3864"/>
+          <w:left w:val="single" w:sz="18" w:space="0" w:color="1F3864"/>
+          <w:bottom w:val="single" w:sz="18" w:space="0" w:color="1F3864"/>
+          <w:right w:val="single" w:sz="18" w:space="0" w:color="1F3864"/>
+          <w:insideH w:val="single" w:sz="18" w:space="0" w:color="1F3864"/>
+          <w:insideV w:val="single" w:sz="18" w:space="0" w:color="1F3864"/>
+        </w:tblBorders>
       </w:tblPr>
       <w:tblGrid>
         <w:gridCol w:w="10080"/>
@@ -372,14 +931,29 @@
         <w:tc>
           <w:tcPr>
             <w:tcW w:type="dxa" w:w="10080"/>
-            <w:shd w:val="clear" w:color="auto" w:fill="e8e8f4"/>
-            <w:tcBorders>
-              <w:top w:val="single" w:sz="18" w:space="0" w:color="1a1a4e"/>
-              <w:left w:val="single" w:sz="18" w:space="0" w:color="1a1a4e"/>
-              <w:bottom w:val="single" w:sz="18" w:space="0" w:color="1a1a4e"/>
-              <w:right w:val="single" w:sz="18" w:space="0" w:color="1a1a4e"/>
-            </w:tcBorders>
+            <w:vAlign w:val="center"/>
+            <w:shd w:val="clear" w:color="auto" w:fill="D9E1F2"/>
+            <w:tcMar>
+              <w:top w:w="180" w:type="dxa"/>
+              <w:left w:w="180" w:type="dxa"/>
+              <w:bottom w:w="180" w:type="dxa"/>
+              <w:right w:w="180" w:type="dxa"/>
+            </w:tcMar>
           </w:tcPr>
+          <w:p>
+            <w:pPr>
+              <w:spacing w:before="40" w:after="40"/>
+              <w:jc w:val="left"/>
+            </w:pPr>
+            <w:r>
+              <w:rPr>
+                <w:b/>
+                <w:color w:val="1F3864"/>
+                <w:sz w:val="44"/>
+              </w:rPr>
+              <w:t>Use AI to Bring Your Ancestors to Life</w:t>
+            </w:r>
+          </w:p>
           <w:p>
             <w:pPr>
               <w:spacing w:before="80" w:after="40"/>
@@ -387,74 +961,37 @@
             </w:pPr>
             <w:r>
               <w:rPr>
-                <w:color w:val="555577"/>
-                <w:sz w:val="18"/>
+                <w:b w:val="0"/>
+                <w:sz w:val="28"/>
               </w:rPr>
-              <w:t xml:space="preserve">  Class 4:  </w:t>
+              <w:t xml:space="preserve">Presenter:  </w:t>
             </w:r>
             <w:r>
               <w:rPr>
                 <w:b/>
-                <w:color w:val="1A1A4E"/>
-                <w:sz w:val="26"/>
+                <w:sz w:val="28"/>
               </w:rPr>
-              <w:t>Use AI to Bring Your Ancestors to Life</w:t>
+              <w:t>Sicily Clark</w:t>
             </w:r>
           </w:p>
           <w:p>
             <w:pPr>
-              <w:spacing w:before="20" w:after="40"/>
-            </w:pPr>
-            <w:r>
-              <w:rPr>
-                <w:color w:val="333355"/>
-                <w:sz w:val="20"/>
-              </w:rPr>
-              <w:t xml:space="preserve">  Presenter:  Sicily Clark</w:t>
-            </w:r>
-          </w:p>
-          <w:p>
-            <w:pPr>
-              <w:spacing w:before="20" w:after="80"/>
-            </w:pPr>
-            <w:r>
-              <w:rPr>
-                <w:i/>
-                <w:color w:val="444466"/>
-                <w:sz w:val="20"/>
-              </w:rPr>
-              <w:t xml:space="preserve">  Location:  Young Women's Room</w:t>
-            </w:r>
-          </w:p>
-        </w:tc>
-      </w:tr>
-      <w:tr>
-        <w:trPr>
-          <w:trHeight w:val="1080" w:hRule="atLeast"/>
-        </w:trPr>
-        <w:tc>
-          <w:tcPr>
-            <w:tcW w:type="dxa" w:w="10080"/>
-            <w:shd w:val="clear" w:color="auto" w:fill="ffffff"/>
-            <w:tcBorders>
-              <w:top w:val="single" w:sz="18" w:space="0" w:color="1a1a4e"/>
-              <w:left w:val="single" w:sz="18" w:space="0" w:color="1a1a4e"/>
-              <w:bottom w:val="single" w:sz="18" w:space="0" w:color="1a1a4e"/>
-              <w:right w:val="single" w:sz="18" w:space="0" w:color="1a1a4e"/>
-            </w:tcBorders>
-          </w:tcPr>
-          <w:p>
-            <w:pPr>
-              <w:spacing w:before="80" w:after="80"/>
+              <w:spacing w:before="40" w:after="80"/>
               <w:jc w:val="left"/>
             </w:pPr>
             <w:r>
               <w:rPr>
-                <w:i/>
-                <w:color w:val="8888AA"/>
-                <w:sz w:val="20"/>
+                <w:b w:val="0"/>
+                <w:sz w:val="28"/>
               </w:rPr>
-              <w:t xml:space="preserve">  Next Class Time:  </w:t>
+              <w:t xml:space="preserve">Location:  </w:t>
+            </w:r>
+            <w:r>
+              <w:rPr>
+                <w:b/>
+                <w:sz w:val="28"/>
+              </w:rPr>
+              <w:t>Young Women's Room</w:t>
             </w:r>
           </w:p>
         </w:tc>
@@ -462,8 +999,17 @@
     </w:tbl>
     <w:p>
       <w:pPr>
-        <w:spacing w:before="40" w:after="40"/>
+        <w:spacing w:before="160" w:after="80"/>
+        <w:jc w:val="center"/>
       </w:pPr>
+      <w:r>
+        <w:rPr>
+          <w:i/>
+          <w:color w:val="606060"/>
+          <w:sz w:val="20"/>
+        </w:rPr>
+        <w:t>Write next class start time in each box using a marker</w:t>
+      </w:r>
     </w:p>
     <w:tbl>
       <w:tblPr>
@@ -471,7 +1017,213 @@
         <w:tblW w:type="auto" w:w="0"/>
         <w:jc w:val="center"/>
         <w:tblLook w:firstColumn="1" w:firstRow="1" w:lastColumn="0" w:lastRow="0" w:noHBand="0" w:noVBand="1" w:val="04A0"/>
-        <w:tblW w:w="9360" w:type="dxa"/>
+        <w:tblBorders>
+          <w:top w:val="single" w:sz="12" w:space="0" w:color="1F3864"/>
+          <w:left w:val="single" w:sz="12" w:space="0" w:color="1F3864"/>
+          <w:bottom w:val="single" w:sz="12" w:space="0" w:color="1F3864"/>
+          <w:right w:val="single" w:sz="12" w:space="0" w:color="1F3864"/>
+          <w:insideH w:val="single" w:sz="12" w:space="0" w:color="1F3864"/>
+          <w:insideV w:val="single" w:sz="12" w:space="0" w:color="1F3864"/>
+        </w:tblBorders>
+      </w:tblPr>
+      <w:tblGrid>
+        <w:gridCol w:w="5040"/>
+        <w:gridCol w:w="5040"/>
+      </w:tblGrid>
+      <w:tr>
+        <w:trPr>
+          <w:trHeight w:val="1200" w:hRule="atLeast"/>
+        </w:trPr>
+        <w:tc>
+          <w:tcPr>
+            <w:tcW w:type="dxa" w:w="5040"/>
+            <w:shd w:val="clear" w:color="auto" w:fill="FFFFFF"/>
+            <w:tcMar>
+              <w:top w:w="144" w:type="dxa"/>
+              <w:left w:w="144" w:type="dxa"/>
+              <w:bottom w:w="144" w:type="dxa"/>
+              <w:right w:w="144" w:type="dxa"/>
+            </w:tcMar>
+          </w:tcPr>
+          <w:p>
+            <w:pPr>
+              <w:spacing w:before="80" w:after="0"/>
+              <w:jc w:val="left"/>
+            </w:pPr>
+            <w:r>
+              <w:rPr>
+                <w:b/>
+                <w:color w:val="1F3864"/>
+                <w:sz w:val="28"/>
+              </w:rPr>
+              <w:t>Next Class Time:</w:t>
+            </w:r>
+          </w:p>
+        </w:tc>
+        <w:tc>
+          <w:tcPr>
+            <w:tcW w:type="dxa" w:w="5040"/>
+            <w:shd w:val="clear" w:color="auto" w:fill="FFFFFF"/>
+            <w:tcMar>
+              <w:top w:w="144" w:type="dxa"/>
+              <w:left w:w="144" w:type="dxa"/>
+              <w:bottom w:w="144" w:type="dxa"/>
+              <w:right w:w="144" w:type="dxa"/>
+            </w:tcMar>
+          </w:tcPr>
+          <w:p>
+            <w:pPr>
+              <w:spacing w:before="80" w:after="0"/>
+              <w:jc w:val="left"/>
+            </w:pPr>
+            <w:r>
+              <w:rPr>
+                <w:b/>
+                <w:color w:val="1F3864"/>
+                <w:sz w:val="28"/>
+              </w:rPr>
+              <w:t>Next Class Time:</w:t>
+            </w:r>
+          </w:p>
+        </w:tc>
+      </w:tr>
+      <w:tr>
+        <w:trPr>
+          <w:trHeight w:val="1200" w:hRule="atLeast"/>
+        </w:trPr>
+        <w:tc>
+          <w:tcPr>
+            <w:tcW w:type="dxa" w:w="5040"/>
+            <w:shd w:val="clear" w:color="auto" w:fill="FFFFFF"/>
+            <w:tcMar>
+              <w:top w:w="144" w:type="dxa"/>
+              <w:left w:w="144" w:type="dxa"/>
+              <w:bottom w:w="144" w:type="dxa"/>
+              <w:right w:w="144" w:type="dxa"/>
+            </w:tcMar>
+          </w:tcPr>
+          <w:p>
+            <w:pPr>
+              <w:spacing w:before="80" w:after="0"/>
+              <w:jc w:val="left"/>
+            </w:pPr>
+            <w:r>
+              <w:rPr>
+                <w:b/>
+                <w:color w:val="1F3864"/>
+                <w:sz w:val="28"/>
+              </w:rPr>
+              <w:t>Next Class Time:</w:t>
+            </w:r>
+          </w:p>
+        </w:tc>
+        <w:tc>
+          <w:tcPr>
+            <w:tcW w:type="dxa" w:w="5040"/>
+            <w:shd w:val="clear" w:color="auto" w:fill="FFFFFF"/>
+            <w:tcMar>
+              <w:top w:w="144" w:type="dxa"/>
+              <w:left w:w="144" w:type="dxa"/>
+              <w:bottom w:w="144" w:type="dxa"/>
+              <w:right w:w="144" w:type="dxa"/>
+            </w:tcMar>
+          </w:tcPr>
+          <w:p>
+            <w:pPr>
+              <w:spacing w:before="80" w:after="0"/>
+              <w:jc w:val="left"/>
+            </w:pPr>
+            <w:r>
+              <w:rPr>
+                <w:b/>
+                <w:color w:val="1F3864"/>
+                <w:sz w:val="28"/>
+              </w:rPr>
+              <w:t>Next Class Time:</w:t>
+            </w:r>
+          </w:p>
+        </w:tc>
+      </w:tr>
+      <w:tr>
+        <w:trPr>
+          <w:trHeight w:val="1200" w:hRule="atLeast"/>
+        </w:trPr>
+        <w:tc>
+          <w:tcPr>
+            <w:tcW w:type="dxa" w:w="5040"/>
+            <w:shd w:val="clear" w:color="auto" w:fill="FFFFFF"/>
+            <w:tcMar>
+              <w:top w:w="144" w:type="dxa"/>
+              <w:left w:w="144" w:type="dxa"/>
+              <w:bottom w:w="144" w:type="dxa"/>
+              <w:right w:w="144" w:type="dxa"/>
+            </w:tcMar>
+          </w:tcPr>
+          <w:p>
+            <w:pPr>
+              <w:spacing w:before="80" w:after="0"/>
+              <w:jc w:val="left"/>
+            </w:pPr>
+            <w:r>
+              <w:rPr>
+                <w:b/>
+                <w:color w:val="1F3864"/>
+                <w:sz w:val="28"/>
+              </w:rPr>
+              <w:t>Next Class Time:</w:t>
+            </w:r>
+          </w:p>
+        </w:tc>
+        <w:tc>
+          <w:tcPr>
+            <w:tcW w:type="dxa" w:w="5040"/>
+            <w:shd w:val="clear" w:color="auto" w:fill="FFFFFF"/>
+            <w:tcMar>
+              <w:top w:w="144" w:type="dxa"/>
+              <w:left w:w="144" w:type="dxa"/>
+              <w:bottom w:w="144" w:type="dxa"/>
+              <w:right w:w="144" w:type="dxa"/>
+            </w:tcMar>
+          </w:tcPr>
+          <w:p>
+            <w:pPr>
+              <w:spacing w:before="80" w:after="0"/>
+              <w:jc w:val="left"/>
+            </w:pPr>
+            <w:r>
+              <w:rPr>
+                <w:b/>
+                <w:color w:val="1F3864"/>
+                <w:sz w:val="28"/>
+              </w:rPr>
+              <w:t>Next Class Time:</w:t>
+            </w:r>
+          </w:p>
+        </w:tc>
+      </w:tr>
+    </w:tbl>
+    <w:p>
+      <w:pPr>
+        <w:spacing w:before="0" w:after="0"/>
+      </w:pPr>
+      <w:r>
+        <w:br w:type="page"/>
+      </w:r>
+    </w:p>
+    <w:tbl>
+      <w:tblPr>
+        <w:tblStyle w:val="TableGrid"/>
+        <w:tblW w:type="auto" w:w="0"/>
+        <w:jc w:val="center"/>
+        <w:tblLook w:firstColumn="1" w:firstRow="1" w:lastColumn="0" w:lastRow="0" w:noHBand="0" w:noVBand="1" w:val="04A0"/>
+        <w:tblBorders>
+          <w:top w:val="single" w:sz="18" w:space="0" w:color="1F3864"/>
+          <w:left w:val="single" w:sz="18" w:space="0" w:color="1F3864"/>
+          <w:bottom w:val="single" w:sz="18" w:space="0" w:color="1F3864"/>
+          <w:right w:val="single" w:sz="18" w:space="0" w:color="1F3864"/>
+          <w:insideH w:val="single" w:sz="18" w:space="0" w:color="1F3864"/>
+          <w:insideV w:val="single" w:sz="18" w:space="0" w:color="1F3864"/>
+        </w:tblBorders>
       </w:tblPr>
       <w:tblGrid>
         <w:gridCol w:w="10080"/>
@@ -480,14 +1232,44 @@
         <w:tc>
           <w:tcPr>
             <w:tcW w:type="dxa" w:w="10080"/>
-            <w:shd w:val="clear" w:color="auto" w:fill="e8e8f4"/>
-            <w:tcBorders>
-              <w:top w:val="single" w:sz="18" w:space="0" w:color="1a1a4e"/>
-              <w:left w:val="single" w:sz="18" w:space="0" w:color="1a1a4e"/>
-              <w:bottom w:val="single" w:sz="18" w:space="0" w:color="1a1a4e"/>
-              <w:right w:val="single" w:sz="18" w:space="0" w:color="1a1a4e"/>
-            </w:tcBorders>
+            <w:vAlign w:val="center"/>
+            <w:shd w:val="clear" w:color="auto" w:fill="D9E1F2"/>
+            <w:tcMar>
+              <w:top w:w="180" w:type="dxa"/>
+              <w:left w:w="180" w:type="dxa"/>
+              <w:bottom w:w="180" w:type="dxa"/>
+              <w:right w:w="180" w:type="dxa"/>
+            </w:tcMar>
           </w:tcPr>
+          <w:p>
+            <w:pPr>
+              <w:spacing w:before="40" w:after="40"/>
+              <w:jc w:val="left"/>
+            </w:pPr>
+            <w:r>
+              <w:rPr>
+                <w:b/>
+                <w:color w:val="1F3864"/>
+                <w:sz w:val="44"/>
+              </w:rPr>
+              <w:t>Did I Remember Everything?</w:t>
+            </w:r>
+          </w:p>
+          <w:p>
+            <w:pPr>
+              <w:spacing w:before="20" w:after="80"/>
+              <w:jc w:val="left"/>
+            </w:pPr>
+            <w:r>
+              <w:rPr>
+                <w:b w:val="0"/>
+                <w:i/>
+                <w:color w:val="1F3864"/>
+                <w:sz w:val="28"/>
+              </w:rPr>
+              <w:t>Organizing Vital Documents</w:t>
+            </w:r>
+          </w:p>
           <w:p>
             <w:pPr>
               <w:spacing w:before="80" w:after="40"/>
@@ -495,76 +1277,37 @@
             </w:pPr>
             <w:r>
               <w:rPr>
-                <w:color w:val="555577"/>
-                <w:sz w:val="18"/>
+                <w:b w:val="0"/>
+                <w:sz w:val="28"/>
               </w:rPr>
-              <w:t xml:space="preserve">  Class 5:  </w:t>
+              <w:t xml:space="preserve">Presenter:  </w:t>
             </w:r>
             <w:r>
               <w:rPr>
                 <w:b/>
-                <w:color w:val="1A1A4E"/>
-                <w:sz w:val="26"/>
+                <w:sz w:val="28"/>
               </w:rPr>
-              <w:t>Did I Remember Everything?</w:t>
-              <w:br/>
-              <w:t>Organizing Vital Documents</w:t>
+              <w:t>Ninette Galbraith</w:t>
             </w:r>
           </w:p>
           <w:p>
             <w:pPr>
-              <w:spacing w:before="20" w:after="40"/>
-            </w:pPr>
-            <w:r>
-              <w:rPr>
-                <w:color w:val="333355"/>
-                <w:sz w:val="20"/>
-              </w:rPr>
-              <w:t xml:space="preserve">  Presenter:  Ninette Galbraith</w:t>
-            </w:r>
-          </w:p>
-          <w:p>
-            <w:pPr>
-              <w:spacing w:before="20" w:after="80"/>
-            </w:pPr>
-            <w:r>
-              <w:rPr>
-                <w:i/>
-                <w:color w:val="444466"/>
-                <w:sz w:val="20"/>
-              </w:rPr>
-              <w:t xml:space="preserve">  Location:  Room 9</w:t>
-            </w:r>
-          </w:p>
-        </w:tc>
-      </w:tr>
-      <w:tr>
-        <w:trPr>
-          <w:trHeight w:val="1080" w:hRule="atLeast"/>
-        </w:trPr>
-        <w:tc>
-          <w:tcPr>
-            <w:tcW w:type="dxa" w:w="10080"/>
-            <w:shd w:val="clear" w:color="auto" w:fill="ffffff"/>
-            <w:tcBorders>
-              <w:top w:val="single" w:sz="18" w:space="0" w:color="1a1a4e"/>
-              <w:left w:val="single" w:sz="18" w:space="0" w:color="1a1a4e"/>
-              <w:bottom w:val="single" w:sz="18" w:space="0" w:color="1a1a4e"/>
-              <w:right w:val="single" w:sz="18" w:space="0" w:color="1a1a4e"/>
-            </w:tcBorders>
-          </w:tcPr>
-          <w:p>
-            <w:pPr>
-              <w:spacing w:before="80" w:after="80"/>
+              <w:spacing w:before="40" w:after="80"/>
               <w:jc w:val="left"/>
             </w:pPr>
             <w:r>
               <w:rPr>
-                <w:i/>
-                <w:color w:val="8888AA"/>
-                <w:sz w:val="20"/>
+                <w:b w:val="0"/>
+                <w:sz w:val="28"/>
               </w:rPr>
-              <w:t xml:space="preserve">  Next Class Time:  </w:t>
+              <w:t xml:space="preserve">Location:  </w:t>
+            </w:r>
+            <w:r>
+              <w:rPr>
+                <w:b/>
+                <w:sz w:val="28"/>
+              </w:rPr>
+              <w:t>Room 9</w:t>
             </w:r>
           </w:p>
         </w:tc>
@@ -572,8 +1315,17 @@
     </w:tbl>
     <w:p>
       <w:pPr>
-        <w:spacing w:before="40" w:after="40"/>
+        <w:spacing w:before="160" w:after="80"/>
+        <w:jc w:val="center"/>
       </w:pPr>
+      <w:r>
+        <w:rPr>
+          <w:i/>
+          <w:color w:val="606060"/>
+          <w:sz w:val="20"/>
+        </w:rPr>
+        <w:t>Write next class start time in each box using a marker</w:t>
+      </w:r>
     </w:p>
     <w:tbl>
       <w:tblPr>
@@ -581,7 +1333,213 @@
         <w:tblW w:type="auto" w:w="0"/>
         <w:jc w:val="center"/>
         <w:tblLook w:firstColumn="1" w:firstRow="1" w:lastColumn="0" w:lastRow="0" w:noHBand="0" w:noVBand="1" w:val="04A0"/>
-        <w:tblW w:w="9360" w:type="dxa"/>
+        <w:tblBorders>
+          <w:top w:val="single" w:sz="12" w:space="0" w:color="1F3864"/>
+          <w:left w:val="single" w:sz="12" w:space="0" w:color="1F3864"/>
+          <w:bottom w:val="single" w:sz="12" w:space="0" w:color="1F3864"/>
+          <w:right w:val="single" w:sz="12" w:space="0" w:color="1F3864"/>
+          <w:insideH w:val="single" w:sz="12" w:space="0" w:color="1F3864"/>
+          <w:insideV w:val="single" w:sz="12" w:space="0" w:color="1F3864"/>
+        </w:tblBorders>
+      </w:tblPr>
+      <w:tblGrid>
+        <w:gridCol w:w="5040"/>
+        <w:gridCol w:w="5040"/>
+      </w:tblGrid>
+      <w:tr>
+        <w:trPr>
+          <w:trHeight w:val="1200" w:hRule="atLeast"/>
+        </w:trPr>
+        <w:tc>
+          <w:tcPr>
+            <w:tcW w:type="dxa" w:w="5040"/>
+            <w:shd w:val="clear" w:color="auto" w:fill="FFFFFF"/>
+            <w:tcMar>
+              <w:top w:w="144" w:type="dxa"/>
+              <w:left w:w="144" w:type="dxa"/>
+              <w:bottom w:w="144" w:type="dxa"/>
+              <w:right w:w="144" w:type="dxa"/>
+            </w:tcMar>
+          </w:tcPr>
+          <w:p>
+            <w:pPr>
+              <w:spacing w:before="80" w:after="0"/>
+              <w:jc w:val="left"/>
+            </w:pPr>
+            <w:r>
+              <w:rPr>
+                <w:b/>
+                <w:color w:val="1F3864"/>
+                <w:sz w:val="28"/>
+              </w:rPr>
+              <w:t>Next Class Time:</w:t>
+            </w:r>
+          </w:p>
+        </w:tc>
+        <w:tc>
+          <w:tcPr>
+            <w:tcW w:type="dxa" w:w="5040"/>
+            <w:shd w:val="clear" w:color="auto" w:fill="FFFFFF"/>
+            <w:tcMar>
+              <w:top w:w="144" w:type="dxa"/>
+              <w:left w:w="144" w:type="dxa"/>
+              <w:bottom w:w="144" w:type="dxa"/>
+              <w:right w:w="144" w:type="dxa"/>
+            </w:tcMar>
+          </w:tcPr>
+          <w:p>
+            <w:pPr>
+              <w:spacing w:before="80" w:after="0"/>
+              <w:jc w:val="left"/>
+            </w:pPr>
+            <w:r>
+              <w:rPr>
+                <w:b/>
+                <w:color w:val="1F3864"/>
+                <w:sz w:val="28"/>
+              </w:rPr>
+              <w:t>Next Class Time:</w:t>
+            </w:r>
+          </w:p>
+        </w:tc>
+      </w:tr>
+      <w:tr>
+        <w:trPr>
+          <w:trHeight w:val="1200" w:hRule="atLeast"/>
+        </w:trPr>
+        <w:tc>
+          <w:tcPr>
+            <w:tcW w:type="dxa" w:w="5040"/>
+            <w:shd w:val="clear" w:color="auto" w:fill="FFFFFF"/>
+            <w:tcMar>
+              <w:top w:w="144" w:type="dxa"/>
+              <w:left w:w="144" w:type="dxa"/>
+              <w:bottom w:w="144" w:type="dxa"/>
+              <w:right w:w="144" w:type="dxa"/>
+            </w:tcMar>
+          </w:tcPr>
+          <w:p>
+            <w:pPr>
+              <w:spacing w:before="80" w:after="0"/>
+              <w:jc w:val="left"/>
+            </w:pPr>
+            <w:r>
+              <w:rPr>
+                <w:b/>
+                <w:color w:val="1F3864"/>
+                <w:sz w:val="28"/>
+              </w:rPr>
+              <w:t>Next Class Time:</w:t>
+            </w:r>
+          </w:p>
+        </w:tc>
+        <w:tc>
+          <w:tcPr>
+            <w:tcW w:type="dxa" w:w="5040"/>
+            <w:shd w:val="clear" w:color="auto" w:fill="FFFFFF"/>
+            <w:tcMar>
+              <w:top w:w="144" w:type="dxa"/>
+              <w:left w:w="144" w:type="dxa"/>
+              <w:bottom w:w="144" w:type="dxa"/>
+              <w:right w:w="144" w:type="dxa"/>
+            </w:tcMar>
+          </w:tcPr>
+          <w:p>
+            <w:pPr>
+              <w:spacing w:before="80" w:after="0"/>
+              <w:jc w:val="left"/>
+            </w:pPr>
+            <w:r>
+              <w:rPr>
+                <w:b/>
+                <w:color w:val="1F3864"/>
+                <w:sz w:val="28"/>
+              </w:rPr>
+              <w:t>Next Class Time:</w:t>
+            </w:r>
+          </w:p>
+        </w:tc>
+      </w:tr>
+      <w:tr>
+        <w:trPr>
+          <w:trHeight w:val="1200" w:hRule="atLeast"/>
+        </w:trPr>
+        <w:tc>
+          <w:tcPr>
+            <w:tcW w:type="dxa" w:w="5040"/>
+            <w:shd w:val="clear" w:color="auto" w:fill="FFFFFF"/>
+            <w:tcMar>
+              <w:top w:w="144" w:type="dxa"/>
+              <w:left w:w="144" w:type="dxa"/>
+              <w:bottom w:w="144" w:type="dxa"/>
+              <w:right w:w="144" w:type="dxa"/>
+            </w:tcMar>
+          </w:tcPr>
+          <w:p>
+            <w:pPr>
+              <w:spacing w:before="80" w:after="0"/>
+              <w:jc w:val="left"/>
+            </w:pPr>
+            <w:r>
+              <w:rPr>
+                <w:b/>
+                <w:color w:val="1F3864"/>
+                <w:sz w:val="28"/>
+              </w:rPr>
+              <w:t>Next Class Time:</w:t>
+            </w:r>
+          </w:p>
+        </w:tc>
+        <w:tc>
+          <w:tcPr>
+            <w:tcW w:type="dxa" w:w="5040"/>
+            <w:shd w:val="clear" w:color="auto" w:fill="FFFFFF"/>
+            <w:tcMar>
+              <w:top w:w="144" w:type="dxa"/>
+              <w:left w:w="144" w:type="dxa"/>
+              <w:bottom w:w="144" w:type="dxa"/>
+              <w:right w:w="144" w:type="dxa"/>
+            </w:tcMar>
+          </w:tcPr>
+          <w:p>
+            <w:pPr>
+              <w:spacing w:before="80" w:after="0"/>
+              <w:jc w:val="left"/>
+            </w:pPr>
+            <w:r>
+              <w:rPr>
+                <w:b/>
+                <w:color w:val="1F3864"/>
+                <w:sz w:val="28"/>
+              </w:rPr>
+              <w:t>Next Class Time:</w:t>
+            </w:r>
+          </w:p>
+        </w:tc>
+      </w:tr>
+    </w:tbl>
+    <w:p>
+      <w:pPr>
+        <w:spacing w:before="0" w:after="0"/>
+      </w:pPr>
+      <w:r>
+        <w:br w:type="page"/>
+      </w:r>
+    </w:p>
+    <w:tbl>
+      <w:tblPr>
+        <w:tblStyle w:val="TableGrid"/>
+        <w:tblW w:type="auto" w:w="0"/>
+        <w:jc w:val="center"/>
+        <w:tblLook w:firstColumn="1" w:firstRow="1" w:lastColumn="0" w:lastRow="0" w:noHBand="0" w:noVBand="1" w:val="04A0"/>
+        <w:tblBorders>
+          <w:top w:val="single" w:sz="18" w:space="0" w:color="1F3864"/>
+          <w:left w:val="single" w:sz="18" w:space="0" w:color="1F3864"/>
+          <w:bottom w:val="single" w:sz="18" w:space="0" w:color="1F3864"/>
+          <w:right w:val="single" w:sz="18" w:space="0" w:color="1F3864"/>
+          <w:insideH w:val="single" w:sz="18" w:space="0" w:color="1F3864"/>
+          <w:insideV w:val="single" w:sz="18" w:space="0" w:color="1F3864"/>
+        </w:tblBorders>
       </w:tblPr>
       <w:tblGrid>
         <w:gridCol w:w="10080"/>
@@ -590,14 +1548,29 @@
         <w:tc>
           <w:tcPr>
             <w:tcW w:type="dxa" w:w="10080"/>
-            <w:shd w:val="clear" w:color="auto" w:fill="e8e8f4"/>
-            <w:tcBorders>
-              <w:top w:val="single" w:sz="18" w:space="0" w:color="1a1a4e"/>
-              <w:left w:val="single" w:sz="18" w:space="0" w:color="1a1a4e"/>
-              <w:bottom w:val="single" w:sz="18" w:space="0" w:color="1a1a4e"/>
-              <w:right w:val="single" w:sz="18" w:space="0" w:color="1a1a4e"/>
-            </w:tcBorders>
+            <w:vAlign w:val="center"/>
+            <w:shd w:val="clear" w:color="auto" w:fill="D9E1F2"/>
+            <w:tcMar>
+              <w:top w:w="180" w:type="dxa"/>
+              <w:left w:w="180" w:type="dxa"/>
+              <w:bottom w:w="180" w:type="dxa"/>
+              <w:right w:w="180" w:type="dxa"/>
+            </w:tcMar>
           </w:tcPr>
+          <w:p>
+            <w:pPr>
+              <w:spacing w:before="40" w:after="40"/>
+              <w:jc w:val="left"/>
+            </w:pPr>
+            <w:r>
+              <w:rPr>
+                <w:b/>
+                <w:color w:val="1F3864"/>
+                <w:sz w:val="44"/>
+              </w:rPr>
+              <w:t>Family History Question and Answer</w:t>
+            </w:r>
+          </w:p>
           <w:p>
             <w:pPr>
               <w:spacing w:before="80" w:after="40"/>
@@ -605,74 +1578,37 @@
             </w:pPr>
             <w:r>
               <w:rPr>
-                <w:color w:val="555577"/>
-                <w:sz w:val="18"/>
+                <w:b w:val="0"/>
+                <w:sz w:val="28"/>
               </w:rPr>
-              <w:t xml:space="preserve">  Class 6:  </w:t>
+              <w:t xml:space="preserve">Presenter:  </w:t>
             </w:r>
             <w:r>
               <w:rPr>
                 <w:b/>
-                <w:color w:val="1A1A4E"/>
-                <w:sz w:val="26"/>
+                <w:sz w:val="28"/>
               </w:rPr>
-              <w:t>Family History Q&amp;A</w:t>
+              <w:t>Michelle Nelson, Jacob Jashinsky, &amp; Larry Lovell</w:t>
             </w:r>
           </w:p>
           <w:p>
             <w:pPr>
-              <w:spacing w:before="20" w:after="40"/>
-            </w:pPr>
-            <w:r>
-              <w:rPr>
-                <w:color w:val="333355"/>
-                <w:sz w:val="20"/>
-              </w:rPr>
-              <w:t xml:space="preserve">  Presenter:  Michelle Nelson, Jacob Jashinsky, &amp; Larry Lovell</w:t>
-            </w:r>
-          </w:p>
-          <w:p>
-            <w:pPr>
-              <w:spacing w:before="20" w:after="80"/>
-            </w:pPr>
-            <w:r>
-              <w:rPr>
-                <w:i/>
-                <w:color w:val="444466"/>
-                <w:sz w:val="20"/>
-              </w:rPr>
-              <w:t xml:space="preserve">  Location:  Rooms 6 &amp; 7</w:t>
-            </w:r>
-          </w:p>
-        </w:tc>
-      </w:tr>
-      <w:tr>
-        <w:trPr>
-          <w:trHeight w:val="1080" w:hRule="atLeast"/>
-        </w:trPr>
-        <w:tc>
-          <w:tcPr>
-            <w:tcW w:type="dxa" w:w="10080"/>
-            <w:shd w:val="clear" w:color="auto" w:fill="ffffff"/>
-            <w:tcBorders>
-              <w:top w:val="single" w:sz="18" w:space="0" w:color="1a1a4e"/>
-              <w:left w:val="single" w:sz="18" w:space="0" w:color="1a1a4e"/>
-              <w:bottom w:val="single" w:sz="18" w:space="0" w:color="1a1a4e"/>
-              <w:right w:val="single" w:sz="18" w:space="0" w:color="1a1a4e"/>
-            </w:tcBorders>
-          </w:tcPr>
-          <w:p>
-            <w:pPr>
-              <w:spacing w:before="80" w:after="80"/>
+              <w:spacing w:before="40" w:after="80"/>
               <w:jc w:val="left"/>
             </w:pPr>
             <w:r>
               <w:rPr>
-                <w:i/>
-                <w:color w:val="8888AA"/>
-                <w:sz w:val="20"/>
+                <w:b w:val="0"/>
+                <w:sz w:val="28"/>
               </w:rPr>
-              <w:t xml:space="preserve">  Next Class Time:  </w:t>
+              <w:t xml:space="preserve">Location:  </w:t>
+            </w:r>
+            <w:r>
+              <w:rPr>
+                <w:b/>
+                <w:sz w:val="28"/>
+              </w:rPr>
+              <w:t>Rooms 6 &amp; 7</w:t>
             </w:r>
           </w:p>
         </w:tc>
@@ -680,8 +1616,17 @@
     </w:tbl>
     <w:p>
       <w:pPr>
-        <w:spacing w:before="40" w:after="40"/>
+        <w:spacing w:before="160" w:after="80"/>
+        <w:jc w:val="center"/>
       </w:pPr>
+      <w:r>
+        <w:rPr>
+          <w:i/>
+          <w:color w:val="606060"/>
+          <w:sz w:val="20"/>
+        </w:rPr>
+        <w:t>Write next class start time in each box using a marker</w:t>
+      </w:r>
     </w:p>
     <w:tbl>
       <w:tblPr>
@@ -689,7 +1634,213 @@
         <w:tblW w:type="auto" w:w="0"/>
         <w:jc w:val="center"/>
         <w:tblLook w:firstColumn="1" w:firstRow="1" w:lastColumn="0" w:lastRow="0" w:noHBand="0" w:noVBand="1" w:val="04A0"/>
-        <w:tblW w:w="9360" w:type="dxa"/>
+        <w:tblBorders>
+          <w:top w:val="single" w:sz="12" w:space="0" w:color="1F3864"/>
+          <w:left w:val="single" w:sz="12" w:space="0" w:color="1F3864"/>
+          <w:bottom w:val="single" w:sz="12" w:space="0" w:color="1F3864"/>
+          <w:right w:val="single" w:sz="12" w:space="0" w:color="1F3864"/>
+          <w:insideH w:val="single" w:sz="12" w:space="0" w:color="1F3864"/>
+          <w:insideV w:val="single" w:sz="12" w:space="0" w:color="1F3864"/>
+        </w:tblBorders>
+      </w:tblPr>
+      <w:tblGrid>
+        <w:gridCol w:w="5040"/>
+        <w:gridCol w:w="5040"/>
+      </w:tblGrid>
+      <w:tr>
+        <w:trPr>
+          <w:trHeight w:val="1200" w:hRule="atLeast"/>
+        </w:trPr>
+        <w:tc>
+          <w:tcPr>
+            <w:tcW w:type="dxa" w:w="5040"/>
+            <w:shd w:val="clear" w:color="auto" w:fill="FFFFFF"/>
+            <w:tcMar>
+              <w:top w:w="144" w:type="dxa"/>
+              <w:left w:w="144" w:type="dxa"/>
+              <w:bottom w:w="144" w:type="dxa"/>
+              <w:right w:w="144" w:type="dxa"/>
+            </w:tcMar>
+          </w:tcPr>
+          <w:p>
+            <w:pPr>
+              <w:spacing w:before="80" w:after="0"/>
+              <w:jc w:val="left"/>
+            </w:pPr>
+            <w:r>
+              <w:rPr>
+                <w:b/>
+                <w:color w:val="1F3864"/>
+                <w:sz w:val="28"/>
+              </w:rPr>
+              <w:t>Next Class Time:</w:t>
+            </w:r>
+          </w:p>
+        </w:tc>
+        <w:tc>
+          <w:tcPr>
+            <w:tcW w:type="dxa" w:w="5040"/>
+            <w:shd w:val="clear" w:color="auto" w:fill="FFFFFF"/>
+            <w:tcMar>
+              <w:top w:w="144" w:type="dxa"/>
+              <w:left w:w="144" w:type="dxa"/>
+              <w:bottom w:w="144" w:type="dxa"/>
+              <w:right w:w="144" w:type="dxa"/>
+            </w:tcMar>
+          </w:tcPr>
+          <w:p>
+            <w:pPr>
+              <w:spacing w:before="80" w:after="0"/>
+              <w:jc w:val="left"/>
+            </w:pPr>
+            <w:r>
+              <w:rPr>
+                <w:b/>
+                <w:color w:val="1F3864"/>
+                <w:sz w:val="28"/>
+              </w:rPr>
+              <w:t>Next Class Time:</w:t>
+            </w:r>
+          </w:p>
+        </w:tc>
+      </w:tr>
+      <w:tr>
+        <w:trPr>
+          <w:trHeight w:val="1200" w:hRule="atLeast"/>
+        </w:trPr>
+        <w:tc>
+          <w:tcPr>
+            <w:tcW w:type="dxa" w:w="5040"/>
+            <w:shd w:val="clear" w:color="auto" w:fill="FFFFFF"/>
+            <w:tcMar>
+              <w:top w:w="144" w:type="dxa"/>
+              <w:left w:w="144" w:type="dxa"/>
+              <w:bottom w:w="144" w:type="dxa"/>
+              <w:right w:w="144" w:type="dxa"/>
+            </w:tcMar>
+          </w:tcPr>
+          <w:p>
+            <w:pPr>
+              <w:spacing w:before="80" w:after="0"/>
+              <w:jc w:val="left"/>
+            </w:pPr>
+            <w:r>
+              <w:rPr>
+                <w:b/>
+                <w:color w:val="1F3864"/>
+                <w:sz w:val="28"/>
+              </w:rPr>
+              <w:t>Next Class Time:</w:t>
+            </w:r>
+          </w:p>
+        </w:tc>
+        <w:tc>
+          <w:tcPr>
+            <w:tcW w:type="dxa" w:w="5040"/>
+            <w:shd w:val="clear" w:color="auto" w:fill="FFFFFF"/>
+            <w:tcMar>
+              <w:top w:w="144" w:type="dxa"/>
+              <w:left w:w="144" w:type="dxa"/>
+              <w:bottom w:w="144" w:type="dxa"/>
+              <w:right w:w="144" w:type="dxa"/>
+            </w:tcMar>
+          </w:tcPr>
+          <w:p>
+            <w:pPr>
+              <w:spacing w:before="80" w:after="0"/>
+              <w:jc w:val="left"/>
+            </w:pPr>
+            <w:r>
+              <w:rPr>
+                <w:b/>
+                <w:color w:val="1F3864"/>
+                <w:sz w:val="28"/>
+              </w:rPr>
+              <w:t>Next Class Time:</w:t>
+            </w:r>
+          </w:p>
+        </w:tc>
+      </w:tr>
+      <w:tr>
+        <w:trPr>
+          <w:trHeight w:val="1200" w:hRule="atLeast"/>
+        </w:trPr>
+        <w:tc>
+          <w:tcPr>
+            <w:tcW w:type="dxa" w:w="5040"/>
+            <w:shd w:val="clear" w:color="auto" w:fill="FFFFFF"/>
+            <w:tcMar>
+              <w:top w:w="144" w:type="dxa"/>
+              <w:left w:w="144" w:type="dxa"/>
+              <w:bottom w:w="144" w:type="dxa"/>
+              <w:right w:w="144" w:type="dxa"/>
+            </w:tcMar>
+          </w:tcPr>
+          <w:p>
+            <w:pPr>
+              <w:spacing w:before="80" w:after="0"/>
+              <w:jc w:val="left"/>
+            </w:pPr>
+            <w:r>
+              <w:rPr>
+                <w:b/>
+                <w:color w:val="1F3864"/>
+                <w:sz w:val="28"/>
+              </w:rPr>
+              <w:t>Next Class Time:</w:t>
+            </w:r>
+          </w:p>
+        </w:tc>
+        <w:tc>
+          <w:tcPr>
+            <w:tcW w:type="dxa" w:w="5040"/>
+            <w:shd w:val="clear" w:color="auto" w:fill="FFFFFF"/>
+            <w:tcMar>
+              <w:top w:w="144" w:type="dxa"/>
+              <w:left w:w="144" w:type="dxa"/>
+              <w:bottom w:w="144" w:type="dxa"/>
+              <w:right w:w="144" w:type="dxa"/>
+            </w:tcMar>
+          </w:tcPr>
+          <w:p>
+            <w:pPr>
+              <w:spacing w:before="80" w:after="0"/>
+              <w:jc w:val="left"/>
+            </w:pPr>
+            <w:r>
+              <w:rPr>
+                <w:b/>
+                <w:color w:val="1F3864"/>
+                <w:sz w:val="28"/>
+              </w:rPr>
+              <w:t>Next Class Time:</w:t>
+            </w:r>
+          </w:p>
+        </w:tc>
+      </w:tr>
+    </w:tbl>
+    <w:p>
+      <w:pPr>
+        <w:spacing w:before="0" w:after="0"/>
+      </w:pPr>
+      <w:r>
+        <w:br w:type="page"/>
+      </w:r>
+    </w:p>
+    <w:tbl>
+      <w:tblPr>
+        <w:tblStyle w:val="TableGrid"/>
+        <w:tblW w:type="auto" w:w="0"/>
+        <w:jc w:val="center"/>
+        <w:tblLook w:firstColumn="1" w:firstRow="1" w:lastColumn="0" w:lastRow="0" w:noHBand="0" w:noVBand="1" w:val="04A0"/>
+        <w:tblBorders>
+          <w:top w:val="single" w:sz="18" w:space="0" w:color="1F3864"/>
+          <w:left w:val="single" w:sz="18" w:space="0" w:color="1F3864"/>
+          <w:bottom w:val="single" w:sz="18" w:space="0" w:color="1F3864"/>
+          <w:right w:val="single" w:sz="18" w:space="0" w:color="1F3864"/>
+          <w:insideH w:val="single" w:sz="18" w:space="0" w:color="1F3864"/>
+          <w:insideV w:val="single" w:sz="18" w:space="0" w:color="1F3864"/>
+        </w:tblBorders>
       </w:tblPr>
       <w:tblGrid>
         <w:gridCol w:w="10080"/>
@@ -698,14 +1849,44 @@
         <w:tc>
           <w:tcPr>
             <w:tcW w:type="dxa" w:w="10080"/>
-            <w:shd w:val="clear" w:color="auto" w:fill="e8e8f4"/>
-            <w:tcBorders>
-              <w:top w:val="single" w:sz="18" w:space="0" w:color="1a1a4e"/>
-              <w:left w:val="single" w:sz="18" w:space="0" w:color="1a1a4e"/>
-              <w:bottom w:val="single" w:sz="18" w:space="0" w:color="1a1a4e"/>
-              <w:right w:val="single" w:sz="18" w:space="0" w:color="1a1a4e"/>
-            </w:tcBorders>
+            <w:vAlign w:val="center"/>
+            <w:shd w:val="clear" w:color="auto" w:fill="D9E1F2"/>
+            <w:tcMar>
+              <w:top w:w="180" w:type="dxa"/>
+              <w:left w:w="180" w:type="dxa"/>
+              <w:bottom w:w="180" w:type="dxa"/>
+              <w:right w:w="180" w:type="dxa"/>
+            </w:tcMar>
           </w:tcPr>
+          <w:p>
+            <w:pPr>
+              <w:spacing w:before="40" w:after="40"/>
+              <w:jc w:val="left"/>
+            </w:pPr>
+            <w:r>
+              <w:rPr>
+                <w:b/>
+                <w:color w:val="1F3864"/>
+                <w:sz w:val="44"/>
+              </w:rPr>
+              <w:t>The Teton Dam Disaster</w:t>
+            </w:r>
+          </w:p>
+          <w:p>
+            <w:pPr>
+              <w:spacing w:before="20" w:after="80"/>
+              <w:jc w:val="left"/>
+            </w:pPr>
+            <w:r>
+              <w:rPr>
+                <w:b w:val="0"/>
+                <w:i/>
+                <w:color w:val="1F3864"/>
+                <w:sz w:val="28"/>
+              </w:rPr>
+              <w:t>What happened, what was learned, and inspiring stories</w:t>
+            </w:r>
+          </w:p>
           <w:p>
             <w:pPr>
               <w:spacing w:before="80" w:after="40"/>
@@ -713,74 +1894,37 @@
             </w:pPr>
             <w:r>
               <w:rPr>
-                <w:color w:val="555577"/>
-                <w:sz w:val="18"/>
+                <w:b w:val="0"/>
+                <w:sz w:val="28"/>
               </w:rPr>
-              <w:t xml:space="preserve">  Class 7:  </w:t>
+              <w:t xml:space="preserve">Presenter:  </w:t>
             </w:r>
             <w:r>
               <w:rPr>
                 <w:b/>
-                <w:color w:val="1A1A4E"/>
-                <w:sz w:val="26"/>
+                <w:sz w:val="28"/>
               </w:rPr>
-              <w:t>The Teton Dam Disaster</w:t>
+              <w:t>John Galbraith</w:t>
             </w:r>
           </w:p>
           <w:p>
             <w:pPr>
-              <w:spacing w:before="20" w:after="40"/>
-            </w:pPr>
-            <w:r>
-              <w:rPr>
-                <w:color w:val="333355"/>
-                <w:sz w:val="20"/>
-              </w:rPr>
-              <w:t xml:space="preserve">  Presenter:  John Galbraith</w:t>
-            </w:r>
-          </w:p>
-          <w:p>
-            <w:pPr>
-              <w:spacing w:before="20" w:after="80"/>
-            </w:pPr>
-            <w:r>
-              <w:rPr>
-                <w:i/>
-                <w:color w:val="444466"/>
-                <w:sz w:val="20"/>
-              </w:rPr>
-              <w:t xml:space="preserve">  Location:  Priesthood Room</w:t>
-            </w:r>
-          </w:p>
-        </w:tc>
-      </w:tr>
-      <w:tr>
-        <w:trPr>
-          <w:trHeight w:val="1080" w:hRule="atLeast"/>
-        </w:trPr>
-        <w:tc>
-          <w:tcPr>
-            <w:tcW w:type="dxa" w:w="10080"/>
-            <w:shd w:val="clear" w:color="auto" w:fill="ffffff"/>
-            <w:tcBorders>
-              <w:top w:val="single" w:sz="18" w:space="0" w:color="1a1a4e"/>
-              <w:left w:val="single" w:sz="18" w:space="0" w:color="1a1a4e"/>
-              <w:bottom w:val="single" w:sz="18" w:space="0" w:color="1a1a4e"/>
-              <w:right w:val="single" w:sz="18" w:space="0" w:color="1a1a4e"/>
-            </w:tcBorders>
-          </w:tcPr>
-          <w:p>
-            <w:pPr>
-              <w:spacing w:before="80" w:after="80"/>
+              <w:spacing w:before="40" w:after="80"/>
               <w:jc w:val="left"/>
             </w:pPr>
             <w:r>
               <w:rPr>
-                <w:i/>
-                <w:color w:val="8888AA"/>
-                <w:sz w:val="20"/>
+                <w:b w:val="0"/>
+                <w:sz w:val="28"/>
               </w:rPr>
-              <w:t xml:space="preserve">  Next Class Time:  </w:t>
+              <w:t xml:space="preserve">Location:  </w:t>
+            </w:r>
+            <w:r>
+              <w:rPr>
+                <w:b/>
+                <w:sz w:val="28"/>
+              </w:rPr>
+              <w:t>Priesthood Room</w:t>
             </w:r>
           </w:p>
         </w:tc>
@@ -788,8 +1932,17 @@
     </w:tbl>
     <w:p>
       <w:pPr>
-        <w:spacing w:before="40" w:after="40"/>
+        <w:spacing w:before="160" w:after="80"/>
+        <w:jc w:val="center"/>
       </w:pPr>
+      <w:r>
+        <w:rPr>
+          <w:i/>
+          <w:color w:val="606060"/>
+          <w:sz w:val="20"/>
+        </w:rPr>
+        <w:t>Write next class start time in each box using a marker</w:t>
+      </w:r>
     </w:p>
     <w:tbl>
       <w:tblPr>
@@ -797,7 +1950,213 @@
         <w:tblW w:type="auto" w:w="0"/>
         <w:jc w:val="center"/>
         <w:tblLook w:firstColumn="1" w:firstRow="1" w:lastColumn="0" w:lastRow="0" w:noHBand="0" w:noVBand="1" w:val="04A0"/>
-        <w:tblW w:w="9360" w:type="dxa"/>
+        <w:tblBorders>
+          <w:top w:val="single" w:sz="12" w:space="0" w:color="1F3864"/>
+          <w:left w:val="single" w:sz="12" w:space="0" w:color="1F3864"/>
+          <w:bottom w:val="single" w:sz="12" w:space="0" w:color="1F3864"/>
+          <w:right w:val="single" w:sz="12" w:space="0" w:color="1F3864"/>
+          <w:insideH w:val="single" w:sz="12" w:space="0" w:color="1F3864"/>
+          <w:insideV w:val="single" w:sz="12" w:space="0" w:color="1F3864"/>
+        </w:tblBorders>
+      </w:tblPr>
+      <w:tblGrid>
+        <w:gridCol w:w="5040"/>
+        <w:gridCol w:w="5040"/>
+      </w:tblGrid>
+      <w:tr>
+        <w:trPr>
+          <w:trHeight w:val="1200" w:hRule="atLeast"/>
+        </w:trPr>
+        <w:tc>
+          <w:tcPr>
+            <w:tcW w:type="dxa" w:w="5040"/>
+            <w:shd w:val="clear" w:color="auto" w:fill="FFFFFF"/>
+            <w:tcMar>
+              <w:top w:w="144" w:type="dxa"/>
+              <w:left w:w="144" w:type="dxa"/>
+              <w:bottom w:w="144" w:type="dxa"/>
+              <w:right w:w="144" w:type="dxa"/>
+            </w:tcMar>
+          </w:tcPr>
+          <w:p>
+            <w:pPr>
+              <w:spacing w:before="80" w:after="0"/>
+              <w:jc w:val="left"/>
+            </w:pPr>
+            <w:r>
+              <w:rPr>
+                <w:b/>
+                <w:color w:val="1F3864"/>
+                <w:sz w:val="28"/>
+              </w:rPr>
+              <w:t>Next Class Time:</w:t>
+            </w:r>
+          </w:p>
+        </w:tc>
+        <w:tc>
+          <w:tcPr>
+            <w:tcW w:type="dxa" w:w="5040"/>
+            <w:shd w:val="clear" w:color="auto" w:fill="FFFFFF"/>
+            <w:tcMar>
+              <w:top w:w="144" w:type="dxa"/>
+              <w:left w:w="144" w:type="dxa"/>
+              <w:bottom w:w="144" w:type="dxa"/>
+              <w:right w:w="144" w:type="dxa"/>
+            </w:tcMar>
+          </w:tcPr>
+          <w:p>
+            <w:pPr>
+              <w:spacing w:before="80" w:after="0"/>
+              <w:jc w:val="left"/>
+            </w:pPr>
+            <w:r>
+              <w:rPr>
+                <w:b/>
+                <w:color w:val="1F3864"/>
+                <w:sz w:val="28"/>
+              </w:rPr>
+              <w:t>Next Class Time:</w:t>
+            </w:r>
+          </w:p>
+        </w:tc>
+      </w:tr>
+      <w:tr>
+        <w:trPr>
+          <w:trHeight w:val="1200" w:hRule="atLeast"/>
+        </w:trPr>
+        <w:tc>
+          <w:tcPr>
+            <w:tcW w:type="dxa" w:w="5040"/>
+            <w:shd w:val="clear" w:color="auto" w:fill="FFFFFF"/>
+            <w:tcMar>
+              <w:top w:w="144" w:type="dxa"/>
+              <w:left w:w="144" w:type="dxa"/>
+              <w:bottom w:w="144" w:type="dxa"/>
+              <w:right w:w="144" w:type="dxa"/>
+            </w:tcMar>
+          </w:tcPr>
+          <w:p>
+            <w:pPr>
+              <w:spacing w:before="80" w:after="0"/>
+              <w:jc w:val="left"/>
+            </w:pPr>
+            <w:r>
+              <w:rPr>
+                <w:b/>
+                <w:color w:val="1F3864"/>
+                <w:sz w:val="28"/>
+              </w:rPr>
+              <w:t>Next Class Time:</w:t>
+            </w:r>
+          </w:p>
+        </w:tc>
+        <w:tc>
+          <w:tcPr>
+            <w:tcW w:type="dxa" w:w="5040"/>
+            <w:shd w:val="clear" w:color="auto" w:fill="FFFFFF"/>
+            <w:tcMar>
+              <w:top w:w="144" w:type="dxa"/>
+              <w:left w:w="144" w:type="dxa"/>
+              <w:bottom w:w="144" w:type="dxa"/>
+              <w:right w:w="144" w:type="dxa"/>
+            </w:tcMar>
+          </w:tcPr>
+          <w:p>
+            <w:pPr>
+              <w:spacing w:before="80" w:after="0"/>
+              <w:jc w:val="left"/>
+            </w:pPr>
+            <w:r>
+              <w:rPr>
+                <w:b/>
+                <w:color w:val="1F3864"/>
+                <w:sz w:val="28"/>
+              </w:rPr>
+              <w:t>Next Class Time:</w:t>
+            </w:r>
+          </w:p>
+        </w:tc>
+      </w:tr>
+      <w:tr>
+        <w:trPr>
+          <w:trHeight w:val="1200" w:hRule="atLeast"/>
+        </w:trPr>
+        <w:tc>
+          <w:tcPr>
+            <w:tcW w:type="dxa" w:w="5040"/>
+            <w:shd w:val="clear" w:color="auto" w:fill="FFFFFF"/>
+            <w:tcMar>
+              <w:top w:w="144" w:type="dxa"/>
+              <w:left w:w="144" w:type="dxa"/>
+              <w:bottom w:w="144" w:type="dxa"/>
+              <w:right w:w="144" w:type="dxa"/>
+            </w:tcMar>
+          </w:tcPr>
+          <w:p>
+            <w:pPr>
+              <w:spacing w:before="80" w:after="0"/>
+              <w:jc w:val="left"/>
+            </w:pPr>
+            <w:r>
+              <w:rPr>
+                <w:b/>
+                <w:color w:val="1F3864"/>
+                <w:sz w:val="28"/>
+              </w:rPr>
+              <w:t>Next Class Time:</w:t>
+            </w:r>
+          </w:p>
+        </w:tc>
+        <w:tc>
+          <w:tcPr>
+            <w:tcW w:type="dxa" w:w="5040"/>
+            <w:shd w:val="clear" w:color="auto" w:fill="FFFFFF"/>
+            <w:tcMar>
+              <w:top w:w="144" w:type="dxa"/>
+              <w:left w:w="144" w:type="dxa"/>
+              <w:bottom w:w="144" w:type="dxa"/>
+              <w:right w:w="144" w:type="dxa"/>
+            </w:tcMar>
+          </w:tcPr>
+          <w:p>
+            <w:pPr>
+              <w:spacing w:before="80" w:after="0"/>
+              <w:jc w:val="left"/>
+            </w:pPr>
+            <w:r>
+              <w:rPr>
+                <w:b/>
+                <w:color w:val="1F3864"/>
+                <w:sz w:val="28"/>
+              </w:rPr>
+              <w:t>Next Class Time:</w:t>
+            </w:r>
+          </w:p>
+        </w:tc>
+      </w:tr>
+    </w:tbl>
+    <w:p>
+      <w:pPr>
+        <w:spacing w:before="0" w:after="0"/>
+      </w:pPr>
+      <w:r>
+        <w:br w:type="page"/>
+      </w:r>
+    </w:p>
+    <w:tbl>
+      <w:tblPr>
+        <w:tblStyle w:val="TableGrid"/>
+        <w:tblW w:type="auto" w:w="0"/>
+        <w:jc w:val="center"/>
+        <w:tblLook w:firstColumn="1" w:firstRow="1" w:lastColumn="0" w:lastRow="0" w:noHBand="0" w:noVBand="1" w:val="04A0"/>
+        <w:tblBorders>
+          <w:top w:val="single" w:sz="18" w:space="0" w:color="1F3864"/>
+          <w:left w:val="single" w:sz="18" w:space="0" w:color="1F3864"/>
+          <w:bottom w:val="single" w:sz="18" w:space="0" w:color="1F3864"/>
+          <w:right w:val="single" w:sz="18" w:space="0" w:color="1F3864"/>
+          <w:insideH w:val="single" w:sz="18" w:space="0" w:color="1F3864"/>
+          <w:insideV w:val="single" w:sz="18" w:space="0" w:color="1F3864"/>
+        </w:tblBorders>
       </w:tblPr>
       <w:tblGrid>
         <w:gridCol w:w="10080"/>
@@ -806,31 +2165,25 @@
         <w:tc>
           <w:tcPr>
             <w:tcW w:type="dxa" w:w="10080"/>
-            <w:shd w:val="clear" w:color="auto" w:fill="e8e8f4"/>
-            <w:tcBorders>
-              <w:top w:val="single" w:sz="18" w:space="0" w:color="1a1a4e"/>
-              <w:left w:val="single" w:sz="18" w:space="0" w:color="1a1a4e"/>
-              <w:bottom w:val="single" w:sz="18" w:space="0" w:color="1a1a4e"/>
-              <w:right w:val="single" w:sz="18" w:space="0" w:color="1a1a4e"/>
-            </w:tcBorders>
+            <w:vAlign w:val="center"/>
+            <w:shd w:val="clear" w:color="auto" w:fill="D9E1F2"/>
+            <w:tcMar>
+              <w:top w:w="180" w:type="dxa"/>
+              <w:left w:w="180" w:type="dxa"/>
+              <w:bottom w:w="180" w:type="dxa"/>
+              <w:right w:w="180" w:type="dxa"/>
+            </w:tcMar>
           </w:tcPr>
           <w:p>
             <w:pPr>
-              <w:spacing w:before="80" w:after="40"/>
+              <w:spacing w:before="40" w:after="40"/>
               <w:jc w:val="left"/>
             </w:pPr>
             <w:r>
               <w:rPr>
-                <w:color w:val="555577"/>
-                <w:sz w:val="18"/>
-              </w:rPr>
-              <w:t xml:space="preserve">  Class 8:  </w:t>
-            </w:r>
-            <w:r>
-              <w:rPr>
                 <w:b/>
-                <w:color w:val="1A1A4E"/>
-                <w:sz w:val="26"/>
+                <w:color w:val="1F3864"/>
+                <w:sz w:val="44"/>
               </w:rPr>
               <w:t>Job Search, Résumé Tips</w:t>
               <w:br/>
@@ -839,79 +2192,254 @@
           </w:p>
           <w:p>
             <w:pPr>
-              <w:spacing w:before="20" w:after="40"/>
+              <w:spacing w:before="80" w:after="40"/>
+              <w:jc w:val="left"/>
             </w:pPr>
             <w:r>
               <w:rPr>
-                <w:color w:val="333355"/>
-                <w:sz w:val="20"/>
+                <w:b w:val="0"/>
+                <w:sz w:val="28"/>
               </w:rPr>
-              <w:t xml:space="preserve">  Presenter:  John Ekins &amp; Elder Gary Chapman</w:t>
+              <w:t xml:space="preserve">Presenter:  </w:t>
+            </w:r>
+            <w:r>
+              <w:rPr>
+                <w:b/>
+                <w:sz w:val="28"/>
+              </w:rPr>
+              <w:t>John Ekins &amp; Elder Gary Chapman</w:t>
               <w:br/>
               <w:t>(Employment Missionary)</w:t>
             </w:r>
           </w:p>
           <w:p>
             <w:pPr>
-              <w:spacing w:before="20" w:after="80"/>
+              <w:spacing w:before="40" w:after="80"/>
+              <w:jc w:val="left"/>
             </w:pPr>
             <w:r>
               <w:rPr>
-                <w:i/>
-                <w:color w:val="444466"/>
-                <w:sz w:val="20"/>
+                <w:b w:val="0"/>
+                <w:sz w:val="28"/>
               </w:rPr>
-              <w:t xml:space="preserve">  Location:  Room 2</w:t>
+              <w:t xml:space="preserve">Location:  </w:t>
+            </w:r>
+            <w:r>
+              <w:rPr>
+                <w:b/>
+                <w:sz w:val="28"/>
+              </w:rPr>
+              <w:t>Room 2</w:t>
+            </w:r>
+          </w:p>
+        </w:tc>
+      </w:tr>
+    </w:tbl>
+    <w:p>
+      <w:pPr>
+        <w:spacing w:before="160" w:after="80"/>
+        <w:jc w:val="center"/>
+      </w:pPr>
+      <w:r>
+        <w:rPr>
+          <w:i/>
+          <w:color w:val="606060"/>
+          <w:sz w:val="20"/>
+        </w:rPr>
+        <w:t>Write next class start time in each box using a marker</w:t>
+      </w:r>
+    </w:p>
+    <w:tbl>
+      <w:tblPr>
+        <w:tblStyle w:val="TableGrid"/>
+        <w:tblW w:type="auto" w:w="0"/>
+        <w:jc w:val="center"/>
+        <w:tblLook w:firstColumn="1" w:firstRow="1" w:lastColumn="0" w:lastRow="0" w:noHBand="0" w:noVBand="1" w:val="04A0"/>
+        <w:tblBorders>
+          <w:top w:val="single" w:sz="12" w:space="0" w:color="1F3864"/>
+          <w:left w:val="single" w:sz="12" w:space="0" w:color="1F3864"/>
+          <w:bottom w:val="single" w:sz="12" w:space="0" w:color="1F3864"/>
+          <w:right w:val="single" w:sz="12" w:space="0" w:color="1F3864"/>
+          <w:insideH w:val="single" w:sz="12" w:space="0" w:color="1F3864"/>
+          <w:insideV w:val="single" w:sz="12" w:space="0" w:color="1F3864"/>
+        </w:tblBorders>
+      </w:tblPr>
+      <w:tblGrid>
+        <w:gridCol w:w="5040"/>
+        <w:gridCol w:w="5040"/>
+      </w:tblGrid>
+      <w:tr>
+        <w:trPr>
+          <w:trHeight w:val="1200" w:hRule="atLeast"/>
+        </w:trPr>
+        <w:tc>
+          <w:tcPr>
+            <w:tcW w:type="dxa" w:w="5040"/>
+            <w:shd w:val="clear" w:color="auto" w:fill="FFFFFF"/>
+            <w:tcMar>
+              <w:top w:w="144" w:type="dxa"/>
+              <w:left w:w="144" w:type="dxa"/>
+              <w:bottom w:w="144" w:type="dxa"/>
+              <w:right w:w="144" w:type="dxa"/>
+            </w:tcMar>
+          </w:tcPr>
+          <w:p>
+            <w:pPr>
+              <w:spacing w:before="80" w:after="0"/>
+              <w:jc w:val="left"/>
+            </w:pPr>
+            <w:r>
+              <w:rPr>
+                <w:b/>
+                <w:color w:val="1F3864"/>
+                <w:sz w:val="28"/>
+              </w:rPr>
+              <w:t>Next Class Time:</w:t>
+            </w:r>
+          </w:p>
+        </w:tc>
+        <w:tc>
+          <w:tcPr>
+            <w:tcW w:type="dxa" w:w="5040"/>
+            <w:shd w:val="clear" w:color="auto" w:fill="FFFFFF"/>
+            <w:tcMar>
+              <w:top w:w="144" w:type="dxa"/>
+              <w:left w:w="144" w:type="dxa"/>
+              <w:bottom w:w="144" w:type="dxa"/>
+              <w:right w:w="144" w:type="dxa"/>
+            </w:tcMar>
+          </w:tcPr>
+          <w:p>
+            <w:pPr>
+              <w:spacing w:before="80" w:after="0"/>
+              <w:jc w:val="left"/>
+            </w:pPr>
+            <w:r>
+              <w:rPr>
+                <w:b/>
+                <w:color w:val="1F3864"/>
+                <w:sz w:val="28"/>
+              </w:rPr>
+              <w:t>Next Class Time:</w:t>
             </w:r>
           </w:p>
         </w:tc>
       </w:tr>
       <w:tr>
         <w:trPr>
-          <w:trHeight w:val="1080" w:hRule="atLeast"/>
+          <w:trHeight w:val="1200" w:hRule="atLeast"/>
         </w:trPr>
         <w:tc>
           <w:tcPr>
-            <w:tcW w:type="dxa" w:w="10080"/>
-            <w:shd w:val="clear" w:color="auto" w:fill="ffffff"/>
-            <w:tcBorders>
-              <w:top w:val="single" w:sz="18" w:space="0" w:color="1a1a4e"/>
-              <w:left w:val="single" w:sz="18" w:space="0" w:color="1a1a4e"/>
-              <w:bottom w:val="single" w:sz="18" w:space="0" w:color="1a1a4e"/>
-              <w:right w:val="single" w:sz="18" w:space="0" w:color="1a1a4e"/>
-            </w:tcBorders>
+            <w:tcW w:type="dxa" w:w="5040"/>
+            <w:shd w:val="clear" w:color="auto" w:fill="FFFFFF"/>
+            <w:tcMar>
+              <w:top w:w="144" w:type="dxa"/>
+              <w:left w:w="144" w:type="dxa"/>
+              <w:bottom w:w="144" w:type="dxa"/>
+              <w:right w:w="144" w:type="dxa"/>
+            </w:tcMar>
           </w:tcPr>
           <w:p>
             <w:pPr>
-              <w:spacing w:before="80" w:after="80"/>
+              <w:spacing w:before="80" w:after="0"/>
               <w:jc w:val="left"/>
             </w:pPr>
             <w:r>
               <w:rPr>
-                <w:i/>
-                <w:color w:val="8888AA"/>
-                <w:sz w:val="20"/>
+                <w:b/>
+                <w:color w:val="1F3864"/>
+                <w:sz w:val="28"/>
               </w:rPr>
-              <w:t xml:space="preserve">  Next Class Time:  </w:t>
+              <w:t>Next Class Time:</w:t>
+            </w:r>
+          </w:p>
+        </w:tc>
+        <w:tc>
+          <w:tcPr>
+            <w:tcW w:type="dxa" w:w="5040"/>
+            <w:shd w:val="clear" w:color="auto" w:fill="FFFFFF"/>
+            <w:tcMar>
+              <w:top w:w="144" w:type="dxa"/>
+              <w:left w:w="144" w:type="dxa"/>
+              <w:bottom w:w="144" w:type="dxa"/>
+              <w:right w:w="144" w:type="dxa"/>
+            </w:tcMar>
+          </w:tcPr>
+          <w:p>
+            <w:pPr>
+              <w:spacing w:before="80" w:after="0"/>
+              <w:jc w:val="left"/>
+            </w:pPr>
+            <w:r>
+              <w:rPr>
+                <w:b/>
+                <w:color w:val="1F3864"/>
+                <w:sz w:val="28"/>
+              </w:rPr>
+              <w:t>Next Class Time:</w:t>
+            </w:r>
+          </w:p>
+        </w:tc>
+      </w:tr>
+      <w:tr>
+        <w:trPr>
+          <w:trHeight w:val="1200" w:hRule="atLeast"/>
+        </w:trPr>
+        <w:tc>
+          <w:tcPr>
+            <w:tcW w:type="dxa" w:w="5040"/>
+            <w:shd w:val="clear" w:color="auto" w:fill="FFFFFF"/>
+            <w:tcMar>
+              <w:top w:w="144" w:type="dxa"/>
+              <w:left w:w="144" w:type="dxa"/>
+              <w:bottom w:w="144" w:type="dxa"/>
+              <w:right w:w="144" w:type="dxa"/>
+            </w:tcMar>
+          </w:tcPr>
+          <w:p>
+            <w:pPr>
+              <w:spacing w:before="80" w:after="0"/>
+              <w:jc w:val="left"/>
+            </w:pPr>
+            <w:r>
+              <w:rPr>
+                <w:b/>
+                <w:color w:val="1F3864"/>
+                <w:sz w:val="28"/>
+              </w:rPr>
+              <w:t>Next Class Time:</w:t>
+            </w:r>
+          </w:p>
+        </w:tc>
+        <w:tc>
+          <w:tcPr>
+            <w:tcW w:type="dxa" w:w="5040"/>
+            <w:shd w:val="clear" w:color="auto" w:fill="FFFFFF"/>
+            <w:tcMar>
+              <w:top w:w="144" w:type="dxa"/>
+              <w:left w:w="144" w:type="dxa"/>
+              <w:bottom w:w="144" w:type="dxa"/>
+              <w:right w:w="144" w:type="dxa"/>
+            </w:tcMar>
+          </w:tcPr>
+          <w:p>
+            <w:pPr>
+              <w:spacing w:before="80" w:after="0"/>
+              <w:jc w:val="left"/>
+            </w:pPr>
+            <w:r>
+              <w:rPr>
+                <w:b/>
+                <w:color w:val="1F3864"/>
+                <w:sz w:val="28"/>
+              </w:rPr>
+              <w:t>Next Class Time:</w:t>
             </w:r>
           </w:p>
         </w:tc>
       </w:tr>
     </w:tbl>
-    <w:p/>
-    <w:p>
-      <w:pPr>
-        <w:jc w:val="center"/>
-      </w:pPr>
-      <w:r>
-        <w:rPr>
-          <w:i/>
-          <w:color w:val="888899"/>
-          <w:sz w:val="18"/>
-        </w:rPr>
-        <w:t>Write next class start time in each box using a marker</w:t>
-      </w:r>
-    </w:p>
     <w:sectPr>
       <w:pgSz w:w="12240" w:h="15840"/>
       <w:pgMar w:top="720" w:right="1080" w:bottom="720" w:left="1080" w:header="720" w:footer="720" w:gutter="0"/>
@@ -1285,6 +2813,9 @@
     <w:name w:val="Normal"/>
     <w:qFormat/>
     <w:rsid w:val="00FC693F"/>
+    <w:pPr>
+      <w:spacing w:before="0" w:after="0"/>
+    </w:pPr>
   </w:style>
   <w:style w:type="paragraph" w:styleId="Header">
     <w:name w:val="header"/>

</xml_diff>

<commit_message>
Remove hint text from Mini Class Schedule Board
https://claude.ai/code/session_01VoVEzvcU4hiUyxQHXSMquq
</commit_message>
<xml_diff>
--- a/Mini_Class_Schedule_Board.docx
+++ b/Mini_Class_Schedule_Board.docx
@@ -50,11 +50,9 @@
           <w:p>
             <w:pPr>
               <w:spacing w:before="80" w:after="40"/>
-              <w:jc w:val="left"/>
             </w:pPr>
             <w:r>
               <w:rPr>
-                <w:b w:val="0"/>
                 <w:sz w:val="28"/>
               </w:rPr>
               <w:t xml:space="preserve">Presenter:  </w:t>
@@ -70,11 +68,9 @@
           <w:p>
             <w:pPr>
               <w:spacing w:before="40" w:after="80"/>
-              <w:jc w:val="left"/>
             </w:pPr>
             <w:r>
               <w:rPr>
-                <w:b w:val="0"/>
                 <w:sz w:val="28"/>
               </w:rPr>
               <w:t xml:space="preserve">Location:  </w:t>
@@ -92,17 +88,8 @@
     </w:tbl>
     <w:p>
       <w:pPr>
-        <w:spacing w:before="160" w:after="80"/>
-        <w:jc w:val="center"/>
+        <w:spacing w:before="280" w:after="80"/>
       </w:pPr>
-      <w:r>
-        <w:rPr>
-          <w:i/>
-          <w:color w:val="606060"/>
-          <w:sz w:val="20"/>
-        </w:rPr>
-        <w:t>Write next class start time in each box using a marker</w:t>
-      </w:r>
     </w:p>
     <w:tbl>
       <w:tblPr>
@@ -141,7 +128,6 @@
           <w:p>
             <w:pPr>
               <w:spacing w:before="80" w:after="0"/>
-              <w:jc w:val="left"/>
             </w:pPr>
             <w:r>
               <w:rPr>
@@ -167,7 +153,6 @@
           <w:p>
             <w:pPr>
               <w:spacing w:before="80" w:after="0"/>
-              <w:jc w:val="left"/>
             </w:pPr>
             <w:r>
               <w:rPr>
@@ -198,7 +183,6 @@
           <w:p>
             <w:pPr>
               <w:spacing w:before="80" w:after="0"/>
-              <w:jc w:val="left"/>
             </w:pPr>
             <w:r>
               <w:rPr>
@@ -224,7 +208,6 @@
           <w:p>
             <w:pPr>
               <w:spacing w:before="80" w:after="0"/>
-              <w:jc w:val="left"/>
             </w:pPr>
             <w:r>
               <w:rPr>
@@ -255,7 +238,6 @@
           <w:p>
             <w:pPr>
               <w:spacing w:before="80" w:after="0"/>
-              <w:jc w:val="left"/>
             </w:pPr>
             <w:r>
               <w:rPr>
@@ -281,7 +263,6 @@
           <w:p>
             <w:pPr>
               <w:spacing w:before="80" w:after="0"/>
-              <w:jc w:val="left"/>
             </w:pPr>
             <w:r>
               <w:rPr>
@@ -353,11 +334,9 @@
           <w:p>
             <w:pPr>
               <w:spacing w:before="80" w:after="40"/>
-              <w:jc w:val="left"/>
             </w:pPr>
             <w:r>
               <w:rPr>
-                <w:b w:val="0"/>
                 <w:sz w:val="28"/>
               </w:rPr>
               <w:t xml:space="preserve">Presenter:  </w:t>
@@ -373,11 +352,9 @@
           <w:p>
             <w:pPr>
               <w:spacing w:before="40" w:after="80"/>
-              <w:jc w:val="left"/>
             </w:pPr>
             <w:r>
               <w:rPr>
-                <w:b w:val="0"/>
                 <w:sz w:val="28"/>
               </w:rPr>
               <w:t xml:space="preserve">Location:  </w:t>
@@ -395,17 +372,8 @@
     </w:tbl>
     <w:p>
       <w:pPr>
-        <w:spacing w:before="160" w:after="80"/>
-        <w:jc w:val="center"/>
+        <w:spacing w:before="280" w:after="80"/>
       </w:pPr>
-      <w:r>
-        <w:rPr>
-          <w:i/>
-          <w:color w:val="606060"/>
-          <w:sz w:val="20"/>
-        </w:rPr>
-        <w:t>Write next class start time in each box using a marker</w:t>
-      </w:r>
     </w:p>
     <w:tbl>
       <w:tblPr>
@@ -444,7 +412,6 @@
           <w:p>
             <w:pPr>
               <w:spacing w:before="80" w:after="0"/>
-              <w:jc w:val="left"/>
             </w:pPr>
             <w:r>
               <w:rPr>
@@ -470,7 +437,6 @@
           <w:p>
             <w:pPr>
               <w:spacing w:before="80" w:after="0"/>
-              <w:jc w:val="left"/>
             </w:pPr>
             <w:r>
               <w:rPr>
@@ -501,7 +467,6 @@
           <w:p>
             <w:pPr>
               <w:spacing w:before="80" w:after="0"/>
-              <w:jc w:val="left"/>
             </w:pPr>
             <w:r>
               <w:rPr>
@@ -527,7 +492,6 @@
           <w:p>
             <w:pPr>
               <w:spacing w:before="80" w:after="0"/>
-              <w:jc w:val="left"/>
             </w:pPr>
             <w:r>
               <w:rPr>
@@ -558,7 +522,6 @@
           <w:p>
             <w:pPr>
               <w:spacing w:before="80" w:after="0"/>
-              <w:jc w:val="left"/>
             </w:pPr>
             <w:r>
               <w:rPr>
@@ -584,7 +547,6 @@
           <w:p>
             <w:pPr>
               <w:spacing w:before="80" w:after="0"/>
-              <w:jc w:val="left"/>
             </w:pPr>
             <w:r>
               <w:rPr>
@@ -654,11 +616,9 @@
           <w:p>
             <w:pPr>
               <w:spacing w:before="80" w:after="40"/>
-              <w:jc w:val="left"/>
             </w:pPr>
             <w:r>
               <w:rPr>
-                <w:b w:val="0"/>
                 <w:sz w:val="28"/>
               </w:rPr>
               <w:t xml:space="preserve">Presenter:  </w:t>
@@ -676,11 +636,9 @@
           <w:p>
             <w:pPr>
               <w:spacing w:before="40" w:after="80"/>
-              <w:jc w:val="left"/>
             </w:pPr>
             <w:r>
               <w:rPr>
-                <w:b w:val="0"/>
                 <w:sz w:val="28"/>
               </w:rPr>
               <w:t xml:space="preserve">Location:  </w:t>
@@ -698,17 +656,8 @@
     </w:tbl>
     <w:p>
       <w:pPr>
-        <w:spacing w:before="160" w:after="80"/>
-        <w:jc w:val="center"/>
+        <w:spacing w:before="280" w:after="80"/>
       </w:pPr>
-      <w:r>
-        <w:rPr>
-          <w:i/>
-          <w:color w:val="606060"/>
-          <w:sz w:val="20"/>
-        </w:rPr>
-        <w:t>Write next class start time in each box using a marker</w:t>
-      </w:r>
     </w:p>
     <w:tbl>
       <w:tblPr>
@@ -747,7 +696,6 @@
           <w:p>
             <w:pPr>
               <w:spacing w:before="80" w:after="0"/>
-              <w:jc w:val="left"/>
             </w:pPr>
             <w:r>
               <w:rPr>
@@ -773,7 +721,6 @@
           <w:p>
             <w:pPr>
               <w:spacing w:before="80" w:after="0"/>
-              <w:jc w:val="left"/>
             </w:pPr>
             <w:r>
               <w:rPr>
@@ -804,7 +751,6 @@
           <w:p>
             <w:pPr>
               <w:spacing w:before="80" w:after="0"/>
-              <w:jc w:val="left"/>
             </w:pPr>
             <w:r>
               <w:rPr>
@@ -830,7 +776,6 @@
           <w:p>
             <w:pPr>
               <w:spacing w:before="80" w:after="0"/>
-              <w:jc w:val="left"/>
             </w:pPr>
             <w:r>
               <w:rPr>
@@ -861,7 +806,6 @@
           <w:p>
             <w:pPr>
               <w:spacing w:before="80" w:after="0"/>
-              <w:jc w:val="left"/>
             </w:pPr>
             <w:r>
               <w:rPr>
@@ -887,7 +831,6 @@
           <w:p>
             <w:pPr>
               <w:spacing w:before="80" w:after="0"/>
-              <w:jc w:val="left"/>
             </w:pPr>
             <w:r>
               <w:rPr>
@@ -957,11 +900,9 @@
           <w:p>
             <w:pPr>
               <w:spacing w:before="80" w:after="40"/>
-              <w:jc w:val="left"/>
             </w:pPr>
             <w:r>
               <w:rPr>
-                <w:b w:val="0"/>
                 <w:sz w:val="28"/>
               </w:rPr>
               <w:t xml:space="preserve">Presenter:  </w:t>
@@ -977,11 +918,9 @@
           <w:p>
             <w:pPr>
               <w:spacing w:before="40" w:after="80"/>
-              <w:jc w:val="left"/>
             </w:pPr>
             <w:r>
               <w:rPr>
-                <w:b w:val="0"/>
                 <w:sz w:val="28"/>
               </w:rPr>
               <w:t xml:space="preserve">Location:  </w:t>
@@ -999,17 +938,8 @@
     </w:tbl>
     <w:p>
       <w:pPr>
-        <w:spacing w:before="160" w:after="80"/>
-        <w:jc w:val="center"/>
+        <w:spacing w:before="280" w:after="80"/>
       </w:pPr>
-      <w:r>
-        <w:rPr>
-          <w:i/>
-          <w:color w:val="606060"/>
-          <w:sz w:val="20"/>
-        </w:rPr>
-        <w:t>Write next class start time in each box using a marker</w:t>
-      </w:r>
     </w:p>
     <w:tbl>
       <w:tblPr>
@@ -1048,7 +978,6 @@
           <w:p>
             <w:pPr>
               <w:spacing w:before="80" w:after="0"/>
-              <w:jc w:val="left"/>
             </w:pPr>
             <w:r>
               <w:rPr>
@@ -1074,7 +1003,6 @@
           <w:p>
             <w:pPr>
               <w:spacing w:before="80" w:after="0"/>
-              <w:jc w:val="left"/>
             </w:pPr>
             <w:r>
               <w:rPr>
@@ -1105,7 +1033,6 @@
           <w:p>
             <w:pPr>
               <w:spacing w:before="80" w:after="0"/>
-              <w:jc w:val="left"/>
             </w:pPr>
             <w:r>
               <w:rPr>
@@ -1131,7 +1058,6 @@
           <w:p>
             <w:pPr>
               <w:spacing w:before="80" w:after="0"/>
-              <w:jc w:val="left"/>
             </w:pPr>
             <w:r>
               <w:rPr>
@@ -1162,7 +1088,6 @@
           <w:p>
             <w:pPr>
               <w:spacing w:before="80" w:after="0"/>
-              <w:jc w:val="left"/>
             </w:pPr>
             <w:r>
               <w:rPr>
@@ -1188,7 +1113,6 @@
           <w:p>
             <w:pPr>
               <w:spacing w:before="80" w:after="0"/>
-              <w:jc w:val="left"/>
             </w:pPr>
             <w:r>
               <w:rPr>
@@ -1258,11 +1182,9 @@
           <w:p>
             <w:pPr>
               <w:spacing w:before="20" w:after="80"/>
-              <w:jc w:val="left"/>
             </w:pPr>
             <w:r>
               <w:rPr>
-                <w:b w:val="0"/>
                 <w:i/>
                 <w:color w:val="1F3864"/>
                 <w:sz w:val="28"/>
@@ -1273,11 +1195,9 @@
           <w:p>
             <w:pPr>
               <w:spacing w:before="80" w:after="40"/>
-              <w:jc w:val="left"/>
             </w:pPr>
             <w:r>
               <w:rPr>
-                <w:b w:val="0"/>
                 <w:sz w:val="28"/>
               </w:rPr>
               <w:t xml:space="preserve">Presenter:  </w:t>
@@ -1293,11 +1213,9 @@
           <w:p>
             <w:pPr>
               <w:spacing w:before="40" w:after="80"/>
-              <w:jc w:val="left"/>
             </w:pPr>
             <w:r>
               <w:rPr>
-                <w:b w:val="0"/>
                 <w:sz w:val="28"/>
               </w:rPr>
               <w:t xml:space="preserve">Location:  </w:t>
@@ -1315,17 +1233,8 @@
     </w:tbl>
     <w:p>
       <w:pPr>
-        <w:spacing w:before="160" w:after="80"/>
-        <w:jc w:val="center"/>
+        <w:spacing w:before="280" w:after="80"/>
       </w:pPr>
-      <w:r>
-        <w:rPr>
-          <w:i/>
-          <w:color w:val="606060"/>
-          <w:sz w:val="20"/>
-        </w:rPr>
-        <w:t>Write next class start time in each box using a marker</w:t>
-      </w:r>
     </w:p>
     <w:tbl>
       <w:tblPr>
@@ -1364,7 +1273,6 @@
           <w:p>
             <w:pPr>
               <w:spacing w:before="80" w:after="0"/>
-              <w:jc w:val="left"/>
             </w:pPr>
             <w:r>
               <w:rPr>
@@ -1390,7 +1298,6 @@
           <w:p>
             <w:pPr>
               <w:spacing w:before="80" w:after="0"/>
-              <w:jc w:val="left"/>
             </w:pPr>
             <w:r>
               <w:rPr>
@@ -1421,7 +1328,6 @@
           <w:p>
             <w:pPr>
               <w:spacing w:before="80" w:after="0"/>
-              <w:jc w:val="left"/>
             </w:pPr>
             <w:r>
               <w:rPr>
@@ -1447,7 +1353,6 @@
           <w:p>
             <w:pPr>
               <w:spacing w:before="80" w:after="0"/>
-              <w:jc w:val="left"/>
             </w:pPr>
             <w:r>
               <w:rPr>
@@ -1478,7 +1383,6 @@
           <w:p>
             <w:pPr>
               <w:spacing w:before="80" w:after="0"/>
-              <w:jc w:val="left"/>
             </w:pPr>
             <w:r>
               <w:rPr>
@@ -1504,7 +1408,6 @@
           <w:p>
             <w:pPr>
               <w:spacing w:before="80" w:after="0"/>
-              <w:jc w:val="left"/>
             </w:pPr>
             <w:r>
               <w:rPr>
@@ -1574,11 +1477,9 @@
           <w:p>
             <w:pPr>
               <w:spacing w:before="80" w:after="40"/>
-              <w:jc w:val="left"/>
             </w:pPr>
             <w:r>
               <w:rPr>
-                <w:b w:val="0"/>
                 <w:sz w:val="28"/>
               </w:rPr>
               <w:t xml:space="preserve">Presenter:  </w:t>
@@ -1594,11 +1495,9 @@
           <w:p>
             <w:pPr>
               <w:spacing w:before="40" w:after="80"/>
-              <w:jc w:val="left"/>
             </w:pPr>
             <w:r>
               <w:rPr>
-                <w:b w:val="0"/>
                 <w:sz w:val="28"/>
               </w:rPr>
               <w:t xml:space="preserve">Location:  </w:t>
@@ -1616,17 +1515,8 @@
     </w:tbl>
     <w:p>
       <w:pPr>
-        <w:spacing w:before="160" w:after="80"/>
-        <w:jc w:val="center"/>
+        <w:spacing w:before="280" w:after="80"/>
       </w:pPr>
-      <w:r>
-        <w:rPr>
-          <w:i/>
-          <w:color w:val="606060"/>
-          <w:sz w:val="20"/>
-        </w:rPr>
-        <w:t>Write next class start time in each box using a marker</w:t>
-      </w:r>
     </w:p>
     <w:tbl>
       <w:tblPr>
@@ -1665,7 +1555,6 @@
           <w:p>
             <w:pPr>
               <w:spacing w:before="80" w:after="0"/>
-              <w:jc w:val="left"/>
             </w:pPr>
             <w:r>
               <w:rPr>
@@ -1691,7 +1580,6 @@
           <w:p>
             <w:pPr>
               <w:spacing w:before="80" w:after="0"/>
-              <w:jc w:val="left"/>
             </w:pPr>
             <w:r>
               <w:rPr>
@@ -1722,7 +1610,6 @@
           <w:p>
             <w:pPr>
               <w:spacing w:before="80" w:after="0"/>
-              <w:jc w:val="left"/>
             </w:pPr>
             <w:r>
               <w:rPr>
@@ -1748,7 +1635,6 @@
           <w:p>
             <w:pPr>
               <w:spacing w:before="80" w:after="0"/>
-              <w:jc w:val="left"/>
             </w:pPr>
             <w:r>
               <w:rPr>
@@ -1779,7 +1665,6 @@
           <w:p>
             <w:pPr>
               <w:spacing w:before="80" w:after="0"/>
-              <w:jc w:val="left"/>
             </w:pPr>
             <w:r>
               <w:rPr>
@@ -1805,7 +1690,6 @@
           <w:p>
             <w:pPr>
               <w:spacing w:before="80" w:after="0"/>
-              <w:jc w:val="left"/>
             </w:pPr>
             <w:r>
               <w:rPr>
@@ -1875,11 +1759,9 @@
           <w:p>
             <w:pPr>
               <w:spacing w:before="20" w:after="80"/>
-              <w:jc w:val="left"/>
             </w:pPr>
             <w:r>
               <w:rPr>
-                <w:b w:val="0"/>
                 <w:i/>
                 <w:color w:val="1F3864"/>
                 <w:sz w:val="28"/>
@@ -1890,11 +1772,9 @@
           <w:p>
             <w:pPr>
               <w:spacing w:before="80" w:after="40"/>
-              <w:jc w:val="left"/>
             </w:pPr>
             <w:r>
               <w:rPr>
-                <w:b w:val="0"/>
                 <w:sz w:val="28"/>
               </w:rPr>
               <w:t xml:space="preserve">Presenter:  </w:t>
@@ -1910,11 +1790,9 @@
           <w:p>
             <w:pPr>
               <w:spacing w:before="40" w:after="80"/>
-              <w:jc w:val="left"/>
             </w:pPr>
             <w:r>
               <w:rPr>
-                <w:b w:val="0"/>
                 <w:sz w:val="28"/>
               </w:rPr>
               <w:t xml:space="preserve">Location:  </w:t>
@@ -1932,17 +1810,8 @@
     </w:tbl>
     <w:p>
       <w:pPr>
-        <w:spacing w:before="160" w:after="80"/>
-        <w:jc w:val="center"/>
+        <w:spacing w:before="280" w:after="80"/>
       </w:pPr>
-      <w:r>
-        <w:rPr>
-          <w:i/>
-          <w:color w:val="606060"/>
-          <w:sz w:val="20"/>
-        </w:rPr>
-        <w:t>Write next class start time in each box using a marker</w:t>
-      </w:r>
     </w:p>
     <w:tbl>
       <w:tblPr>
@@ -1981,7 +1850,6 @@
           <w:p>
             <w:pPr>
               <w:spacing w:before="80" w:after="0"/>
-              <w:jc w:val="left"/>
             </w:pPr>
             <w:r>
               <w:rPr>
@@ -2007,7 +1875,6 @@
           <w:p>
             <w:pPr>
               <w:spacing w:before="80" w:after="0"/>
-              <w:jc w:val="left"/>
             </w:pPr>
             <w:r>
               <w:rPr>
@@ -2038,7 +1905,6 @@
           <w:p>
             <w:pPr>
               <w:spacing w:before="80" w:after="0"/>
-              <w:jc w:val="left"/>
             </w:pPr>
             <w:r>
               <w:rPr>
@@ -2064,7 +1930,6 @@
           <w:p>
             <w:pPr>
               <w:spacing w:before="80" w:after="0"/>
-              <w:jc w:val="left"/>
             </w:pPr>
             <w:r>
               <w:rPr>
@@ -2095,7 +1960,6 @@
           <w:p>
             <w:pPr>
               <w:spacing w:before="80" w:after="0"/>
-              <w:jc w:val="left"/>
             </w:pPr>
             <w:r>
               <w:rPr>
@@ -2121,7 +1985,6 @@
           <w:p>
             <w:pPr>
               <w:spacing w:before="80" w:after="0"/>
-              <w:jc w:val="left"/>
             </w:pPr>
             <w:r>
               <w:rPr>
@@ -2193,11 +2056,9 @@
           <w:p>
             <w:pPr>
               <w:spacing w:before="80" w:after="40"/>
-              <w:jc w:val="left"/>
             </w:pPr>
             <w:r>
               <w:rPr>
-                <w:b w:val="0"/>
                 <w:sz w:val="28"/>
               </w:rPr>
               <w:t xml:space="preserve">Presenter:  </w:t>
@@ -2215,11 +2076,9 @@
           <w:p>
             <w:pPr>
               <w:spacing w:before="40" w:after="80"/>
-              <w:jc w:val="left"/>
             </w:pPr>
             <w:r>
               <w:rPr>
-                <w:b w:val="0"/>
                 <w:sz w:val="28"/>
               </w:rPr>
               <w:t xml:space="preserve">Location:  </w:t>
@@ -2237,17 +2096,8 @@
     </w:tbl>
     <w:p>
       <w:pPr>
-        <w:spacing w:before="160" w:after="80"/>
-        <w:jc w:val="center"/>
+        <w:spacing w:before="280" w:after="80"/>
       </w:pPr>
-      <w:r>
-        <w:rPr>
-          <w:i/>
-          <w:color w:val="606060"/>
-          <w:sz w:val="20"/>
-        </w:rPr>
-        <w:t>Write next class start time in each box using a marker</w:t>
-      </w:r>
     </w:p>
     <w:tbl>
       <w:tblPr>
@@ -2286,7 +2136,6 @@
           <w:p>
             <w:pPr>
               <w:spacing w:before="80" w:after="0"/>
-              <w:jc w:val="left"/>
             </w:pPr>
             <w:r>
               <w:rPr>
@@ -2312,7 +2161,6 @@
           <w:p>
             <w:pPr>
               <w:spacing w:before="80" w:after="0"/>
-              <w:jc w:val="left"/>
             </w:pPr>
             <w:r>
               <w:rPr>
@@ -2343,7 +2191,6 @@
           <w:p>
             <w:pPr>
               <w:spacing w:before="80" w:after="0"/>
-              <w:jc w:val="left"/>
             </w:pPr>
             <w:r>
               <w:rPr>
@@ -2369,7 +2216,6 @@
           <w:p>
             <w:pPr>
               <w:spacing w:before="80" w:after="0"/>
-              <w:jc w:val="left"/>
             </w:pPr>
             <w:r>
               <w:rPr>
@@ -2400,7 +2246,6 @@
           <w:p>
             <w:pPr>
               <w:spacing w:before="80" w:after="0"/>
-              <w:jc w:val="left"/>
             </w:pPr>
             <w:r>
               <w:rPr>
@@ -2426,7 +2271,6 @@
           <w:p>
             <w:pPr>
               <w:spacing w:before="80" w:after="0"/>
-              <w:jc w:val="left"/>
             </w:pPr>
             <w:r>
               <w:rPr>

</xml_diff>

<commit_message>
Revise Mini Class Schedule Board per feedback
- President Edwin Wells: remove presenter line, 4 copies
- Use AI to Bring Your Ancestors to Life: 2 copies
- Kristin & Kevin: add "President" title
- Jason Flaig & Employment Missionary: fit parenthetical on same line
- Topic lines bold: "Organizing Vital Documents", "What happened..."
- Next Class Time: 6 full-width bars stacked (single column) per page
- Info box and bars same full content width

https://claude.ai/code/session_01VoVEzvcU4hiUyxQHXSMquq
</commit_message>
<xml_diff>
--- a/Mini_Class_Schedule_Board.docx
+++ b/Mini_Class_Schedule_Board.docx
@@ -27,20 +27,20 @@
             <w:vAlign w:val="center"/>
             <w:shd w:val="clear" w:color="auto" w:fill="D9E1F2"/>
             <w:tcMar>
-              <w:top w:w="180" w:type="dxa"/>
-              <w:left w:w="180" w:type="dxa"/>
-              <w:bottom w:w="180" w:type="dxa"/>
-              <w:right w:w="180" w:type="dxa"/>
+              <w:top w:w="144" w:type="dxa"/>
+              <w:left w:w="144" w:type="dxa"/>
+              <w:bottom w:w="144" w:type="dxa"/>
+              <w:right w:w="144" w:type="dxa"/>
             </w:tcMar>
           </w:tcPr>
           <w:p>
             <w:pPr>
-              <w:spacing w:before="40" w:after="40"/>
-              <w:jc w:val="left"/>
+              <w:spacing w:before="80" w:after="80"/>
             </w:pPr>
             <w:r>
               <w:rPr>
                 <w:b/>
+                <w:i w:val="0"/>
                 <w:color w:val="1F3864"/>
                 <w:sz w:val="44"/>
               </w:rPr>
@@ -49,28 +49,12 @@
           </w:p>
           <w:p>
             <w:pPr>
-              <w:spacing w:before="80" w:after="40"/>
+              <w:spacing w:before="60" w:after="120"/>
             </w:pPr>
             <w:r>
               <w:rPr>
-                <w:sz w:val="28"/>
-              </w:rPr>
-              <w:t xml:space="preserve">Presenter:  </w:t>
-            </w:r>
-            <w:r>
-              <w:rPr>
-                <w:b/>
-                <w:sz w:val="28"/>
-              </w:rPr>
-              <w:t>Stake President Edwin Wells</w:t>
-            </w:r>
-          </w:p>
-          <w:p>
-            <w:pPr>
-              <w:spacing w:before="40" w:after="80"/>
-            </w:pPr>
-            <w:r>
-              <w:rPr>
+                <w:b w:val="0"/>
+                <w:i w:val="0"/>
                 <w:sz w:val="28"/>
               </w:rPr>
               <w:t xml:space="preserve">Location:  </w:t>
@@ -78,6 +62,7 @@
             <w:r>
               <w:rPr>
                 <w:b/>
+                <w:i w:val="0"/>
                 <w:sz w:val="28"/>
               </w:rPr>
               <w:t>Chapel</w:t>
@@ -88,7 +73,7 @@
     </w:tbl>
     <w:p>
       <w:pPr>
-        <w:spacing w:before="280" w:after="80"/>
+        <w:spacing w:before="200" w:after="80"/>
       </w:pPr>
     </w:p>
     <w:tbl>
@@ -107,16 +92,15 @@
         </w:tblBorders>
       </w:tblPr>
       <w:tblGrid>
-        <w:gridCol w:w="5040"/>
-        <w:gridCol w:w="5040"/>
+        <w:gridCol w:w="10080"/>
       </w:tblGrid>
       <w:tr>
         <w:trPr>
-          <w:trHeight w:val="1200" w:hRule="atLeast"/>
+          <w:trHeight w:val="1109" w:hRule="atLeast"/>
         </w:trPr>
         <w:tc>
           <w:tcPr>
-            <w:tcW w:type="dxa" w:w="5040"/>
+            <w:tcW w:type="dxa" w:w="10080"/>
             <w:shd w:val="clear" w:color="auto" w:fill="FFFFFF"/>
             <w:tcMar>
               <w:top w:w="144" w:type="dxa"/>
@@ -132,6 +116,7 @@
             <w:r>
               <w:rPr>
                 <w:b/>
+                <w:i w:val="0"/>
                 <w:color w:val="1F3864"/>
                 <w:sz w:val="28"/>
               </w:rPr>
@@ -139,9 +124,14 @@
             </w:r>
           </w:p>
         </w:tc>
+      </w:tr>
+      <w:tr>
+        <w:trPr>
+          <w:trHeight w:val="1109" w:hRule="atLeast"/>
+        </w:trPr>
         <w:tc>
           <w:tcPr>
-            <w:tcW w:type="dxa" w:w="5040"/>
+            <w:tcW w:type="dxa" w:w="10080"/>
             <w:shd w:val="clear" w:color="auto" w:fill="FFFFFF"/>
             <w:tcMar>
               <w:top w:w="144" w:type="dxa"/>
@@ -157,6 +147,7 @@
             <w:r>
               <w:rPr>
                 <w:b/>
+                <w:i w:val="0"/>
                 <w:color w:val="1F3864"/>
                 <w:sz w:val="28"/>
               </w:rPr>
@@ -167,11 +158,11 @@
       </w:tr>
       <w:tr>
         <w:trPr>
-          <w:trHeight w:val="1200" w:hRule="atLeast"/>
+          <w:trHeight w:val="1109" w:hRule="atLeast"/>
         </w:trPr>
         <w:tc>
           <w:tcPr>
-            <w:tcW w:type="dxa" w:w="5040"/>
+            <w:tcW w:type="dxa" w:w="10080"/>
             <w:shd w:val="clear" w:color="auto" w:fill="FFFFFF"/>
             <w:tcMar>
               <w:top w:w="144" w:type="dxa"/>
@@ -187,6 +178,7 @@
             <w:r>
               <w:rPr>
                 <w:b/>
+                <w:i w:val="0"/>
                 <w:color w:val="1F3864"/>
                 <w:sz w:val="28"/>
               </w:rPr>
@@ -194,9 +186,14 @@
             </w:r>
           </w:p>
         </w:tc>
+      </w:tr>
+      <w:tr>
+        <w:trPr>
+          <w:trHeight w:val="1109" w:hRule="atLeast"/>
+        </w:trPr>
         <w:tc>
           <w:tcPr>
-            <w:tcW w:type="dxa" w:w="5040"/>
+            <w:tcW w:type="dxa" w:w="10080"/>
             <w:shd w:val="clear" w:color="auto" w:fill="FFFFFF"/>
             <w:tcMar>
               <w:top w:w="144" w:type="dxa"/>
@@ -212,6 +209,7 @@
             <w:r>
               <w:rPr>
                 <w:b/>
+                <w:i w:val="0"/>
                 <w:color w:val="1F3864"/>
                 <w:sz w:val="28"/>
               </w:rPr>
@@ -222,11 +220,11 @@
       </w:tr>
       <w:tr>
         <w:trPr>
-          <w:trHeight w:val="1200" w:hRule="atLeast"/>
+          <w:trHeight w:val="1109" w:hRule="atLeast"/>
         </w:trPr>
         <w:tc>
           <w:tcPr>
-            <w:tcW w:type="dxa" w:w="5040"/>
+            <w:tcW w:type="dxa" w:w="10080"/>
             <w:shd w:val="clear" w:color="auto" w:fill="FFFFFF"/>
             <w:tcMar>
               <w:top w:w="144" w:type="dxa"/>
@@ -242,6 +240,7 @@
             <w:r>
               <w:rPr>
                 <w:b/>
+                <w:i w:val="0"/>
                 <w:color w:val="1F3864"/>
                 <w:sz w:val="28"/>
               </w:rPr>
@@ -249,9 +248,14 @@
             </w:r>
           </w:p>
         </w:tc>
+      </w:tr>
+      <w:tr>
+        <w:trPr>
+          <w:trHeight w:val="1109" w:hRule="atLeast"/>
+        </w:trPr>
         <w:tc>
           <w:tcPr>
-            <w:tcW w:type="dxa" w:w="5040"/>
+            <w:tcW w:type="dxa" w:w="10080"/>
             <w:shd w:val="clear" w:color="auto" w:fill="FFFFFF"/>
             <w:tcMar>
               <w:top w:w="144" w:type="dxa"/>
@@ -267,6 +271,7 @@
             <w:r>
               <w:rPr>
                 <w:b/>
+                <w:i w:val="0"/>
                 <w:color w:val="1F3864"/>
                 <w:sz w:val="28"/>
               </w:rPr>
@@ -309,52 +314,34 @@
             <w:vAlign w:val="center"/>
             <w:shd w:val="clear" w:color="auto" w:fill="D9E1F2"/>
             <w:tcMar>
-              <w:top w:w="180" w:type="dxa"/>
-              <w:left w:w="180" w:type="dxa"/>
-              <w:bottom w:w="180" w:type="dxa"/>
-              <w:right w:w="180" w:type="dxa"/>
+              <w:top w:w="144" w:type="dxa"/>
+              <w:left w:w="144" w:type="dxa"/>
+              <w:bottom w:w="144" w:type="dxa"/>
+              <w:right w:w="144" w:type="dxa"/>
             </w:tcMar>
           </w:tcPr>
           <w:p>
             <w:pPr>
-              <w:spacing w:before="40" w:after="40"/>
-              <w:jc w:val="left"/>
+              <w:spacing w:before="80" w:after="80"/>
             </w:pPr>
             <w:r>
               <w:rPr>
                 <w:b/>
+                <w:i w:val="0"/>
                 <w:color w:val="1F3864"/>
                 <w:sz w:val="44"/>
               </w:rPr>
-              <w:t>Spiritual Survival and the Holy Ghost:</w:t>
-              <w:br/>
-              <w:t>Preparing Your Family</w:t>
+              <w:t>President Edwin Wells</w:t>
             </w:r>
           </w:p>
           <w:p>
             <w:pPr>
-              <w:spacing w:before="80" w:after="40"/>
+              <w:spacing w:before="60" w:after="120"/>
             </w:pPr>
             <w:r>
               <w:rPr>
-                <w:sz w:val="28"/>
-              </w:rPr>
-              <w:t xml:space="preserve">Presenter:  </w:t>
-            </w:r>
-            <w:r>
-              <w:rPr>
-                <w:b/>
-                <w:sz w:val="28"/>
-              </w:rPr>
-              <w:t>Kristin &amp; Kevin Galbraith</w:t>
-            </w:r>
-          </w:p>
-          <w:p>
-            <w:pPr>
-              <w:spacing w:before="40" w:after="80"/>
-            </w:pPr>
-            <w:r>
-              <w:rPr>
+                <w:b w:val="0"/>
+                <w:i w:val="0"/>
                 <w:sz w:val="28"/>
               </w:rPr>
               <w:t xml:space="preserve">Location:  </w:t>
@@ -362,9 +349,10 @@
             <w:r>
               <w:rPr>
                 <w:b/>
+                <w:i w:val="0"/>
                 <w:sz w:val="28"/>
               </w:rPr>
-              <w:t>High Council Room</w:t>
+              <w:t>Chapel</w:t>
             </w:r>
           </w:p>
         </w:tc>
@@ -372,7 +360,7 @@
     </w:tbl>
     <w:p>
       <w:pPr>
-        <w:spacing w:before="280" w:after="80"/>
+        <w:spacing w:before="200" w:after="80"/>
       </w:pPr>
     </w:p>
     <w:tbl>
@@ -391,16 +379,15 @@
         </w:tblBorders>
       </w:tblPr>
       <w:tblGrid>
-        <w:gridCol w:w="5040"/>
-        <w:gridCol w:w="5040"/>
+        <w:gridCol w:w="10080"/>
       </w:tblGrid>
       <w:tr>
         <w:trPr>
-          <w:trHeight w:val="1200" w:hRule="atLeast"/>
+          <w:trHeight w:val="1109" w:hRule="atLeast"/>
         </w:trPr>
         <w:tc>
           <w:tcPr>
-            <w:tcW w:type="dxa" w:w="5040"/>
+            <w:tcW w:type="dxa" w:w="10080"/>
             <w:shd w:val="clear" w:color="auto" w:fill="FFFFFF"/>
             <w:tcMar>
               <w:top w:w="144" w:type="dxa"/>
@@ -416,6 +403,7 @@
             <w:r>
               <w:rPr>
                 <w:b/>
+                <w:i w:val="0"/>
                 <w:color w:val="1F3864"/>
                 <w:sz w:val="28"/>
               </w:rPr>
@@ -423,9 +411,14 @@
             </w:r>
           </w:p>
         </w:tc>
+      </w:tr>
+      <w:tr>
+        <w:trPr>
+          <w:trHeight w:val="1109" w:hRule="atLeast"/>
+        </w:trPr>
         <w:tc>
           <w:tcPr>
-            <w:tcW w:type="dxa" w:w="5040"/>
+            <w:tcW w:type="dxa" w:w="10080"/>
             <w:shd w:val="clear" w:color="auto" w:fill="FFFFFF"/>
             <w:tcMar>
               <w:top w:w="144" w:type="dxa"/>
@@ -441,6 +434,7 @@
             <w:r>
               <w:rPr>
                 <w:b/>
+                <w:i w:val="0"/>
                 <w:color w:val="1F3864"/>
                 <w:sz w:val="28"/>
               </w:rPr>
@@ -451,11 +445,11 @@
       </w:tr>
       <w:tr>
         <w:trPr>
-          <w:trHeight w:val="1200" w:hRule="atLeast"/>
+          <w:trHeight w:val="1109" w:hRule="atLeast"/>
         </w:trPr>
         <w:tc>
           <w:tcPr>
-            <w:tcW w:type="dxa" w:w="5040"/>
+            <w:tcW w:type="dxa" w:w="10080"/>
             <w:shd w:val="clear" w:color="auto" w:fill="FFFFFF"/>
             <w:tcMar>
               <w:top w:w="144" w:type="dxa"/>
@@ -471,6 +465,7 @@
             <w:r>
               <w:rPr>
                 <w:b/>
+                <w:i w:val="0"/>
                 <w:color w:val="1F3864"/>
                 <w:sz w:val="28"/>
               </w:rPr>
@@ -478,9 +473,14 @@
             </w:r>
           </w:p>
         </w:tc>
+      </w:tr>
+      <w:tr>
+        <w:trPr>
+          <w:trHeight w:val="1109" w:hRule="atLeast"/>
+        </w:trPr>
         <w:tc>
           <w:tcPr>
-            <w:tcW w:type="dxa" w:w="5040"/>
+            <w:tcW w:type="dxa" w:w="10080"/>
             <w:shd w:val="clear" w:color="auto" w:fill="FFFFFF"/>
             <w:tcMar>
               <w:top w:w="144" w:type="dxa"/>
@@ -496,6 +496,7 @@
             <w:r>
               <w:rPr>
                 <w:b/>
+                <w:i w:val="0"/>
                 <w:color w:val="1F3864"/>
                 <w:sz w:val="28"/>
               </w:rPr>
@@ -506,11 +507,11 @@
       </w:tr>
       <w:tr>
         <w:trPr>
-          <w:trHeight w:val="1200" w:hRule="atLeast"/>
+          <w:trHeight w:val="1109" w:hRule="atLeast"/>
         </w:trPr>
         <w:tc>
           <w:tcPr>
-            <w:tcW w:type="dxa" w:w="5040"/>
+            <w:tcW w:type="dxa" w:w="10080"/>
             <w:shd w:val="clear" w:color="auto" w:fill="FFFFFF"/>
             <w:tcMar>
               <w:top w:w="144" w:type="dxa"/>
@@ -526,6 +527,7 @@
             <w:r>
               <w:rPr>
                 <w:b/>
+                <w:i w:val="0"/>
                 <w:color w:val="1F3864"/>
                 <w:sz w:val="28"/>
               </w:rPr>
@@ -533,9 +535,14 @@
             </w:r>
           </w:p>
         </w:tc>
+      </w:tr>
+      <w:tr>
+        <w:trPr>
+          <w:trHeight w:val="1109" w:hRule="atLeast"/>
+        </w:trPr>
         <w:tc>
           <w:tcPr>
-            <w:tcW w:type="dxa" w:w="5040"/>
+            <w:tcW w:type="dxa" w:w="10080"/>
             <w:shd w:val="clear" w:color="auto" w:fill="FFFFFF"/>
             <w:tcMar>
               <w:top w:w="144" w:type="dxa"/>
@@ -551,6 +558,7 @@
             <w:r>
               <w:rPr>
                 <w:b/>
+                <w:i w:val="0"/>
                 <w:color w:val="1F3864"/>
                 <w:sz w:val="28"/>
               </w:rPr>
@@ -593,52 +601,34 @@
             <w:vAlign w:val="center"/>
             <w:shd w:val="clear" w:color="auto" w:fill="D9E1F2"/>
             <w:tcMar>
-              <w:top w:w="180" w:type="dxa"/>
-              <w:left w:w="180" w:type="dxa"/>
-              <w:bottom w:w="180" w:type="dxa"/>
-              <w:right w:w="180" w:type="dxa"/>
+              <w:top w:w="144" w:type="dxa"/>
+              <w:left w:w="144" w:type="dxa"/>
+              <w:bottom w:w="144" w:type="dxa"/>
+              <w:right w:w="144" w:type="dxa"/>
             </w:tcMar>
           </w:tcPr>
           <w:p>
             <w:pPr>
-              <w:spacing w:before="40" w:after="40"/>
-              <w:jc w:val="left"/>
+              <w:spacing w:before="80" w:after="80"/>
             </w:pPr>
             <w:r>
               <w:rPr>
                 <w:b/>
+                <w:i w:val="0"/>
                 <w:color w:val="1F3864"/>
                 <w:sz w:val="44"/>
               </w:rPr>
-              <w:t>A Safety and Technology Plan Discussion</w:t>
+              <w:t>President Edwin Wells</w:t>
             </w:r>
           </w:p>
           <w:p>
             <w:pPr>
-              <w:spacing w:before="80" w:after="40"/>
+              <w:spacing w:before="60" w:after="120"/>
             </w:pPr>
             <w:r>
               <w:rPr>
-                <w:sz w:val="28"/>
-              </w:rPr>
-              <w:t xml:space="preserve">Presenter:  </w:t>
-            </w:r>
-            <w:r>
-              <w:rPr>
-                <w:b/>
-                <w:sz w:val="28"/>
-              </w:rPr>
-              <w:t>Jason Flaig &amp; Detective Teague</w:t>
-              <w:br/>
-              <w:t>(Madison Sheriff's Office)</w:t>
-            </w:r>
-          </w:p>
-          <w:p>
-            <w:pPr>
-              <w:spacing w:before="40" w:after="80"/>
-            </w:pPr>
-            <w:r>
-              <w:rPr>
+                <w:b w:val="0"/>
+                <w:i w:val="0"/>
                 <w:sz w:val="28"/>
               </w:rPr>
               <w:t xml:space="preserve">Location:  </w:t>
@@ -646,9 +636,10 @@
             <w:r>
               <w:rPr>
                 <w:b/>
+                <w:i w:val="0"/>
                 <w:sz w:val="28"/>
               </w:rPr>
-              <w:t>Relief Society Room</w:t>
+              <w:t>Chapel</w:t>
             </w:r>
           </w:p>
         </w:tc>
@@ -656,7 +647,7 @@
     </w:tbl>
     <w:p>
       <w:pPr>
-        <w:spacing w:before="280" w:after="80"/>
+        <w:spacing w:before="200" w:after="80"/>
       </w:pPr>
     </w:p>
     <w:tbl>
@@ -675,16 +666,15 @@
         </w:tblBorders>
       </w:tblPr>
       <w:tblGrid>
-        <w:gridCol w:w="5040"/>
-        <w:gridCol w:w="5040"/>
+        <w:gridCol w:w="10080"/>
       </w:tblGrid>
       <w:tr>
         <w:trPr>
-          <w:trHeight w:val="1200" w:hRule="atLeast"/>
+          <w:trHeight w:val="1109" w:hRule="atLeast"/>
         </w:trPr>
         <w:tc>
           <w:tcPr>
-            <w:tcW w:type="dxa" w:w="5040"/>
+            <w:tcW w:type="dxa" w:w="10080"/>
             <w:shd w:val="clear" w:color="auto" w:fill="FFFFFF"/>
             <w:tcMar>
               <w:top w:w="144" w:type="dxa"/>
@@ -700,6 +690,7 @@
             <w:r>
               <w:rPr>
                 <w:b/>
+                <w:i w:val="0"/>
                 <w:color w:val="1F3864"/>
                 <w:sz w:val="28"/>
               </w:rPr>
@@ -707,9 +698,14 @@
             </w:r>
           </w:p>
         </w:tc>
+      </w:tr>
+      <w:tr>
+        <w:trPr>
+          <w:trHeight w:val="1109" w:hRule="atLeast"/>
+        </w:trPr>
         <w:tc>
           <w:tcPr>
-            <w:tcW w:type="dxa" w:w="5040"/>
+            <w:tcW w:type="dxa" w:w="10080"/>
             <w:shd w:val="clear" w:color="auto" w:fill="FFFFFF"/>
             <w:tcMar>
               <w:top w:w="144" w:type="dxa"/>
@@ -725,6 +721,7 @@
             <w:r>
               <w:rPr>
                 <w:b/>
+                <w:i w:val="0"/>
                 <w:color w:val="1F3864"/>
                 <w:sz w:val="28"/>
               </w:rPr>
@@ -735,11 +732,11 @@
       </w:tr>
       <w:tr>
         <w:trPr>
-          <w:trHeight w:val="1200" w:hRule="atLeast"/>
+          <w:trHeight w:val="1109" w:hRule="atLeast"/>
         </w:trPr>
         <w:tc>
           <w:tcPr>
-            <w:tcW w:type="dxa" w:w="5040"/>
+            <w:tcW w:type="dxa" w:w="10080"/>
             <w:shd w:val="clear" w:color="auto" w:fill="FFFFFF"/>
             <w:tcMar>
               <w:top w:w="144" w:type="dxa"/>
@@ -755,6 +752,7 @@
             <w:r>
               <w:rPr>
                 <w:b/>
+                <w:i w:val="0"/>
                 <w:color w:val="1F3864"/>
                 <w:sz w:val="28"/>
               </w:rPr>
@@ -762,9 +760,14 @@
             </w:r>
           </w:p>
         </w:tc>
+      </w:tr>
+      <w:tr>
+        <w:trPr>
+          <w:trHeight w:val="1109" w:hRule="atLeast"/>
+        </w:trPr>
         <w:tc>
           <w:tcPr>
-            <w:tcW w:type="dxa" w:w="5040"/>
+            <w:tcW w:type="dxa" w:w="10080"/>
             <w:shd w:val="clear" w:color="auto" w:fill="FFFFFF"/>
             <w:tcMar>
               <w:top w:w="144" w:type="dxa"/>
@@ -780,6 +783,7 @@
             <w:r>
               <w:rPr>
                 <w:b/>
+                <w:i w:val="0"/>
                 <w:color w:val="1F3864"/>
                 <w:sz w:val="28"/>
               </w:rPr>
@@ -790,11 +794,11 @@
       </w:tr>
       <w:tr>
         <w:trPr>
-          <w:trHeight w:val="1200" w:hRule="atLeast"/>
+          <w:trHeight w:val="1109" w:hRule="atLeast"/>
         </w:trPr>
         <w:tc>
           <w:tcPr>
-            <w:tcW w:type="dxa" w:w="5040"/>
+            <w:tcW w:type="dxa" w:w="10080"/>
             <w:shd w:val="clear" w:color="auto" w:fill="FFFFFF"/>
             <w:tcMar>
               <w:top w:w="144" w:type="dxa"/>
@@ -810,6 +814,7 @@
             <w:r>
               <w:rPr>
                 <w:b/>
+                <w:i w:val="0"/>
                 <w:color w:val="1F3864"/>
                 <w:sz w:val="28"/>
               </w:rPr>
@@ -817,9 +822,14 @@
             </w:r>
           </w:p>
         </w:tc>
+      </w:tr>
+      <w:tr>
+        <w:trPr>
+          <w:trHeight w:val="1109" w:hRule="atLeast"/>
+        </w:trPr>
         <w:tc>
           <w:tcPr>
-            <w:tcW w:type="dxa" w:w="5040"/>
+            <w:tcW w:type="dxa" w:w="10080"/>
             <w:shd w:val="clear" w:color="auto" w:fill="FFFFFF"/>
             <w:tcMar>
               <w:top w:w="144" w:type="dxa"/>
@@ -835,6 +845,7 @@
             <w:r>
               <w:rPr>
                 <w:b/>
+                <w:i w:val="0"/>
                 <w:color w:val="1F3864"/>
                 <w:sz w:val="28"/>
               </w:rPr>
@@ -877,50 +888,34 @@
             <w:vAlign w:val="center"/>
             <w:shd w:val="clear" w:color="auto" w:fill="D9E1F2"/>
             <w:tcMar>
-              <w:top w:w="180" w:type="dxa"/>
-              <w:left w:w="180" w:type="dxa"/>
-              <w:bottom w:w="180" w:type="dxa"/>
-              <w:right w:w="180" w:type="dxa"/>
+              <w:top w:w="144" w:type="dxa"/>
+              <w:left w:w="144" w:type="dxa"/>
+              <w:bottom w:w="144" w:type="dxa"/>
+              <w:right w:w="144" w:type="dxa"/>
             </w:tcMar>
           </w:tcPr>
           <w:p>
             <w:pPr>
-              <w:spacing w:before="40" w:after="40"/>
-              <w:jc w:val="left"/>
+              <w:spacing w:before="80" w:after="80"/>
             </w:pPr>
             <w:r>
               <w:rPr>
                 <w:b/>
+                <w:i w:val="0"/>
                 <w:color w:val="1F3864"/>
                 <w:sz w:val="44"/>
               </w:rPr>
-              <w:t>Use AI to Bring Your Ancestors to Life</w:t>
+              <w:t>President Edwin Wells</w:t>
             </w:r>
           </w:p>
           <w:p>
             <w:pPr>
-              <w:spacing w:before="80" w:after="40"/>
+              <w:spacing w:before="60" w:after="120"/>
             </w:pPr>
             <w:r>
               <w:rPr>
-                <w:sz w:val="28"/>
-              </w:rPr>
-              <w:t xml:space="preserve">Presenter:  </w:t>
-            </w:r>
-            <w:r>
-              <w:rPr>
-                <w:b/>
-                <w:sz w:val="28"/>
-              </w:rPr>
-              <w:t>Sicily Clark</w:t>
-            </w:r>
-          </w:p>
-          <w:p>
-            <w:pPr>
-              <w:spacing w:before="40" w:after="80"/>
-            </w:pPr>
-            <w:r>
-              <w:rPr>
+                <w:b w:val="0"/>
+                <w:i w:val="0"/>
                 <w:sz w:val="28"/>
               </w:rPr>
               <w:t xml:space="preserve">Location:  </w:t>
@@ -928,9 +923,10 @@
             <w:r>
               <w:rPr>
                 <w:b/>
+                <w:i w:val="0"/>
                 <w:sz w:val="28"/>
               </w:rPr>
-              <w:t>Young Women's Room</w:t>
+              <w:t>Chapel</w:t>
             </w:r>
           </w:p>
         </w:tc>
@@ -938,7 +934,7 @@
     </w:tbl>
     <w:p>
       <w:pPr>
-        <w:spacing w:before="280" w:after="80"/>
+        <w:spacing w:before="200" w:after="80"/>
       </w:pPr>
     </w:p>
     <w:tbl>
@@ -957,16 +953,15 @@
         </w:tblBorders>
       </w:tblPr>
       <w:tblGrid>
-        <w:gridCol w:w="5040"/>
-        <w:gridCol w:w="5040"/>
+        <w:gridCol w:w="10080"/>
       </w:tblGrid>
       <w:tr>
         <w:trPr>
-          <w:trHeight w:val="1200" w:hRule="atLeast"/>
+          <w:trHeight w:val="1109" w:hRule="atLeast"/>
         </w:trPr>
         <w:tc>
           <w:tcPr>
-            <w:tcW w:type="dxa" w:w="5040"/>
+            <w:tcW w:type="dxa" w:w="10080"/>
             <w:shd w:val="clear" w:color="auto" w:fill="FFFFFF"/>
             <w:tcMar>
               <w:top w:w="144" w:type="dxa"/>
@@ -982,6 +977,7 @@
             <w:r>
               <w:rPr>
                 <w:b/>
+                <w:i w:val="0"/>
                 <w:color w:val="1F3864"/>
                 <w:sz w:val="28"/>
               </w:rPr>
@@ -989,9 +985,14 @@
             </w:r>
           </w:p>
         </w:tc>
+      </w:tr>
+      <w:tr>
+        <w:trPr>
+          <w:trHeight w:val="1109" w:hRule="atLeast"/>
+        </w:trPr>
         <w:tc>
           <w:tcPr>
-            <w:tcW w:type="dxa" w:w="5040"/>
+            <w:tcW w:type="dxa" w:w="10080"/>
             <w:shd w:val="clear" w:color="auto" w:fill="FFFFFF"/>
             <w:tcMar>
               <w:top w:w="144" w:type="dxa"/>
@@ -1007,6 +1008,7 @@
             <w:r>
               <w:rPr>
                 <w:b/>
+                <w:i w:val="0"/>
                 <w:color w:val="1F3864"/>
                 <w:sz w:val="28"/>
               </w:rPr>
@@ -1017,11 +1019,11 @@
       </w:tr>
       <w:tr>
         <w:trPr>
-          <w:trHeight w:val="1200" w:hRule="atLeast"/>
+          <w:trHeight w:val="1109" w:hRule="atLeast"/>
         </w:trPr>
         <w:tc>
           <w:tcPr>
-            <w:tcW w:type="dxa" w:w="5040"/>
+            <w:tcW w:type="dxa" w:w="10080"/>
             <w:shd w:val="clear" w:color="auto" w:fill="FFFFFF"/>
             <w:tcMar>
               <w:top w:w="144" w:type="dxa"/>
@@ -1037,6 +1039,7 @@
             <w:r>
               <w:rPr>
                 <w:b/>
+                <w:i w:val="0"/>
                 <w:color w:val="1F3864"/>
                 <w:sz w:val="28"/>
               </w:rPr>
@@ -1044,9 +1047,14 @@
             </w:r>
           </w:p>
         </w:tc>
+      </w:tr>
+      <w:tr>
+        <w:trPr>
+          <w:trHeight w:val="1109" w:hRule="atLeast"/>
+        </w:trPr>
         <w:tc>
           <w:tcPr>
-            <w:tcW w:type="dxa" w:w="5040"/>
+            <w:tcW w:type="dxa" w:w="10080"/>
             <w:shd w:val="clear" w:color="auto" w:fill="FFFFFF"/>
             <w:tcMar>
               <w:top w:w="144" w:type="dxa"/>
@@ -1062,6 +1070,7 @@
             <w:r>
               <w:rPr>
                 <w:b/>
+                <w:i w:val="0"/>
                 <w:color w:val="1F3864"/>
                 <w:sz w:val="28"/>
               </w:rPr>
@@ -1072,11 +1081,11 @@
       </w:tr>
       <w:tr>
         <w:trPr>
-          <w:trHeight w:val="1200" w:hRule="atLeast"/>
+          <w:trHeight w:val="1109" w:hRule="atLeast"/>
         </w:trPr>
         <w:tc>
           <w:tcPr>
-            <w:tcW w:type="dxa" w:w="5040"/>
+            <w:tcW w:type="dxa" w:w="10080"/>
             <w:shd w:val="clear" w:color="auto" w:fill="FFFFFF"/>
             <w:tcMar>
               <w:top w:w="144" w:type="dxa"/>
@@ -1092,6 +1101,7 @@
             <w:r>
               <w:rPr>
                 <w:b/>
+                <w:i w:val="0"/>
                 <w:color w:val="1F3864"/>
                 <w:sz w:val="28"/>
               </w:rPr>
@@ -1099,9 +1109,14 @@
             </w:r>
           </w:p>
         </w:tc>
+      </w:tr>
+      <w:tr>
+        <w:trPr>
+          <w:trHeight w:val="1109" w:hRule="atLeast"/>
+        </w:trPr>
         <w:tc>
           <w:tcPr>
-            <w:tcW w:type="dxa" w:w="5040"/>
+            <w:tcW w:type="dxa" w:w="10080"/>
             <w:shd w:val="clear" w:color="auto" w:fill="FFFFFF"/>
             <w:tcMar>
               <w:top w:w="144" w:type="dxa"/>
@@ -1117,6 +1132,7 @@
             <w:r>
               <w:rPr>
                 <w:b/>
+                <w:i w:val="0"/>
                 <w:color w:val="1F3864"/>
                 <w:sz w:val="28"/>
               </w:rPr>
@@ -1159,45 +1175,46 @@
             <w:vAlign w:val="center"/>
             <w:shd w:val="clear" w:color="auto" w:fill="D9E1F2"/>
             <w:tcMar>
-              <w:top w:w="180" w:type="dxa"/>
-              <w:left w:w="180" w:type="dxa"/>
-              <w:bottom w:w="180" w:type="dxa"/>
-              <w:right w:w="180" w:type="dxa"/>
+              <w:top w:w="144" w:type="dxa"/>
+              <w:left w:w="144" w:type="dxa"/>
+              <w:bottom w:w="144" w:type="dxa"/>
+              <w:right w:w="144" w:type="dxa"/>
             </w:tcMar>
           </w:tcPr>
           <w:p>
             <w:pPr>
-              <w:spacing w:before="40" w:after="40"/>
-              <w:jc w:val="left"/>
+              <w:spacing w:before="80" w:after="80"/>
             </w:pPr>
             <w:r>
               <w:rPr>
                 <w:b/>
+                <w:i w:val="0"/>
                 <w:color w:val="1F3864"/>
                 <w:sz w:val="44"/>
               </w:rPr>
-              <w:t>Did I Remember Everything?</w:t>
+              <w:t>Spiritual Survival and the Holy Ghost:</w:t>
+            </w:r>
+            <w:r>
+              <w:br/>
+            </w:r>
+            <w:r>
+              <w:rPr>
+                <w:b/>
+                <w:i w:val="0"/>
+                <w:color w:val="1F3864"/>
+                <w:sz w:val="44"/>
+              </w:rPr>
+              <w:t>Preparing Your Family</w:t>
             </w:r>
           </w:p>
           <w:p>
             <w:pPr>
-              <w:spacing w:before="20" w:after="80"/>
+              <w:spacing w:before="60" w:after="60"/>
             </w:pPr>
             <w:r>
               <w:rPr>
-                <w:i/>
-                <w:color w:val="1F3864"/>
-                <w:sz w:val="28"/>
-              </w:rPr>
-              <w:t>Organizing Vital Documents</w:t>
-            </w:r>
-          </w:p>
-          <w:p>
-            <w:pPr>
-              <w:spacing w:before="80" w:after="40"/>
-            </w:pPr>
-            <w:r>
-              <w:rPr>
+                <w:b w:val="0"/>
+                <w:i w:val="0"/>
                 <w:sz w:val="28"/>
               </w:rPr>
               <w:t xml:space="preserve">Presenter:  </w:t>
@@ -1205,17 +1222,20 @@
             <w:r>
               <w:rPr>
                 <w:b/>
+                <w:i w:val="0"/>
                 <w:sz w:val="28"/>
               </w:rPr>
-              <w:t>Ninette Galbraith</w:t>
+              <w:t>President Kristin &amp; Kevin Galbraith</w:t>
             </w:r>
           </w:p>
           <w:p>
             <w:pPr>
-              <w:spacing w:before="40" w:after="80"/>
+              <w:spacing w:before="60" w:after="120"/>
             </w:pPr>
             <w:r>
               <w:rPr>
+                <w:b w:val="0"/>
+                <w:i w:val="0"/>
                 <w:sz w:val="28"/>
               </w:rPr>
               <w:t xml:space="preserve">Location:  </w:t>
@@ -1223,9 +1243,10 @@
             <w:r>
               <w:rPr>
                 <w:b/>
+                <w:i w:val="0"/>
                 <w:sz w:val="28"/>
               </w:rPr>
-              <w:t>Room 9</w:t>
+              <w:t>High Council Room</w:t>
             </w:r>
           </w:p>
         </w:tc>
@@ -1233,7 +1254,7 @@
     </w:tbl>
     <w:p>
       <w:pPr>
-        <w:spacing w:before="280" w:after="80"/>
+        <w:spacing w:before="200" w:after="80"/>
       </w:pPr>
     </w:p>
     <w:tbl>
@@ -1252,16 +1273,15 @@
         </w:tblBorders>
       </w:tblPr>
       <w:tblGrid>
-        <w:gridCol w:w="5040"/>
-        <w:gridCol w:w="5040"/>
+        <w:gridCol w:w="10080"/>
       </w:tblGrid>
       <w:tr>
         <w:trPr>
-          <w:trHeight w:val="1200" w:hRule="atLeast"/>
+          <w:trHeight w:val="1109" w:hRule="atLeast"/>
         </w:trPr>
         <w:tc>
           <w:tcPr>
-            <w:tcW w:type="dxa" w:w="5040"/>
+            <w:tcW w:type="dxa" w:w="10080"/>
             <w:shd w:val="clear" w:color="auto" w:fill="FFFFFF"/>
             <w:tcMar>
               <w:top w:w="144" w:type="dxa"/>
@@ -1277,6 +1297,7 @@
             <w:r>
               <w:rPr>
                 <w:b/>
+                <w:i w:val="0"/>
                 <w:color w:val="1F3864"/>
                 <w:sz w:val="28"/>
               </w:rPr>
@@ -1284,9 +1305,14 @@
             </w:r>
           </w:p>
         </w:tc>
+      </w:tr>
+      <w:tr>
+        <w:trPr>
+          <w:trHeight w:val="1109" w:hRule="atLeast"/>
+        </w:trPr>
         <w:tc>
           <w:tcPr>
-            <w:tcW w:type="dxa" w:w="5040"/>
+            <w:tcW w:type="dxa" w:w="10080"/>
             <w:shd w:val="clear" w:color="auto" w:fill="FFFFFF"/>
             <w:tcMar>
               <w:top w:w="144" w:type="dxa"/>
@@ -1302,6 +1328,7 @@
             <w:r>
               <w:rPr>
                 <w:b/>
+                <w:i w:val="0"/>
                 <w:color w:val="1F3864"/>
                 <w:sz w:val="28"/>
               </w:rPr>
@@ -1312,11 +1339,11 @@
       </w:tr>
       <w:tr>
         <w:trPr>
-          <w:trHeight w:val="1200" w:hRule="atLeast"/>
+          <w:trHeight w:val="1109" w:hRule="atLeast"/>
         </w:trPr>
         <w:tc>
           <w:tcPr>
-            <w:tcW w:type="dxa" w:w="5040"/>
+            <w:tcW w:type="dxa" w:w="10080"/>
             <w:shd w:val="clear" w:color="auto" w:fill="FFFFFF"/>
             <w:tcMar>
               <w:top w:w="144" w:type="dxa"/>
@@ -1332,6 +1359,7 @@
             <w:r>
               <w:rPr>
                 <w:b/>
+                <w:i w:val="0"/>
                 <w:color w:val="1F3864"/>
                 <w:sz w:val="28"/>
               </w:rPr>
@@ -1339,9 +1367,14 @@
             </w:r>
           </w:p>
         </w:tc>
+      </w:tr>
+      <w:tr>
+        <w:trPr>
+          <w:trHeight w:val="1109" w:hRule="atLeast"/>
+        </w:trPr>
         <w:tc>
           <w:tcPr>
-            <w:tcW w:type="dxa" w:w="5040"/>
+            <w:tcW w:type="dxa" w:w="10080"/>
             <w:shd w:val="clear" w:color="auto" w:fill="FFFFFF"/>
             <w:tcMar>
               <w:top w:w="144" w:type="dxa"/>
@@ -1357,6 +1390,7 @@
             <w:r>
               <w:rPr>
                 <w:b/>
+                <w:i w:val="0"/>
                 <w:color w:val="1F3864"/>
                 <w:sz w:val="28"/>
               </w:rPr>
@@ -1367,11 +1401,11 @@
       </w:tr>
       <w:tr>
         <w:trPr>
-          <w:trHeight w:val="1200" w:hRule="atLeast"/>
+          <w:trHeight w:val="1109" w:hRule="atLeast"/>
         </w:trPr>
         <w:tc>
           <w:tcPr>
-            <w:tcW w:type="dxa" w:w="5040"/>
+            <w:tcW w:type="dxa" w:w="10080"/>
             <w:shd w:val="clear" w:color="auto" w:fill="FFFFFF"/>
             <w:tcMar>
               <w:top w:w="144" w:type="dxa"/>
@@ -1387,6 +1421,7 @@
             <w:r>
               <w:rPr>
                 <w:b/>
+                <w:i w:val="0"/>
                 <w:color w:val="1F3864"/>
                 <w:sz w:val="28"/>
               </w:rPr>
@@ -1394,9 +1429,14 @@
             </w:r>
           </w:p>
         </w:tc>
+      </w:tr>
+      <w:tr>
+        <w:trPr>
+          <w:trHeight w:val="1109" w:hRule="atLeast"/>
+        </w:trPr>
         <w:tc>
           <w:tcPr>
-            <w:tcW w:type="dxa" w:w="5040"/>
+            <w:tcW w:type="dxa" w:w="10080"/>
             <w:shd w:val="clear" w:color="auto" w:fill="FFFFFF"/>
             <w:tcMar>
               <w:top w:w="144" w:type="dxa"/>
@@ -1412,6 +1452,7 @@
             <w:r>
               <w:rPr>
                 <w:b/>
+                <w:i w:val="0"/>
                 <w:color w:val="1F3864"/>
                 <w:sz w:val="28"/>
               </w:rPr>
@@ -1454,32 +1495,34 @@
             <w:vAlign w:val="center"/>
             <w:shd w:val="clear" w:color="auto" w:fill="D9E1F2"/>
             <w:tcMar>
-              <w:top w:w="180" w:type="dxa"/>
-              <w:left w:w="180" w:type="dxa"/>
-              <w:bottom w:w="180" w:type="dxa"/>
-              <w:right w:w="180" w:type="dxa"/>
+              <w:top w:w="144" w:type="dxa"/>
+              <w:left w:w="144" w:type="dxa"/>
+              <w:bottom w:w="144" w:type="dxa"/>
+              <w:right w:w="144" w:type="dxa"/>
             </w:tcMar>
           </w:tcPr>
           <w:p>
             <w:pPr>
-              <w:spacing w:before="40" w:after="40"/>
-              <w:jc w:val="left"/>
+              <w:spacing w:before="80" w:after="80"/>
             </w:pPr>
             <w:r>
               <w:rPr>
                 <w:b/>
+                <w:i w:val="0"/>
                 <w:color w:val="1F3864"/>
                 <w:sz w:val="44"/>
               </w:rPr>
-              <w:t>Family History Question and Answer</w:t>
+              <w:t>A Safety and Technology Plan Discussion</w:t>
             </w:r>
           </w:p>
           <w:p>
             <w:pPr>
-              <w:spacing w:before="80" w:after="40"/>
+              <w:spacing w:before="60" w:after="60"/>
             </w:pPr>
             <w:r>
               <w:rPr>
+                <w:b w:val="0"/>
+                <w:i w:val="0"/>
                 <w:sz w:val="28"/>
               </w:rPr>
               <w:t xml:space="preserve">Presenter:  </w:t>
@@ -1487,17 +1530,20 @@
             <w:r>
               <w:rPr>
                 <w:b/>
+                <w:i w:val="0"/>
                 <w:sz w:val="28"/>
               </w:rPr>
-              <w:t>Michelle Nelson, Jacob Jashinsky, &amp; Larry Lovell</w:t>
+              <w:t>Jason Flaig &amp; Detective Teague (Madison Sheriff’s Office)</w:t>
             </w:r>
           </w:p>
           <w:p>
             <w:pPr>
-              <w:spacing w:before="40" w:after="80"/>
+              <w:spacing w:before="60" w:after="120"/>
             </w:pPr>
             <w:r>
               <w:rPr>
+                <w:b w:val="0"/>
+                <w:i w:val="0"/>
                 <w:sz w:val="28"/>
               </w:rPr>
               <w:t xml:space="preserve">Location:  </w:t>
@@ -1505,9 +1551,10 @@
             <w:r>
               <w:rPr>
                 <w:b/>
+                <w:i w:val="0"/>
                 <w:sz w:val="28"/>
               </w:rPr>
-              <w:t>Rooms 6 &amp; 7</w:t>
+              <w:t>Relief Society Room</w:t>
             </w:r>
           </w:p>
         </w:tc>
@@ -1515,7 +1562,7 @@
     </w:tbl>
     <w:p>
       <w:pPr>
-        <w:spacing w:before="280" w:after="80"/>
+        <w:spacing w:before="200" w:after="80"/>
       </w:pPr>
     </w:p>
     <w:tbl>
@@ -1534,16 +1581,15 @@
         </w:tblBorders>
       </w:tblPr>
       <w:tblGrid>
-        <w:gridCol w:w="5040"/>
-        <w:gridCol w:w="5040"/>
+        <w:gridCol w:w="10080"/>
       </w:tblGrid>
       <w:tr>
         <w:trPr>
-          <w:trHeight w:val="1200" w:hRule="atLeast"/>
+          <w:trHeight w:val="1109" w:hRule="atLeast"/>
         </w:trPr>
         <w:tc>
           <w:tcPr>
-            <w:tcW w:type="dxa" w:w="5040"/>
+            <w:tcW w:type="dxa" w:w="10080"/>
             <w:shd w:val="clear" w:color="auto" w:fill="FFFFFF"/>
             <w:tcMar>
               <w:top w:w="144" w:type="dxa"/>
@@ -1559,6 +1605,7 @@
             <w:r>
               <w:rPr>
                 <w:b/>
+                <w:i w:val="0"/>
                 <w:color w:val="1F3864"/>
                 <w:sz w:val="28"/>
               </w:rPr>
@@ -1566,9 +1613,14 @@
             </w:r>
           </w:p>
         </w:tc>
+      </w:tr>
+      <w:tr>
+        <w:trPr>
+          <w:trHeight w:val="1109" w:hRule="atLeast"/>
+        </w:trPr>
         <w:tc>
           <w:tcPr>
-            <w:tcW w:type="dxa" w:w="5040"/>
+            <w:tcW w:type="dxa" w:w="10080"/>
             <w:shd w:val="clear" w:color="auto" w:fill="FFFFFF"/>
             <w:tcMar>
               <w:top w:w="144" w:type="dxa"/>
@@ -1584,6 +1636,7 @@
             <w:r>
               <w:rPr>
                 <w:b/>
+                <w:i w:val="0"/>
                 <w:color w:val="1F3864"/>
                 <w:sz w:val="28"/>
               </w:rPr>
@@ -1594,11 +1647,11 @@
       </w:tr>
       <w:tr>
         <w:trPr>
-          <w:trHeight w:val="1200" w:hRule="atLeast"/>
+          <w:trHeight w:val="1109" w:hRule="atLeast"/>
         </w:trPr>
         <w:tc>
           <w:tcPr>
-            <w:tcW w:type="dxa" w:w="5040"/>
+            <w:tcW w:type="dxa" w:w="10080"/>
             <w:shd w:val="clear" w:color="auto" w:fill="FFFFFF"/>
             <w:tcMar>
               <w:top w:w="144" w:type="dxa"/>
@@ -1614,6 +1667,7 @@
             <w:r>
               <w:rPr>
                 <w:b/>
+                <w:i w:val="0"/>
                 <w:color w:val="1F3864"/>
                 <w:sz w:val="28"/>
               </w:rPr>
@@ -1621,9 +1675,14 @@
             </w:r>
           </w:p>
         </w:tc>
+      </w:tr>
+      <w:tr>
+        <w:trPr>
+          <w:trHeight w:val="1109" w:hRule="atLeast"/>
+        </w:trPr>
         <w:tc>
           <w:tcPr>
-            <w:tcW w:type="dxa" w:w="5040"/>
+            <w:tcW w:type="dxa" w:w="10080"/>
             <w:shd w:val="clear" w:color="auto" w:fill="FFFFFF"/>
             <w:tcMar>
               <w:top w:w="144" w:type="dxa"/>
@@ -1639,6 +1698,7 @@
             <w:r>
               <w:rPr>
                 <w:b/>
+                <w:i w:val="0"/>
                 <w:color w:val="1F3864"/>
                 <w:sz w:val="28"/>
               </w:rPr>
@@ -1649,11 +1709,11 @@
       </w:tr>
       <w:tr>
         <w:trPr>
-          <w:trHeight w:val="1200" w:hRule="atLeast"/>
+          <w:trHeight w:val="1109" w:hRule="atLeast"/>
         </w:trPr>
         <w:tc>
           <w:tcPr>
-            <w:tcW w:type="dxa" w:w="5040"/>
+            <w:tcW w:type="dxa" w:w="10080"/>
             <w:shd w:val="clear" w:color="auto" w:fill="FFFFFF"/>
             <w:tcMar>
               <w:top w:w="144" w:type="dxa"/>
@@ -1669,6 +1729,7 @@
             <w:r>
               <w:rPr>
                 <w:b/>
+                <w:i w:val="0"/>
                 <w:color w:val="1F3864"/>
                 <w:sz w:val="28"/>
               </w:rPr>
@@ -1676,9 +1737,14 @@
             </w:r>
           </w:p>
         </w:tc>
+      </w:tr>
+      <w:tr>
+        <w:trPr>
+          <w:trHeight w:val="1109" w:hRule="atLeast"/>
+        </w:trPr>
         <w:tc>
           <w:tcPr>
-            <w:tcW w:type="dxa" w:w="5040"/>
+            <w:tcW w:type="dxa" w:w="10080"/>
             <w:shd w:val="clear" w:color="auto" w:fill="FFFFFF"/>
             <w:tcMar>
               <w:top w:w="144" w:type="dxa"/>
@@ -1694,6 +1760,7 @@
             <w:r>
               <w:rPr>
                 <w:b/>
+                <w:i w:val="0"/>
                 <w:color w:val="1F3864"/>
                 <w:sz w:val="28"/>
               </w:rPr>
@@ -1736,45 +1803,34 @@
             <w:vAlign w:val="center"/>
             <w:shd w:val="clear" w:color="auto" w:fill="D9E1F2"/>
             <w:tcMar>
-              <w:top w:w="180" w:type="dxa"/>
-              <w:left w:w="180" w:type="dxa"/>
-              <w:bottom w:w="180" w:type="dxa"/>
-              <w:right w:w="180" w:type="dxa"/>
+              <w:top w:w="144" w:type="dxa"/>
+              <w:left w:w="144" w:type="dxa"/>
+              <w:bottom w:w="144" w:type="dxa"/>
+              <w:right w:w="144" w:type="dxa"/>
             </w:tcMar>
           </w:tcPr>
           <w:p>
             <w:pPr>
-              <w:spacing w:before="40" w:after="40"/>
-              <w:jc w:val="left"/>
+              <w:spacing w:before="80" w:after="80"/>
             </w:pPr>
             <w:r>
               <w:rPr>
                 <w:b/>
+                <w:i w:val="0"/>
                 <w:color w:val="1F3864"/>
                 <w:sz w:val="44"/>
               </w:rPr>
-              <w:t>The Teton Dam Disaster</w:t>
+              <w:t>Use AI to Bring Your Ancestors to Life</w:t>
             </w:r>
           </w:p>
           <w:p>
             <w:pPr>
-              <w:spacing w:before="20" w:after="80"/>
+              <w:spacing w:before="60" w:after="60"/>
             </w:pPr>
             <w:r>
               <w:rPr>
-                <w:i/>
-                <w:color w:val="1F3864"/>
-                <w:sz w:val="28"/>
-              </w:rPr>
-              <w:t>What happened, what was learned, and inspiring stories</w:t>
-            </w:r>
-          </w:p>
-          <w:p>
-            <w:pPr>
-              <w:spacing w:before="80" w:after="40"/>
-            </w:pPr>
-            <w:r>
-              <w:rPr>
+                <w:b w:val="0"/>
+                <w:i w:val="0"/>
                 <w:sz w:val="28"/>
               </w:rPr>
               <w:t xml:space="preserve">Presenter:  </w:t>
@@ -1782,17 +1838,20 @@
             <w:r>
               <w:rPr>
                 <w:b/>
+                <w:i w:val="0"/>
                 <w:sz w:val="28"/>
               </w:rPr>
-              <w:t>John Galbraith</w:t>
+              <w:t>Sicily Clark</w:t>
             </w:r>
           </w:p>
           <w:p>
             <w:pPr>
-              <w:spacing w:before="40" w:after="80"/>
+              <w:spacing w:before="60" w:after="120"/>
             </w:pPr>
             <w:r>
               <w:rPr>
+                <w:b w:val="0"/>
+                <w:i w:val="0"/>
                 <w:sz w:val="28"/>
               </w:rPr>
               <w:t xml:space="preserve">Location:  </w:t>
@@ -1800,9 +1859,10 @@
             <w:r>
               <w:rPr>
                 <w:b/>
+                <w:i w:val="0"/>
                 <w:sz w:val="28"/>
               </w:rPr>
-              <w:t>Priesthood Room</w:t>
+              <w:t>Young Women’s Room</w:t>
             </w:r>
           </w:p>
         </w:tc>
@@ -1810,7 +1870,7 @@
     </w:tbl>
     <w:p>
       <w:pPr>
-        <w:spacing w:before="280" w:after="80"/>
+        <w:spacing w:before="200" w:after="80"/>
       </w:pPr>
     </w:p>
     <w:tbl>
@@ -1829,16 +1889,15 @@
         </w:tblBorders>
       </w:tblPr>
       <w:tblGrid>
-        <w:gridCol w:w="5040"/>
-        <w:gridCol w:w="5040"/>
+        <w:gridCol w:w="10080"/>
       </w:tblGrid>
       <w:tr>
         <w:trPr>
-          <w:trHeight w:val="1200" w:hRule="atLeast"/>
+          <w:trHeight w:val="1109" w:hRule="atLeast"/>
         </w:trPr>
         <w:tc>
           <w:tcPr>
-            <w:tcW w:type="dxa" w:w="5040"/>
+            <w:tcW w:type="dxa" w:w="10080"/>
             <w:shd w:val="clear" w:color="auto" w:fill="FFFFFF"/>
             <w:tcMar>
               <w:top w:w="144" w:type="dxa"/>
@@ -1854,6 +1913,7 @@
             <w:r>
               <w:rPr>
                 <w:b/>
+                <w:i w:val="0"/>
                 <w:color w:val="1F3864"/>
                 <w:sz w:val="28"/>
               </w:rPr>
@@ -1861,9 +1921,14 @@
             </w:r>
           </w:p>
         </w:tc>
+      </w:tr>
+      <w:tr>
+        <w:trPr>
+          <w:trHeight w:val="1109" w:hRule="atLeast"/>
+        </w:trPr>
         <w:tc>
           <w:tcPr>
-            <w:tcW w:type="dxa" w:w="5040"/>
+            <w:tcW w:type="dxa" w:w="10080"/>
             <w:shd w:val="clear" w:color="auto" w:fill="FFFFFF"/>
             <w:tcMar>
               <w:top w:w="144" w:type="dxa"/>
@@ -1879,6 +1944,7 @@
             <w:r>
               <w:rPr>
                 <w:b/>
+                <w:i w:val="0"/>
                 <w:color w:val="1F3864"/>
                 <w:sz w:val="28"/>
               </w:rPr>
@@ -1889,11 +1955,11 @@
       </w:tr>
       <w:tr>
         <w:trPr>
-          <w:trHeight w:val="1200" w:hRule="atLeast"/>
+          <w:trHeight w:val="1109" w:hRule="atLeast"/>
         </w:trPr>
         <w:tc>
           <w:tcPr>
-            <w:tcW w:type="dxa" w:w="5040"/>
+            <w:tcW w:type="dxa" w:w="10080"/>
             <w:shd w:val="clear" w:color="auto" w:fill="FFFFFF"/>
             <w:tcMar>
               <w:top w:w="144" w:type="dxa"/>
@@ -1909,6 +1975,7 @@
             <w:r>
               <w:rPr>
                 <w:b/>
+                <w:i w:val="0"/>
                 <w:color w:val="1F3864"/>
                 <w:sz w:val="28"/>
               </w:rPr>
@@ -1916,9 +1983,14 @@
             </w:r>
           </w:p>
         </w:tc>
+      </w:tr>
+      <w:tr>
+        <w:trPr>
+          <w:trHeight w:val="1109" w:hRule="atLeast"/>
+        </w:trPr>
         <w:tc>
           <w:tcPr>
-            <w:tcW w:type="dxa" w:w="5040"/>
+            <w:tcW w:type="dxa" w:w="10080"/>
             <w:shd w:val="clear" w:color="auto" w:fill="FFFFFF"/>
             <w:tcMar>
               <w:top w:w="144" w:type="dxa"/>
@@ -1934,6 +2006,7 @@
             <w:r>
               <w:rPr>
                 <w:b/>
+                <w:i w:val="0"/>
                 <w:color w:val="1F3864"/>
                 <w:sz w:val="28"/>
               </w:rPr>
@@ -1944,11 +2017,11 @@
       </w:tr>
       <w:tr>
         <w:trPr>
-          <w:trHeight w:val="1200" w:hRule="atLeast"/>
+          <w:trHeight w:val="1109" w:hRule="atLeast"/>
         </w:trPr>
         <w:tc>
           <w:tcPr>
-            <w:tcW w:type="dxa" w:w="5040"/>
+            <w:tcW w:type="dxa" w:w="10080"/>
             <w:shd w:val="clear" w:color="auto" w:fill="FFFFFF"/>
             <w:tcMar>
               <w:top w:w="144" w:type="dxa"/>
@@ -1964,6 +2037,7 @@
             <w:r>
               <w:rPr>
                 <w:b/>
+                <w:i w:val="0"/>
                 <w:color w:val="1F3864"/>
                 <w:sz w:val="28"/>
               </w:rPr>
@@ -1971,9 +2045,14 @@
             </w:r>
           </w:p>
         </w:tc>
+      </w:tr>
+      <w:tr>
+        <w:trPr>
+          <w:trHeight w:val="1109" w:hRule="atLeast"/>
+        </w:trPr>
         <w:tc>
           <w:tcPr>
-            <w:tcW w:type="dxa" w:w="5040"/>
+            <w:tcW w:type="dxa" w:w="10080"/>
             <w:shd w:val="clear" w:color="auto" w:fill="FFFFFF"/>
             <w:tcMar>
               <w:top w:w="144" w:type="dxa"/>
@@ -1989,6 +2068,7 @@
             <w:r>
               <w:rPr>
                 <w:b/>
+                <w:i w:val="0"/>
                 <w:color w:val="1F3864"/>
                 <w:sz w:val="28"/>
               </w:rPr>
@@ -2031,34 +2111,34 @@
             <w:vAlign w:val="center"/>
             <w:shd w:val="clear" w:color="auto" w:fill="D9E1F2"/>
             <w:tcMar>
-              <w:top w:w="180" w:type="dxa"/>
-              <w:left w:w="180" w:type="dxa"/>
-              <w:bottom w:w="180" w:type="dxa"/>
-              <w:right w:w="180" w:type="dxa"/>
+              <w:top w:w="144" w:type="dxa"/>
+              <w:left w:w="144" w:type="dxa"/>
+              <w:bottom w:w="144" w:type="dxa"/>
+              <w:right w:w="144" w:type="dxa"/>
             </w:tcMar>
           </w:tcPr>
           <w:p>
             <w:pPr>
-              <w:spacing w:before="40" w:after="40"/>
-              <w:jc w:val="left"/>
+              <w:spacing w:before="80" w:after="80"/>
             </w:pPr>
             <w:r>
               <w:rPr>
                 <w:b/>
+                <w:i w:val="0"/>
                 <w:color w:val="1F3864"/>
                 <w:sz w:val="44"/>
               </w:rPr>
-              <w:t>Job Search, Résumé Tips</w:t>
-              <w:br/>
-              <w:t>&amp; Networking Strategies</w:t>
+              <w:t>Use AI to Bring Your Ancestors to Life</w:t>
             </w:r>
           </w:p>
           <w:p>
             <w:pPr>
-              <w:spacing w:before="80" w:after="40"/>
+              <w:spacing w:before="60" w:after="60"/>
             </w:pPr>
             <w:r>
               <w:rPr>
+                <w:b w:val="0"/>
+                <w:i w:val="0"/>
                 <w:sz w:val="28"/>
               </w:rPr>
               <w:t xml:space="preserve">Presenter:  </w:t>
@@ -2066,19 +2146,20 @@
             <w:r>
               <w:rPr>
                 <w:b/>
+                <w:i w:val="0"/>
                 <w:sz w:val="28"/>
               </w:rPr>
-              <w:t>John Ekins &amp; Elder Gary Chapman</w:t>
-              <w:br/>
-              <w:t>(Employment Missionary)</w:t>
+              <w:t>Sicily Clark</w:t>
             </w:r>
           </w:p>
           <w:p>
             <w:pPr>
-              <w:spacing w:before="40" w:after="80"/>
+              <w:spacing w:before="60" w:after="120"/>
             </w:pPr>
             <w:r>
               <w:rPr>
+                <w:b w:val="0"/>
+                <w:i w:val="0"/>
                 <w:sz w:val="28"/>
               </w:rPr>
               <w:t xml:space="preserve">Location:  </w:t>
@@ -2086,9 +2167,10 @@
             <w:r>
               <w:rPr>
                 <w:b/>
+                <w:i w:val="0"/>
                 <w:sz w:val="28"/>
               </w:rPr>
-              <w:t>Room 2</w:t>
+              <w:t>Young Women’s Room</w:t>
             </w:r>
           </w:p>
         </w:tc>
@@ -2096,7 +2178,7 @@
     </w:tbl>
     <w:p>
       <w:pPr>
-        <w:spacing w:before="280" w:after="80"/>
+        <w:spacing w:before="200" w:after="80"/>
       </w:pPr>
     </w:p>
     <w:tbl>
@@ -2115,16 +2197,15 @@
         </w:tblBorders>
       </w:tblPr>
       <w:tblGrid>
-        <w:gridCol w:w="5040"/>
-        <w:gridCol w:w="5040"/>
+        <w:gridCol w:w="10080"/>
       </w:tblGrid>
       <w:tr>
         <w:trPr>
-          <w:trHeight w:val="1200" w:hRule="atLeast"/>
+          <w:trHeight w:val="1109" w:hRule="atLeast"/>
         </w:trPr>
         <w:tc>
           <w:tcPr>
-            <w:tcW w:type="dxa" w:w="5040"/>
+            <w:tcW w:type="dxa" w:w="10080"/>
             <w:shd w:val="clear" w:color="auto" w:fill="FFFFFF"/>
             <w:tcMar>
               <w:top w:w="144" w:type="dxa"/>
@@ -2140,6 +2221,7 @@
             <w:r>
               <w:rPr>
                 <w:b/>
+                <w:i w:val="0"/>
                 <w:color w:val="1F3864"/>
                 <w:sz w:val="28"/>
               </w:rPr>
@@ -2147,9 +2229,14 @@
             </w:r>
           </w:p>
         </w:tc>
+      </w:tr>
+      <w:tr>
+        <w:trPr>
+          <w:trHeight w:val="1109" w:hRule="atLeast"/>
+        </w:trPr>
         <w:tc>
           <w:tcPr>
-            <w:tcW w:type="dxa" w:w="5040"/>
+            <w:tcW w:type="dxa" w:w="10080"/>
             <w:shd w:val="clear" w:color="auto" w:fill="FFFFFF"/>
             <w:tcMar>
               <w:top w:w="144" w:type="dxa"/>
@@ -2165,6 +2252,7 @@
             <w:r>
               <w:rPr>
                 <w:b/>
+                <w:i w:val="0"/>
                 <w:color w:val="1F3864"/>
                 <w:sz w:val="28"/>
               </w:rPr>
@@ -2175,11 +2263,11 @@
       </w:tr>
       <w:tr>
         <w:trPr>
-          <w:trHeight w:val="1200" w:hRule="atLeast"/>
+          <w:trHeight w:val="1109" w:hRule="atLeast"/>
         </w:trPr>
         <w:tc>
           <w:tcPr>
-            <w:tcW w:type="dxa" w:w="5040"/>
+            <w:tcW w:type="dxa" w:w="10080"/>
             <w:shd w:val="clear" w:color="auto" w:fill="FFFFFF"/>
             <w:tcMar>
               <w:top w:w="144" w:type="dxa"/>
@@ -2195,6 +2283,7 @@
             <w:r>
               <w:rPr>
                 <w:b/>
+                <w:i w:val="0"/>
                 <w:color w:val="1F3864"/>
                 <w:sz w:val="28"/>
               </w:rPr>
@@ -2202,9 +2291,14 @@
             </w:r>
           </w:p>
         </w:tc>
+      </w:tr>
+      <w:tr>
+        <w:trPr>
+          <w:trHeight w:val="1109" w:hRule="atLeast"/>
+        </w:trPr>
         <w:tc>
           <w:tcPr>
-            <w:tcW w:type="dxa" w:w="5040"/>
+            <w:tcW w:type="dxa" w:w="10080"/>
             <w:shd w:val="clear" w:color="auto" w:fill="FFFFFF"/>
             <w:tcMar>
               <w:top w:w="144" w:type="dxa"/>
@@ -2220,6 +2314,7 @@
             <w:r>
               <w:rPr>
                 <w:b/>
+                <w:i w:val="0"/>
                 <w:color w:val="1F3864"/>
                 <w:sz w:val="28"/>
               </w:rPr>
@@ -2230,11 +2325,11 @@
       </w:tr>
       <w:tr>
         <w:trPr>
-          <w:trHeight w:val="1200" w:hRule="atLeast"/>
+          <w:trHeight w:val="1109" w:hRule="atLeast"/>
         </w:trPr>
         <w:tc>
           <w:tcPr>
-            <w:tcW w:type="dxa" w:w="5040"/>
+            <w:tcW w:type="dxa" w:w="10080"/>
             <w:shd w:val="clear" w:color="auto" w:fill="FFFFFF"/>
             <w:tcMar>
               <w:top w:w="144" w:type="dxa"/>
@@ -2250,6 +2345,7 @@
             <w:r>
               <w:rPr>
                 <w:b/>
+                <w:i w:val="0"/>
                 <w:color w:val="1F3864"/>
                 <w:sz w:val="28"/>
               </w:rPr>
@@ -2257,9 +2353,14 @@
             </w:r>
           </w:p>
         </w:tc>
+      </w:tr>
+      <w:tr>
+        <w:trPr>
+          <w:trHeight w:val="1109" w:hRule="atLeast"/>
+        </w:trPr>
         <w:tc>
           <w:tcPr>
-            <w:tcW w:type="dxa" w:w="5040"/>
+            <w:tcW w:type="dxa" w:w="10080"/>
             <w:shd w:val="clear" w:color="auto" w:fill="FFFFFF"/>
             <w:tcMar>
               <w:top w:w="144" w:type="dxa"/>
@@ -2275,6 +2376,1267 @@
             <w:r>
               <w:rPr>
                 <w:b/>
+                <w:i w:val="0"/>
+                <w:color w:val="1F3864"/>
+                <w:sz w:val="28"/>
+              </w:rPr>
+              <w:t>Next Class Time:</w:t>
+            </w:r>
+          </w:p>
+        </w:tc>
+      </w:tr>
+    </w:tbl>
+    <w:p>
+      <w:pPr>
+        <w:spacing w:before="0" w:after="0"/>
+      </w:pPr>
+      <w:r>
+        <w:br w:type="page"/>
+      </w:r>
+    </w:p>
+    <w:tbl>
+      <w:tblPr>
+        <w:tblStyle w:val="TableGrid"/>
+        <w:tblW w:type="auto" w:w="0"/>
+        <w:jc w:val="center"/>
+        <w:tblLook w:firstColumn="1" w:firstRow="1" w:lastColumn="0" w:lastRow="0" w:noHBand="0" w:noVBand="1" w:val="04A0"/>
+        <w:tblBorders>
+          <w:top w:val="single" w:sz="18" w:space="0" w:color="1F3864"/>
+          <w:left w:val="single" w:sz="18" w:space="0" w:color="1F3864"/>
+          <w:bottom w:val="single" w:sz="18" w:space="0" w:color="1F3864"/>
+          <w:right w:val="single" w:sz="18" w:space="0" w:color="1F3864"/>
+          <w:insideH w:val="single" w:sz="18" w:space="0" w:color="1F3864"/>
+          <w:insideV w:val="single" w:sz="18" w:space="0" w:color="1F3864"/>
+        </w:tblBorders>
+      </w:tblPr>
+      <w:tblGrid>
+        <w:gridCol w:w="10080"/>
+      </w:tblGrid>
+      <w:tr>
+        <w:tc>
+          <w:tcPr>
+            <w:tcW w:type="dxa" w:w="10080"/>
+            <w:vAlign w:val="center"/>
+            <w:shd w:val="clear" w:color="auto" w:fill="D9E1F2"/>
+            <w:tcMar>
+              <w:top w:w="144" w:type="dxa"/>
+              <w:left w:w="144" w:type="dxa"/>
+              <w:bottom w:w="144" w:type="dxa"/>
+              <w:right w:w="144" w:type="dxa"/>
+            </w:tcMar>
+          </w:tcPr>
+          <w:p>
+            <w:pPr>
+              <w:spacing w:before="80" w:after="80"/>
+            </w:pPr>
+            <w:r>
+              <w:rPr>
+                <w:b/>
+                <w:i w:val="0"/>
+                <w:color w:val="1F3864"/>
+                <w:sz w:val="44"/>
+              </w:rPr>
+              <w:t>Did I Remember Everything?</w:t>
+            </w:r>
+          </w:p>
+          <w:p>
+            <w:pPr>
+              <w:spacing w:before="60" w:after="60"/>
+            </w:pPr>
+            <w:r>
+              <w:rPr>
+                <w:b/>
+                <w:i w:val="0"/>
+                <w:color w:val="1F3864"/>
+                <w:sz w:val="28"/>
+              </w:rPr>
+              <w:t>Organizing Vital Documents</w:t>
+            </w:r>
+          </w:p>
+          <w:p>
+            <w:pPr>
+              <w:spacing w:before="60" w:after="60"/>
+            </w:pPr>
+            <w:r>
+              <w:rPr>
+                <w:b w:val="0"/>
+                <w:i w:val="0"/>
+                <w:sz w:val="28"/>
+              </w:rPr>
+              <w:t xml:space="preserve">Presenter:  </w:t>
+            </w:r>
+            <w:r>
+              <w:rPr>
+                <w:b/>
+                <w:i w:val="0"/>
+                <w:sz w:val="28"/>
+              </w:rPr>
+              <w:t>Ninette Galbraith</w:t>
+            </w:r>
+          </w:p>
+          <w:p>
+            <w:pPr>
+              <w:spacing w:before="60" w:after="120"/>
+            </w:pPr>
+            <w:r>
+              <w:rPr>
+                <w:b w:val="0"/>
+                <w:i w:val="0"/>
+                <w:sz w:val="28"/>
+              </w:rPr>
+              <w:t xml:space="preserve">Location:  </w:t>
+            </w:r>
+            <w:r>
+              <w:rPr>
+                <w:b/>
+                <w:i w:val="0"/>
+                <w:sz w:val="28"/>
+              </w:rPr>
+              <w:t>Room 9</w:t>
+            </w:r>
+          </w:p>
+        </w:tc>
+      </w:tr>
+    </w:tbl>
+    <w:p>
+      <w:pPr>
+        <w:spacing w:before="200" w:after="80"/>
+      </w:pPr>
+    </w:p>
+    <w:tbl>
+      <w:tblPr>
+        <w:tblStyle w:val="TableGrid"/>
+        <w:tblW w:type="auto" w:w="0"/>
+        <w:jc w:val="center"/>
+        <w:tblLook w:firstColumn="1" w:firstRow="1" w:lastColumn="0" w:lastRow="0" w:noHBand="0" w:noVBand="1" w:val="04A0"/>
+        <w:tblBorders>
+          <w:top w:val="single" w:sz="12" w:space="0" w:color="1F3864"/>
+          <w:left w:val="single" w:sz="12" w:space="0" w:color="1F3864"/>
+          <w:bottom w:val="single" w:sz="12" w:space="0" w:color="1F3864"/>
+          <w:right w:val="single" w:sz="12" w:space="0" w:color="1F3864"/>
+          <w:insideH w:val="single" w:sz="12" w:space="0" w:color="1F3864"/>
+          <w:insideV w:val="single" w:sz="12" w:space="0" w:color="1F3864"/>
+        </w:tblBorders>
+      </w:tblPr>
+      <w:tblGrid>
+        <w:gridCol w:w="10080"/>
+      </w:tblGrid>
+      <w:tr>
+        <w:trPr>
+          <w:trHeight w:val="1109" w:hRule="atLeast"/>
+        </w:trPr>
+        <w:tc>
+          <w:tcPr>
+            <w:tcW w:type="dxa" w:w="10080"/>
+            <w:shd w:val="clear" w:color="auto" w:fill="FFFFFF"/>
+            <w:tcMar>
+              <w:top w:w="144" w:type="dxa"/>
+              <w:left w:w="144" w:type="dxa"/>
+              <w:bottom w:w="144" w:type="dxa"/>
+              <w:right w:w="144" w:type="dxa"/>
+            </w:tcMar>
+          </w:tcPr>
+          <w:p>
+            <w:pPr>
+              <w:spacing w:before="80" w:after="0"/>
+            </w:pPr>
+            <w:r>
+              <w:rPr>
+                <w:b/>
+                <w:i w:val="0"/>
+                <w:color w:val="1F3864"/>
+                <w:sz w:val="28"/>
+              </w:rPr>
+              <w:t>Next Class Time:</w:t>
+            </w:r>
+          </w:p>
+        </w:tc>
+      </w:tr>
+      <w:tr>
+        <w:trPr>
+          <w:trHeight w:val="1109" w:hRule="atLeast"/>
+        </w:trPr>
+        <w:tc>
+          <w:tcPr>
+            <w:tcW w:type="dxa" w:w="10080"/>
+            <w:shd w:val="clear" w:color="auto" w:fill="FFFFFF"/>
+            <w:tcMar>
+              <w:top w:w="144" w:type="dxa"/>
+              <w:left w:w="144" w:type="dxa"/>
+              <w:bottom w:w="144" w:type="dxa"/>
+              <w:right w:w="144" w:type="dxa"/>
+            </w:tcMar>
+          </w:tcPr>
+          <w:p>
+            <w:pPr>
+              <w:spacing w:before="80" w:after="0"/>
+            </w:pPr>
+            <w:r>
+              <w:rPr>
+                <w:b/>
+                <w:i w:val="0"/>
+                <w:color w:val="1F3864"/>
+                <w:sz w:val="28"/>
+              </w:rPr>
+              <w:t>Next Class Time:</w:t>
+            </w:r>
+          </w:p>
+        </w:tc>
+      </w:tr>
+      <w:tr>
+        <w:trPr>
+          <w:trHeight w:val="1109" w:hRule="atLeast"/>
+        </w:trPr>
+        <w:tc>
+          <w:tcPr>
+            <w:tcW w:type="dxa" w:w="10080"/>
+            <w:shd w:val="clear" w:color="auto" w:fill="FFFFFF"/>
+            <w:tcMar>
+              <w:top w:w="144" w:type="dxa"/>
+              <w:left w:w="144" w:type="dxa"/>
+              <w:bottom w:w="144" w:type="dxa"/>
+              <w:right w:w="144" w:type="dxa"/>
+            </w:tcMar>
+          </w:tcPr>
+          <w:p>
+            <w:pPr>
+              <w:spacing w:before="80" w:after="0"/>
+            </w:pPr>
+            <w:r>
+              <w:rPr>
+                <w:b/>
+                <w:i w:val="0"/>
+                <w:color w:val="1F3864"/>
+                <w:sz w:val="28"/>
+              </w:rPr>
+              <w:t>Next Class Time:</w:t>
+            </w:r>
+          </w:p>
+        </w:tc>
+      </w:tr>
+      <w:tr>
+        <w:trPr>
+          <w:trHeight w:val="1109" w:hRule="atLeast"/>
+        </w:trPr>
+        <w:tc>
+          <w:tcPr>
+            <w:tcW w:type="dxa" w:w="10080"/>
+            <w:shd w:val="clear" w:color="auto" w:fill="FFFFFF"/>
+            <w:tcMar>
+              <w:top w:w="144" w:type="dxa"/>
+              <w:left w:w="144" w:type="dxa"/>
+              <w:bottom w:w="144" w:type="dxa"/>
+              <w:right w:w="144" w:type="dxa"/>
+            </w:tcMar>
+          </w:tcPr>
+          <w:p>
+            <w:pPr>
+              <w:spacing w:before="80" w:after="0"/>
+            </w:pPr>
+            <w:r>
+              <w:rPr>
+                <w:b/>
+                <w:i w:val="0"/>
+                <w:color w:val="1F3864"/>
+                <w:sz w:val="28"/>
+              </w:rPr>
+              <w:t>Next Class Time:</w:t>
+            </w:r>
+          </w:p>
+        </w:tc>
+      </w:tr>
+      <w:tr>
+        <w:trPr>
+          <w:trHeight w:val="1109" w:hRule="atLeast"/>
+        </w:trPr>
+        <w:tc>
+          <w:tcPr>
+            <w:tcW w:type="dxa" w:w="10080"/>
+            <w:shd w:val="clear" w:color="auto" w:fill="FFFFFF"/>
+            <w:tcMar>
+              <w:top w:w="144" w:type="dxa"/>
+              <w:left w:w="144" w:type="dxa"/>
+              <w:bottom w:w="144" w:type="dxa"/>
+              <w:right w:w="144" w:type="dxa"/>
+            </w:tcMar>
+          </w:tcPr>
+          <w:p>
+            <w:pPr>
+              <w:spacing w:before="80" w:after="0"/>
+            </w:pPr>
+            <w:r>
+              <w:rPr>
+                <w:b/>
+                <w:i w:val="0"/>
+                <w:color w:val="1F3864"/>
+                <w:sz w:val="28"/>
+              </w:rPr>
+              <w:t>Next Class Time:</w:t>
+            </w:r>
+          </w:p>
+        </w:tc>
+      </w:tr>
+      <w:tr>
+        <w:trPr>
+          <w:trHeight w:val="1109" w:hRule="atLeast"/>
+        </w:trPr>
+        <w:tc>
+          <w:tcPr>
+            <w:tcW w:type="dxa" w:w="10080"/>
+            <w:shd w:val="clear" w:color="auto" w:fill="FFFFFF"/>
+            <w:tcMar>
+              <w:top w:w="144" w:type="dxa"/>
+              <w:left w:w="144" w:type="dxa"/>
+              <w:bottom w:w="144" w:type="dxa"/>
+              <w:right w:w="144" w:type="dxa"/>
+            </w:tcMar>
+          </w:tcPr>
+          <w:p>
+            <w:pPr>
+              <w:spacing w:before="80" w:after="0"/>
+            </w:pPr>
+            <w:r>
+              <w:rPr>
+                <w:b/>
+                <w:i w:val="0"/>
+                <w:color w:val="1F3864"/>
+                <w:sz w:val="28"/>
+              </w:rPr>
+              <w:t>Next Class Time:</w:t>
+            </w:r>
+          </w:p>
+        </w:tc>
+      </w:tr>
+    </w:tbl>
+    <w:p>
+      <w:pPr>
+        <w:spacing w:before="0" w:after="0"/>
+      </w:pPr>
+      <w:r>
+        <w:br w:type="page"/>
+      </w:r>
+    </w:p>
+    <w:tbl>
+      <w:tblPr>
+        <w:tblStyle w:val="TableGrid"/>
+        <w:tblW w:type="auto" w:w="0"/>
+        <w:jc w:val="center"/>
+        <w:tblLook w:firstColumn="1" w:firstRow="1" w:lastColumn="0" w:lastRow="0" w:noHBand="0" w:noVBand="1" w:val="04A0"/>
+        <w:tblBorders>
+          <w:top w:val="single" w:sz="18" w:space="0" w:color="1F3864"/>
+          <w:left w:val="single" w:sz="18" w:space="0" w:color="1F3864"/>
+          <w:bottom w:val="single" w:sz="18" w:space="0" w:color="1F3864"/>
+          <w:right w:val="single" w:sz="18" w:space="0" w:color="1F3864"/>
+          <w:insideH w:val="single" w:sz="18" w:space="0" w:color="1F3864"/>
+          <w:insideV w:val="single" w:sz="18" w:space="0" w:color="1F3864"/>
+        </w:tblBorders>
+      </w:tblPr>
+      <w:tblGrid>
+        <w:gridCol w:w="10080"/>
+      </w:tblGrid>
+      <w:tr>
+        <w:tc>
+          <w:tcPr>
+            <w:tcW w:type="dxa" w:w="10080"/>
+            <w:vAlign w:val="center"/>
+            <w:shd w:val="clear" w:color="auto" w:fill="D9E1F2"/>
+            <w:tcMar>
+              <w:top w:w="144" w:type="dxa"/>
+              <w:left w:w="144" w:type="dxa"/>
+              <w:bottom w:w="144" w:type="dxa"/>
+              <w:right w:w="144" w:type="dxa"/>
+            </w:tcMar>
+          </w:tcPr>
+          <w:p>
+            <w:pPr>
+              <w:spacing w:before="80" w:after="80"/>
+            </w:pPr>
+            <w:r>
+              <w:rPr>
+                <w:b/>
+                <w:i w:val="0"/>
+                <w:color w:val="1F3864"/>
+                <w:sz w:val="44"/>
+              </w:rPr>
+              <w:t>Family History Question and Answer</w:t>
+            </w:r>
+          </w:p>
+          <w:p>
+            <w:pPr>
+              <w:spacing w:before="60" w:after="60"/>
+            </w:pPr>
+            <w:r>
+              <w:rPr>
+                <w:b w:val="0"/>
+                <w:i w:val="0"/>
+                <w:sz w:val="28"/>
+              </w:rPr>
+              <w:t xml:space="preserve">Presenter:  </w:t>
+            </w:r>
+            <w:r>
+              <w:rPr>
+                <w:b/>
+                <w:i w:val="0"/>
+                <w:sz w:val="28"/>
+              </w:rPr>
+              <w:t>Michelle Nelson, Jacob Jashinsky, &amp; Larry Lovell</w:t>
+            </w:r>
+          </w:p>
+          <w:p>
+            <w:pPr>
+              <w:spacing w:before="60" w:after="120"/>
+            </w:pPr>
+            <w:r>
+              <w:rPr>
+                <w:b w:val="0"/>
+                <w:i w:val="0"/>
+                <w:sz w:val="28"/>
+              </w:rPr>
+              <w:t xml:space="preserve">Location:  </w:t>
+            </w:r>
+            <w:r>
+              <w:rPr>
+                <w:b/>
+                <w:i w:val="0"/>
+                <w:sz w:val="28"/>
+              </w:rPr>
+              <w:t>Rooms 6 &amp; 7</w:t>
+            </w:r>
+          </w:p>
+        </w:tc>
+      </w:tr>
+    </w:tbl>
+    <w:p>
+      <w:pPr>
+        <w:spacing w:before="200" w:after="80"/>
+      </w:pPr>
+    </w:p>
+    <w:tbl>
+      <w:tblPr>
+        <w:tblStyle w:val="TableGrid"/>
+        <w:tblW w:type="auto" w:w="0"/>
+        <w:jc w:val="center"/>
+        <w:tblLook w:firstColumn="1" w:firstRow="1" w:lastColumn="0" w:lastRow="0" w:noHBand="0" w:noVBand="1" w:val="04A0"/>
+        <w:tblBorders>
+          <w:top w:val="single" w:sz="12" w:space="0" w:color="1F3864"/>
+          <w:left w:val="single" w:sz="12" w:space="0" w:color="1F3864"/>
+          <w:bottom w:val="single" w:sz="12" w:space="0" w:color="1F3864"/>
+          <w:right w:val="single" w:sz="12" w:space="0" w:color="1F3864"/>
+          <w:insideH w:val="single" w:sz="12" w:space="0" w:color="1F3864"/>
+          <w:insideV w:val="single" w:sz="12" w:space="0" w:color="1F3864"/>
+        </w:tblBorders>
+      </w:tblPr>
+      <w:tblGrid>
+        <w:gridCol w:w="10080"/>
+      </w:tblGrid>
+      <w:tr>
+        <w:trPr>
+          <w:trHeight w:val="1109" w:hRule="atLeast"/>
+        </w:trPr>
+        <w:tc>
+          <w:tcPr>
+            <w:tcW w:type="dxa" w:w="10080"/>
+            <w:shd w:val="clear" w:color="auto" w:fill="FFFFFF"/>
+            <w:tcMar>
+              <w:top w:w="144" w:type="dxa"/>
+              <w:left w:w="144" w:type="dxa"/>
+              <w:bottom w:w="144" w:type="dxa"/>
+              <w:right w:w="144" w:type="dxa"/>
+            </w:tcMar>
+          </w:tcPr>
+          <w:p>
+            <w:pPr>
+              <w:spacing w:before="80" w:after="0"/>
+            </w:pPr>
+            <w:r>
+              <w:rPr>
+                <w:b/>
+                <w:i w:val="0"/>
+                <w:color w:val="1F3864"/>
+                <w:sz w:val="28"/>
+              </w:rPr>
+              <w:t>Next Class Time:</w:t>
+            </w:r>
+          </w:p>
+        </w:tc>
+      </w:tr>
+      <w:tr>
+        <w:trPr>
+          <w:trHeight w:val="1109" w:hRule="atLeast"/>
+        </w:trPr>
+        <w:tc>
+          <w:tcPr>
+            <w:tcW w:type="dxa" w:w="10080"/>
+            <w:shd w:val="clear" w:color="auto" w:fill="FFFFFF"/>
+            <w:tcMar>
+              <w:top w:w="144" w:type="dxa"/>
+              <w:left w:w="144" w:type="dxa"/>
+              <w:bottom w:w="144" w:type="dxa"/>
+              <w:right w:w="144" w:type="dxa"/>
+            </w:tcMar>
+          </w:tcPr>
+          <w:p>
+            <w:pPr>
+              <w:spacing w:before="80" w:after="0"/>
+            </w:pPr>
+            <w:r>
+              <w:rPr>
+                <w:b/>
+                <w:i w:val="0"/>
+                <w:color w:val="1F3864"/>
+                <w:sz w:val="28"/>
+              </w:rPr>
+              <w:t>Next Class Time:</w:t>
+            </w:r>
+          </w:p>
+        </w:tc>
+      </w:tr>
+      <w:tr>
+        <w:trPr>
+          <w:trHeight w:val="1109" w:hRule="atLeast"/>
+        </w:trPr>
+        <w:tc>
+          <w:tcPr>
+            <w:tcW w:type="dxa" w:w="10080"/>
+            <w:shd w:val="clear" w:color="auto" w:fill="FFFFFF"/>
+            <w:tcMar>
+              <w:top w:w="144" w:type="dxa"/>
+              <w:left w:w="144" w:type="dxa"/>
+              <w:bottom w:w="144" w:type="dxa"/>
+              <w:right w:w="144" w:type="dxa"/>
+            </w:tcMar>
+          </w:tcPr>
+          <w:p>
+            <w:pPr>
+              <w:spacing w:before="80" w:after="0"/>
+            </w:pPr>
+            <w:r>
+              <w:rPr>
+                <w:b/>
+                <w:i w:val="0"/>
+                <w:color w:val="1F3864"/>
+                <w:sz w:val="28"/>
+              </w:rPr>
+              <w:t>Next Class Time:</w:t>
+            </w:r>
+          </w:p>
+        </w:tc>
+      </w:tr>
+      <w:tr>
+        <w:trPr>
+          <w:trHeight w:val="1109" w:hRule="atLeast"/>
+        </w:trPr>
+        <w:tc>
+          <w:tcPr>
+            <w:tcW w:type="dxa" w:w="10080"/>
+            <w:shd w:val="clear" w:color="auto" w:fill="FFFFFF"/>
+            <w:tcMar>
+              <w:top w:w="144" w:type="dxa"/>
+              <w:left w:w="144" w:type="dxa"/>
+              <w:bottom w:w="144" w:type="dxa"/>
+              <w:right w:w="144" w:type="dxa"/>
+            </w:tcMar>
+          </w:tcPr>
+          <w:p>
+            <w:pPr>
+              <w:spacing w:before="80" w:after="0"/>
+            </w:pPr>
+            <w:r>
+              <w:rPr>
+                <w:b/>
+                <w:i w:val="0"/>
+                <w:color w:val="1F3864"/>
+                <w:sz w:val="28"/>
+              </w:rPr>
+              <w:t>Next Class Time:</w:t>
+            </w:r>
+          </w:p>
+        </w:tc>
+      </w:tr>
+      <w:tr>
+        <w:trPr>
+          <w:trHeight w:val="1109" w:hRule="atLeast"/>
+        </w:trPr>
+        <w:tc>
+          <w:tcPr>
+            <w:tcW w:type="dxa" w:w="10080"/>
+            <w:shd w:val="clear" w:color="auto" w:fill="FFFFFF"/>
+            <w:tcMar>
+              <w:top w:w="144" w:type="dxa"/>
+              <w:left w:w="144" w:type="dxa"/>
+              <w:bottom w:w="144" w:type="dxa"/>
+              <w:right w:w="144" w:type="dxa"/>
+            </w:tcMar>
+          </w:tcPr>
+          <w:p>
+            <w:pPr>
+              <w:spacing w:before="80" w:after="0"/>
+            </w:pPr>
+            <w:r>
+              <w:rPr>
+                <w:b/>
+                <w:i w:val="0"/>
+                <w:color w:val="1F3864"/>
+                <w:sz w:val="28"/>
+              </w:rPr>
+              <w:t>Next Class Time:</w:t>
+            </w:r>
+          </w:p>
+        </w:tc>
+      </w:tr>
+      <w:tr>
+        <w:trPr>
+          <w:trHeight w:val="1109" w:hRule="atLeast"/>
+        </w:trPr>
+        <w:tc>
+          <w:tcPr>
+            <w:tcW w:type="dxa" w:w="10080"/>
+            <w:shd w:val="clear" w:color="auto" w:fill="FFFFFF"/>
+            <w:tcMar>
+              <w:top w:w="144" w:type="dxa"/>
+              <w:left w:w="144" w:type="dxa"/>
+              <w:bottom w:w="144" w:type="dxa"/>
+              <w:right w:w="144" w:type="dxa"/>
+            </w:tcMar>
+          </w:tcPr>
+          <w:p>
+            <w:pPr>
+              <w:spacing w:before="80" w:after="0"/>
+            </w:pPr>
+            <w:r>
+              <w:rPr>
+                <w:b/>
+                <w:i w:val="0"/>
+                <w:color w:val="1F3864"/>
+                <w:sz w:val="28"/>
+              </w:rPr>
+              <w:t>Next Class Time:</w:t>
+            </w:r>
+          </w:p>
+        </w:tc>
+      </w:tr>
+    </w:tbl>
+    <w:p>
+      <w:pPr>
+        <w:spacing w:before="0" w:after="0"/>
+      </w:pPr>
+      <w:r>
+        <w:br w:type="page"/>
+      </w:r>
+    </w:p>
+    <w:tbl>
+      <w:tblPr>
+        <w:tblStyle w:val="TableGrid"/>
+        <w:tblW w:type="auto" w:w="0"/>
+        <w:jc w:val="center"/>
+        <w:tblLook w:firstColumn="1" w:firstRow="1" w:lastColumn="0" w:lastRow="0" w:noHBand="0" w:noVBand="1" w:val="04A0"/>
+        <w:tblBorders>
+          <w:top w:val="single" w:sz="18" w:space="0" w:color="1F3864"/>
+          <w:left w:val="single" w:sz="18" w:space="0" w:color="1F3864"/>
+          <w:bottom w:val="single" w:sz="18" w:space="0" w:color="1F3864"/>
+          <w:right w:val="single" w:sz="18" w:space="0" w:color="1F3864"/>
+          <w:insideH w:val="single" w:sz="18" w:space="0" w:color="1F3864"/>
+          <w:insideV w:val="single" w:sz="18" w:space="0" w:color="1F3864"/>
+        </w:tblBorders>
+      </w:tblPr>
+      <w:tblGrid>
+        <w:gridCol w:w="10080"/>
+      </w:tblGrid>
+      <w:tr>
+        <w:tc>
+          <w:tcPr>
+            <w:tcW w:type="dxa" w:w="10080"/>
+            <w:vAlign w:val="center"/>
+            <w:shd w:val="clear" w:color="auto" w:fill="D9E1F2"/>
+            <w:tcMar>
+              <w:top w:w="144" w:type="dxa"/>
+              <w:left w:w="144" w:type="dxa"/>
+              <w:bottom w:w="144" w:type="dxa"/>
+              <w:right w:w="144" w:type="dxa"/>
+            </w:tcMar>
+          </w:tcPr>
+          <w:p>
+            <w:pPr>
+              <w:spacing w:before="80" w:after="80"/>
+            </w:pPr>
+            <w:r>
+              <w:rPr>
+                <w:b/>
+                <w:i w:val="0"/>
+                <w:color w:val="1F3864"/>
+                <w:sz w:val="44"/>
+              </w:rPr>
+              <w:t>The Teton Dam Disaster</w:t>
+            </w:r>
+          </w:p>
+          <w:p>
+            <w:pPr>
+              <w:spacing w:before="60" w:after="60"/>
+            </w:pPr>
+            <w:r>
+              <w:rPr>
+                <w:b/>
+                <w:i w:val="0"/>
+                <w:color w:val="1F3864"/>
+                <w:sz w:val="28"/>
+              </w:rPr>
+              <w:t>What happened, what was learned, and inspiring stories</w:t>
+            </w:r>
+          </w:p>
+          <w:p>
+            <w:pPr>
+              <w:spacing w:before="60" w:after="60"/>
+            </w:pPr>
+            <w:r>
+              <w:rPr>
+                <w:b w:val="0"/>
+                <w:i w:val="0"/>
+                <w:sz w:val="28"/>
+              </w:rPr>
+              <w:t xml:space="preserve">Presenter:  </w:t>
+            </w:r>
+            <w:r>
+              <w:rPr>
+                <w:b/>
+                <w:i w:val="0"/>
+                <w:sz w:val="28"/>
+              </w:rPr>
+              <w:t>John Galbraith</w:t>
+            </w:r>
+          </w:p>
+          <w:p>
+            <w:pPr>
+              <w:spacing w:before="60" w:after="120"/>
+            </w:pPr>
+            <w:r>
+              <w:rPr>
+                <w:b w:val="0"/>
+                <w:i w:val="0"/>
+                <w:sz w:val="28"/>
+              </w:rPr>
+              <w:t xml:space="preserve">Location:  </w:t>
+            </w:r>
+            <w:r>
+              <w:rPr>
+                <w:b/>
+                <w:i w:val="0"/>
+                <w:sz w:val="28"/>
+              </w:rPr>
+              <w:t>Priesthood Room</w:t>
+            </w:r>
+          </w:p>
+        </w:tc>
+      </w:tr>
+    </w:tbl>
+    <w:p>
+      <w:pPr>
+        <w:spacing w:before="200" w:after="80"/>
+      </w:pPr>
+    </w:p>
+    <w:tbl>
+      <w:tblPr>
+        <w:tblStyle w:val="TableGrid"/>
+        <w:tblW w:type="auto" w:w="0"/>
+        <w:jc w:val="center"/>
+        <w:tblLook w:firstColumn="1" w:firstRow="1" w:lastColumn="0" w:lastRow="0" w:noHBand="0" w:noVBand="1" w:val="04A0"/>
+        <w:tblBorders>
+          <w:top w:val="single" w:sz="12" w:space="0" w:color="1F3864"/>
+          <w:left w:val="single" w:sz="12" w:space="0" w:color="1F3864"/>
+          <w:bottom w:val="single" w:sz="12" w:space="0" w:color="1F3864"/>
+          <w:right w:val="single" w:sz="12" w:space="0" w:color="1F3864"/>
+          <w:insideH w:val="single" w:sz="12" w:space="0" w:color="1F3864"/>
+          <w:insideV w:val="single" w:sz="12" w:space="0" w:color="1F3864"/>
+        </w:tblBorders>
+      </w:tblPr>
+      <w:tblGrid>
+        <w:gridCol w:w="10080"/>
+      </w:tblGrid>
+      <w:tr>
+        <w:trPr>
+          <w:trHeight w:val="1109" w:hRule="atLeast"/>
+        </w:trPr>
+        <w:tc>
+          <w:tcPr>
+            <w:tcW w:type="dxa" w:w="10080"/>
+            <w:shd w:val="clear" w:color="auto" w:fill="FFFFFF"/>
+            <w:tcMar>
+              <w:top w:w="144" w:type="dxa"/>
+              <w:left w:w="144" w:type="dxa"/>
+              <w:bottom w:w="144" w:type="dxa"/>
+              <w:right w:w="144" w:type="dxa"/>
+            </w:tcMar>
+          </w:tcPr>
+          <w:p>
+            <w:pPr>
+              <w:spacing w:before="80" w:after="0"/>
+            </w:pPr>
+            <w:r>
+              <w:rPr>
+                <w:b/>
+                <w:i w:val="0"/>
+                <w:color w:val="1F3864"/>
+                <w:sz w:val="28"/>
+              </w:rPr>
+              <w:t>Next Class Time:</w:t>
+            </w:r>
+          </w:p>
+        </w:tc>
+      </w:tr>
+      <w:tr>
+        <w:trPr>
+          <w:trHeight w:val="1109" w:hRule="atLeast"/>
+        </w:trPr>
+        <w:tc>
+          <w:tcPr>
+            <w:tcW w:type="dxa" w:w="10080"/>
+            <w:shd w:val="clear" w:color="auto" w:fill="FFFFFF"/>
+            <w:tcMar>
+              <w:top w:w="144" w:type="dxa"/>
+              <w:left w:w="144" w:type="dxa"/>
+              <w:bottom w:w="144" w:type="dxa"/>
+              <w:right w:w="144" w:type="dxa"/>
+            </w:tcMar>
+          </w:tcPr>
+          <w:p>
+            <w:pPr>
+              <w:spacing w:before="80" w:after="0"/>
+            </w:pPr>
+            <w:r>
+              <w:rPr>
+                <w:b/>
+                <w:i w:val="0"/>
+                <w:color w:val="1F3864"/>
+                <w:sz w:val="28"/>
+              </w:rPr>
+              <w:t>Next Class Time:</w:t>
+            </w:r>
+          </w:p>
+        </w:tc>
+      </w:tr>
+      <w:tr>
+        <w:trPr>
+          <w:trHeight w:val="1109" w:hRule="atLeast"/>
+        </w:trPr>
+        <w:tc>
+          <w:tcPr>
+            <w:tcW w:type="dxa" w:w="10080"/>
+            <w:shd w:val="clear" w:color="auto" w:fill="FFFFFF"/>
+            <w:tcMar>
+              <w:top w:w="144" w:type="dxa"/>
+              <w:left w:w="144" w:type="dxa"/>
+              <w:bottom w:w="144" w:type="dxa"/>
+              <w:right w:w="144" w:type="dxa"/>
+            </w:tcMar>
+          </w:tcPr>
+          <w:p>
+            <w:pPr>
+              <w:spacing w:before="80" w:after="0"/>
+            </w:pPr>
+            <w:r>
+              <w:rPr>
+                <w:b/>
+                <w:i w:val="0"/>
+                <w:color w:val="1F3864"/>
+                <w:sz w:val="28"/>
+              </w:rPr>
+              <w:t>Next Class Time:</w:t>
+            </w:r>
+          </w:p>
+        </w:tc>
+      </w:tr>
+      <w:tr>
+        <w:trPr>
+          <w:trHeight w:val="1109" w:hRule="atLeast"/>
+        </w:trPr>
+        <w:tc>
+          <w:tcPr>
+            <w:tcW w:type="dxa" w:w="10080"/>
+            <w:shd w:val="clear" w:color="auto" w:fill="FFFFFF"/>
+            <w:tcMar>
+              <w:top w:w="144" w:type="dxa"/>
+              <w:left w:w="144" w:type="dxa"/>
+              <w:bottom w:w="144" w:type="dxa"/>
+              <w:right w:w="144" w:type="dxa"/>
+            </w:tcMar>
+          </w:tcPr>
+          <w:p>
+            <w:pPr>
+              <w:spacing w:before="80" w:after="0"/>
+            </w:pPr>
+            <w:r>
+              <w:rPr>
+                <w:b/>
+                <w:i w:val="0"/>
+                <w:color w:val="1F3864"/>
+                <w:sz w:val="28"/>
+              </w:rPr>
+              <w:t>Next Class Time:</w:t>
+            </w:r>
+          </w:p>
+        </w:tc>
+      </w:tr>
+      <w:tr>
+        <w:trPr>
+          <w:trHeight w:val="1109" w:hRule="atLeast"/>
+        </w:trPr>
+        <w:tc>
+          <w:tcPr>
+            <w:tcW w:type="dxa" w:w="10080"/>
+            <w:shd w:val="clear" w:color="auto" w:fill="FFFFFF"/>
+            <w:tcMar>
+              <w:top w:w="144" w:type="dxa"/>
+              <w:left w:w="144" w:type="dxa"/>
+              <w:bottom w:w="144" w:type="dxa"/>
+              <w:right w:w="144" w:type="dxa"/>
+            </w:tcMar>
+          </w:tcPr>
+          <w:p>
+            <w:pPr>
+              <w:spacing w:before="80" w:after="0"/>
+            </w:pPr>
+            <w:r>
+              <w:rPr>
+                <w:b/>
+                <w:i w:val="0"/>
+                <w:color w:val="1F3864"/>
+                <w:sz w:val="28"/>
+              </w:rPr>
+              <w:t>Next Class Time:</w:t>
+            </w:r>
+          </w:p>
+        </w:tc>
+      </w:tr>
+      <w:tr>
+        <w:trPr>
+          <w:trHeight w:val="1109" w:hRule="atLeast"/>
+        </w:trPr>
+        <w:tc>
+          <w:tcPr>
+            <w:tcW w:type="dxa" w:w="10080"/>
+            <w:shd w:val="clear" w:color="auto" w:fill="FFFFFF"/>
+            <w:tcMar>
+              <w:top w:w="144" w:type="dxa"/>
+              <w:left w:w="144" w:type="dxa"/>
+              <w:bottom w:w="144" w:type="dxa"/>
+              <w:right w:w="144" w:type="dxa"/>
+            </w:tcMar>
+          </w:tcPr>
+          <w:p>
+            <w:pPr>
+              <w:spacing w:before="80" w:after="0"/>
+            </w:pPr>
+            <w:r>
+              <w:rPr>
+                <w:b/>
+                <w:i w:val="0"/>
+                <w:color w:val="1F3864"/>
+                <w:sz w:val="28"/>
+              </w:rPr>
+              <w:t>Next Class Time:</w:t>
+            </w:r>
+          </w:p>
+        </w:tc>
+      </w:tr>
+    </w:tbl>
+    <w:p>
+      <w:pPr>
+        <w:spacing w:before="0" w:after="0"/>
+      </w:pPr>
+      <w:r>
+        <w:br w:type="page"/>
+      </w:r>
+    </w:p>
+    <w:tbl>
+      <w:tblPr>
+        <w:tblStyle w:val="TableGrid"/>
+        <w:tblW w:type="auto" w:w="0"/>
+        <w:jc w:val="center"/>
+        <w:tblLook w:firstColumn="1" w:firstRow="1" w:lastColumn="0" w:lastRow="0" w:noHBand="0" w:noVBand="1" w:val="04A0"/>
+        <w:tblBorders>
+          <w:top w:val="single" w:sz="18" w:space="0" w:color="1F3864"/>
+          <w:left w:val="single" w:sz="18" w:space="0" w:color="1F3864"/>
+          <w:bottom w:val="single" w:sz="18" w:space="0" w:color="1F3864"/>
+          <w:right w:val="single" w:sz="18" w:space="0" w:color="1F3864"/>
+          <w:insideH w:val="single" w:sz="18" w:space="0" w:color="1F3864"/>
+          <w:insideV w:val="single" w:sz="18" w:space="0" w:color="1F3864"/>
+        </w:tblBorders>
+      </w:tblPr>
+      <w:tblGrid>
+        <w:gridCol w:w="10080"/>
+      </w:tblGrid>
+      <w:tr>
+        <w:tc>
+          <w:tcPr>
+            <w:tcW w:type="dxa" w:w="10080"/>
+            <w:vAlign w:val="center"/>
+            <w:shd w:val="clear" w:color="auto" w:fill="D9E1F2"/>
+            <w:tcMar>
+              <w:top w:w="144" w:type="dxa"/>
+              <w:left w:w="144" w:type="dxa"/>
+              <w:bottom w:w="144" w:type="dxa"/>
+              <w:right w:w="144" w:type="dxa"/>
+            </w:tcMar>
+          </w:tcPr>
+          <w:p>
+            <w:pPr>
+              <w:spacing w:before="80" w:after="80"/>
+            </w:pPr>
+            <w:r>
+              <w:rPr>
+                <w:b/>
+                <w:i w:val="0"/>
+                <w:color w:val="1F3864"/>
+                <w:sz w:val="44"/>
+              </w:rPr>
+              <w:t>Job Search, Résumé Tips &amp; Networking Strategies</w:t>
+            </w:r>
+          </w:p>
+          <w:p>
+            <w:pPr>
+              <w:spacing w:before="60" w:after="60"/>
+            </w:pPr>
+            <w:r>
+              <w:rPr>
+                <w:b w:val="0"/>
+                <w:i w:val="0"/>
+                <w:sz w:val="28"/>
+              </w:rPr>
+              <w:t xml:space="preserve">Presenter:  </w:t>
+            </w:r>
+            <w:r>
+              <w:rPr>
+                <w:b/>
+                <w:i w:val="0"/>
+                <w:sz w:val="28"/>
+              </w:rPr>
+              <w:t>John Ekins &amp; Elder Gary Chapman (Employment Missionary)</w:t>
+            </w:r>
+          </w:p>
+          <w:p>
+            <w:pPr>
+              <w:spacing w:before="60" w:after="120"/>
+            </w:pPr>
+            <w:r>
+              <w:rPr>
+                <w:b w:val="0"/>
+                <w:i w:val="0"/>
+                <w:sz w:val="28"/>
+              </w:rPr>
+              <w:t xml:space="preserve">Location:  </w:t>
+            </w:r>
+            <w:r>
+              <w:rPr>
+                <w:b/>
+                <w:i w:val="0"/>
+                <w:sz w:val="28"/>
+              </w:rPr>
+              <w:t>Room 2</w:t>
+            </w:r>
+          </w:p>
+        </w:tc>
+      </w:tr>
+    </w:tbl>
+    <w:p>
+      <w:pPr>
+        <w:spacing w:before="200" w:after="80"/>
+      </w:pPr>
+    </w:p>
+    <w:tbl>
+      <w:tblPr>
+        <w:tblStyle w:val="TableGrid"/>
+        <w:tblW w:type="auto" w:w="0"/>
+        <w:jc w:val="center"/>
+        <w:tblLook w:firstColumn="1" w:firstRow="1" w:lastColumn="0" w:lastRow="0" w:noHBand="0" w:noVBand="1" w:val="04A0"/>
+        <w:tblBorders>
+          <w:top w:val="single" w:sz="12" w:space="0" w:color="1F3864"/>
+          <w:left w:val="single" w:sz="12" w:space="0" w:color="1F3864"/>
+          <w:bottom w:val="single" w:sz="12" w:space="0" w:color="1F3864"/>
+          <w:right w:val="single" w:sz="12" w:space="0" w:color="1F3864"/>
+          <w:insideH w:val="single" w:sz="12" w:space="0" w:color="1F3864"/>
+          <w:insideV w:val="single" w:sz="12" w:space="0" w:color="1F3864"/>
+        </w:tblBorders>
+      </w:tblPr>
+      <w:tblGrid>
+        <w:gridCol w:w="10080"/>
+      </w:tblGrid>
+      <w:tr>
+        <w:trPr>
+          <w:trHeight w:val="1109" w:hRule="atLeast"/>
+        </w:trPr>
+        <w:tc>
+          <w:tcPr>
+            <w:tcW w:type="dxa" w:w="10080"/>
+            <w:shd w:val="clear" w:color="auto" w:fill="FFFFFF"/>
+            <w:tcMar>
+              <w:top w:w="144" w:type="dxa"/>
+              <w:left w:w="144" w:type="dxa"/>
+              <w:bottom w:w="144" w:type="dxa"/>
+              <w:right w:w="144" w:type="dxa"/>
+            </w:tcMar>
+          </w:tcPr>
+          <w:p>
+            <w:pPr>
+              <w:spacing w:before="80" w:after="0"/>
+            </w:pPr>
+            <w:r>
+              <w:rPr>
+                <w:b/>
+                <w:i w:val="0"/>
+                <w:color w:val="1F3864"/>
+                <w:sz w:val="28"/>
+              </w:rPr>
+              <w:t>Next Class Time:</w:t>
+            </w:r>
+          </w:p>
+        </w:tc>
+      </w:tr>
+      <w:tr>
+        <w:trPr>
+          <w:trHeight w:val="1109" w:hRule="atLeast"/>
+        </w:trPr>
+        <w:tc>
+          <w:tcPr>
+            <w:tcW w:type="dxa" w:w="10080"/>
+            <w:shd w:val="clear" w:color="auto" w:fill="FFFFFF"/>
+            <w:tcMar>
+              <w:top w:w="144" w:type="dxa"/>
+              <w:left w:w="144" w:type="dxa"/>
+              <w:bottom w:w="144" w:type="dxa"/>
+              <w:right w:w="144" w:type="dxa"/>
+            </w:tcMar>
+          </w:tcPr>
+          <w:p>
+            <w:pPr>
+              <w:spacing w:before="80" w:after="0"/>
+            </w:pPr>
+            <w:r>
+              <w:rPr>
+                <w:b/>
+                <w:i w:val="0"/>
+                <w:color w:val="1F3864"/>
+                <w:sz w:val="28"/>
+              </w:rPr>
+              <w:t>Next Class Time:</w:t>
+            </w:r>
+          </w:p>
+        </w:tc>
+      </w:tr>
+      <w:tr>
+        <w:trPr>
+          <w:trHeight w:val="1109" w:hRule="atLeast"/>
+        </w:trPr>
+        <w:tc>
+          <w:tcPr>
+            <w:tcW w:type="dxa" w:w="10080"/>
+            <w:shd w:val="clear" w:color="auto" w:fill="FFFFFF"/>
+            <w:tcMar>
+              <w:top w:w="144" w:type="dxa"/>
+              <w:left w:w="144" w:type="dxa"/>
+              <w:bottom w:w="144" w:type="dxa"/>
+              <w:right w:w="144" w:type="dxa"/>
+            </w:tcMar>
+          </w:tcPr>
+          <w:p>
+            <w:pPr>
+              <w:spacing w:before="80" w:after="0"/>
+            </w:pPr>
+            <w:r>
+              <w:rPr>
+                <w:b/>
+                <w:i w:val="0"/>
+                <w:color w:val="1F3864"/>
+                <w:sz w:val="28"/>
+              </w:rPr>
+              <w:t>Next Class Time:</w:t>
+            </w:r>
+          </w:p>
+        </w:tc>
+      </w:tr>
+      <w:tr>
+        <w:trPr>
+          <w:trHeight w:val="1109" w:hRule="atLeast"/>
+        </w:trPr>
+        <w:tc>
+          <w:tcPr>
+            <w:tcW w:type="dxa" w:w="10080"/>
+            <w:shd w:val="clear" w:color="auto" w:fill="FFFFFF"/>
+            <w:tcMar>
+              <w:top w:w="144" w:type="dxa"/>
+              <w:left w:w="144" w:type="dxa"/>
+              <w:bottom w:w="144" w:type="dxa"/>
+              <w:right w:w="144" w:type="dxa"/>
+            </w:tcMar>
+          </w:tcPr>
+          <w:p>
+            <w:pPr>
+              <w:spacing w:before="80" w:after="0"/>
+            </w:pPr>
+            <w:r>
+              <w:rPr>
+                <w:b/>
+                <w:i w:val="0"/>
+                <w:color w:val="1F3864"/>
+                <w:sz w:val="28"/>
+              </w:rPr>
+              <w:t>Next Class Time:</w:t>
+            </w:r>
+          </w:p>
+        </w:tc>
+      </w:tr>
+      <w:tr>
+        <w:trPr>
+          <w:trHeight w:val="1109" w:hRule="atLeast"/>
+        </w:trPr>
+        <w:tc>
+          <w:tcPr>
+            <w:tcW w:type="dxa" w:w="10080"/>
+            <w:shd w:val="clear" w:color="auto" w:fill="FFFFFF"/>
+            <w:tcMar>
+              <w:top w:w="144" w:type="dxa"/>
+              <w:left w:w="144" w:type="dxa"/>
+              <w:bottom w:w="144" w:type="dxa"/>
+              <w:right w:w="144" w:type="dxa"/>
+            </w:tcMar>
+          </w:tcPr>
+          <w:p>
+            <w:pPr>
+              <w:spacing w:before="80" w:after="0"/>
+            </w:pPr>
+            <w:r>
+              <w:rPr>
+                <w:b/>
+                <w:i w:val="0"/>
+                <w:color w:val="1F3864"/>
+                <w:sz w:val="28"/>
+              </w:rPr>
+              <w:t>Next Class Time:</w:t>
+            </w:r>
+          </w:p>
+        </w:tc>
+      </w:tr>
+      <w:tr>
+        <w:trPr>
+          <w:trHeight w:val="1109" w:hRule="atLeast"/>
+        </w:trPr>
+        <w:tc>
+          <w:tcPr>
+            <w:tcW w:type="dxa" w:w="10080"/>
+            <w:shd w:val="clear" w:color="auto" w:fill="FFFFFF"/>
+            <w:tcMar>
+              <w:top w:w="144" w:type="dxa"/>
+              <w:left w:w="144" w:type="dxa"/>
+              <w:bottom w:w="144" w:type="dxa"/>
+              <w:right w:w="144" w:type="dxa"/>
+            </w:tcMar>
+          </w:tcPr>
+          <w:p>
+            <w:pPr>
+              <w:spacing w:before="80" w:after="0"/>
+            </w:pPr>
+            <w:r>
+              <w:rPr>
+                <w:b/>
+                <w:i w:val="0"/>
                 <w:color w:val="1F3864"/>
                 <w:sz w:val="28"/>
               </w:rPr>

</xml_diff>